<commit_message>
Mise a jour du manuel technique Word et du document de suivi avec l ensemble des specifications et evolutions recentes
</commit_message>
<xml_diff>
--- a/Manuel_Technique_Affinity.docx
+++ b/Manuel_Technique_Affinity.docx
@@ -4,62 +4,177 @@
   <w:body>
     <w:p>
       <w:pPr>
-        <w:spacing w:before="720" w:after="160"/>
-        <w:jc w:val="center"/>
+        <w:spacing w:before="240" w:after="80"/>
       </w:pPr>
       <w:r>
         <w:rPr>
-          <w:rFonts w:ascii="Segoe UI" w:hAnsi="Segoe UI"/>
           <w:b/>
-          <w:color w:val="1E3A8A"/>
-          <w:sz w:val="52"/>
+          <w:color w:val="0284C7"/>
+          <w:sz w:val="20"/>
+          <w:lang w:val="fr-FR"/>
         </w:rPr>
-        <w:t>AFFINITY</w:t>
+        <w:t>PROJET ARP001 • PLATEFORME OFFICIELLE</w:t>
       </w:r>
     </w:p>
     <w:p>
       <w:pPr>
-        <w:spacing w:after="560"/>
-        <w:jc w:val="center"/>
+        <w:spacing w:before="40" w:after="120"/>
       </w:pPr>
       <w:r>
         <w:rPr>
-          <w:rFonts w:ascii="Segoe UI" w:hAnsi="Segoe UI"/>
-          <w:i/>
-          <w:color w:val="64748B"/>
-          <w:sz w:val="24"/>
+          <w:b/>
+          <w:color w:val="0F172A"/>
+          <w:sz w:val="44"/>
+          <w:lang w:val="fr-FR"/>
         </w:rPr>
-        <w:t>Manuel Technique d'Architecture, Développement et Exploitation</w:t>
+        <w:t>AFFINITY — Manuel Technique d'Architecture &amp; d'Exploitation</w:t>
       </w:r>
     </w:p>
     <w:p>
       <w:pPr>
-        <w:jc w:val="center"/>
+        <w:spacing w:after="320"/>
       </w:pPr>
       <w:r>
         <w:rPr>
-          <w:rFonts w:ascii="Segoe UI" w:hAnsi="Segoe UI"/>
+          <w:i/>
           <w:color w:val="64748B"/>
-          <w:sz w:val="19"/>
+          <w:sz w:val="24"/>
+          <w:lang w:val="fr-FR"/>
         </w:rPr>
-        <w:t>Référence Projet : ARP001  |  Auteur : M. André ROGER  |  Version 1.0 (Python / SQLite / Vanilla JS)</w:t>
+        <w:t>Spécifications Architecturales, Moteur d'Affinité Élective, Diagnostic Identité, Sécurité &amp; Pérennité des Données</w:t>
       </w:r>
     </w:p>
+    <w:tbl>
+      <w:tblPr>
+        <w:tblW w:type="auto" w:w="0"/>
+        <w:jc w:val="center"/>
+        <w:tblLook w:firstColumn="1" w:firstRow="1" w:lastColumn="0" w:lastRow="0" w:noHBand="0" w:noVBand="1" w:val="04A0"/>
+      </w:tblPr>
+      <w:tblGrid>
+        <w:gridCol w:w="3106"/>
+        <w:gridCol w:w="3106"/>
+        <w:gridCol w:w="3106"/>
+      </w:tblGrid>
+      <w:tr>
+        <w:tc>
+          <w:tcPr>
+            <w:tcW w:type="dxa" w:w="3106"/>
+            <w:shd w:val="clear" w:color="auto" w:fill="F1F5F9"/>
+            <w:tcMar>
+              <w:top w:w="100" w:type="dxa"/>
+              <w:bottom w:w="100" w:type="dxa"/>
+              <w:left w:w="140" w:type="dxa"/>
+              <w:right w:w="140" w:type="dxa"/>
+            </w:tcMar>
+          </w:tcPr>
+          <w:p>
+            <w:pPr>
+              <w:spacing w:after="40"/>
+            </w:pPr>
+            <w:r>
+              <w:rPr>
+                <w:b/>
+                <w:color w:val="64748B"/>
+                <w:sz w:val="18"/>
+              </w:rPr>
+              <w:t>Auteur &amp; Concepteur</w:t>
+              <w:br/>
+            </w:r>
+            <w:r>
+              <w:rPr>
+                <w:b/>
+                <w:color w:val="0F172A"/>
+                <w:sz w:val="21"/>
+              </w:rPr>
+              <w:t>M. André ROGER (Anji, ADM-1)</w:t>
+            </w:r>
+          </w:p>
+        </w:tc>
+        <w:tc>
+          <w:tcPr>
+            <w:tcW w:type="dxa" w:w="3106"/>
+            <w:shd w:val="clear" w:color="auto" w:fill="F1F5F9"/>
+            <w:tcMar>
+              <w:top w:w="100" w:type="dxa"/>
+              <w:bottom w:w="100" w:type="dxa"/>
+              <w:left w:w="140" w:type="dxa"/>
+              <w:right w:w="140" w:type="dxa"/>
+            </w:tcMar>
+          </w:tcPr>
+          <w:p>
+            <w:pPr>
+              <w:spacing w:after="40"/>
+            </w:pPr>
+            <w:r>
+              <w:rPr>
+                <w:b/>
+                <w:color w:val="64748B"/>
+                <w:sz w:val="18"/>
+              </w:rPr>
+              <w:t>Version &amp; Technologie</w:t>
+              <w:br/>
+            </w:r>
+            <w:r>
+              <w:rPr>
+                <w:b/>
+                <w:color w:val="0F172A"/>
+                <w:sz w:val="21"/>
+              </w:rPr>
+              <w:t>Version 2.2 • Python / SQLite / Vanilla JS</w:t>
+            </w:r>
+          </w:p>
+        </w:tc>
+        <w:tc>
+          <w:tcPr>
+            <w:tcW w:type="dxa" w:w="3106"/>
+            <w:shd w:val="clear" w:color="auto" w:fill="F1F5F9"/>
+            <w:tcMar>
+              <w:top w:w="100" w:type="dxa"/>
+              <w:bottom w:w="100" w:type="dxa"/>
+              <w:left w:w="140" w:type="dxa"/>
+              <w:right w:w="140" w:type="dxa"/>
+            </w:tcMar>
+          </w:tcPr>
+          <w:p>
+            <w:pPr>
+              <w:spacing w:after="40"/>
+            </w:pPr>
+            <w:r>
+              <w:rPr>
+                <w:b/>
+                <w:color w:val="64748B"/>
+                <w:sz w:val="18"/>
+              </w:rPr>
+              <w:t>Date de Référence</w:t>
+              <w:br/>
+            </w:r>
+            <w:r>
+              <w:rPr>
+                <w:b/>
+                <w:color w:val="0F172A"/>
+                <w:sz w:val="21"/>
+              </w:rPr>
+              <w:t>Septembre 2026</w:t>
+            </w:r>
+          </w:p>
+        </w:tc>
+      </w:tr>
+    </w:tbl>
     <w:p>
       <w:pPr>
-        <w:spacing w:after="360"/>
+        <w:spacing w:after="280"/>
       </w:pPr>
     </w:p>
     <w:p>
       <w:pPr>
-        <w:spacing w:before="400" w:after="120"/>
+        <w:spacing w:after="160"/>
       </w:pPr>
       <w:r>
         <w:rPr>
-          <w:rFonts w:ascii="Segoe UI" w:hAnsi="Segoe UI"/>
           <w:b/>
-          <w:color w:val="1E3A8A"/>
+          <w:color w:val="0E7490"/>
           <w:sz w:val="28"/>
+          <w:lang w:val="fr-FR"/>
         </w:rPr>
         <w:t>TABLE DES MATIÈRES</w:t>
       </w:r>
@@ -67,436 +182,171 @@
     <w:p>
       <w:pPr>
         <w:pStyle w:val="ListBullet"/>
-        <w:spacing w:after="40"/>
+        <w:spacing w:after="60"/>
       </w:pPr>
       <w:r>
-        <w:t>1. Vue d'Ensemble de l'Architecture Logicielle</w:t>
+        <w:rPr>
+          <w:color w:val="0F172A"/>
+          <w:sz w:val="21"/>
+          <w:lang w:val="fr-FR"/>
+        </w:rPr>
+        <w:t>1. Vue d'Ensemble de l'Architecture &amp; Choix Technologiques</w:t>
       </w:r>
     </w:p>
     <w:p>
       <w:pPr>
         <w:pStyle w:val="ListBullet"/>
-        <w:spacing w:after="40"/>
+        <w:spacing w:after="60"/>
       </w:pPr>
       <w:r>
-        <w:t>2. Modèle de Données et Schéma de Base de Données (SQLite)</w:t>
+        <w:rPr>
+          <w:color w:val="0F172A"/>
+          <w:sz w:val="21"/>
+          <w:lang w:val="fr-FR"/>
+        </w:rPr>
+        <w:t>2. Architecture des Rôles &amp; Sécurité d'Accès (Admin, Abonné, Invité)</w:t>
       </w:r>
     </w:p>
     <w:p>
       <w:pPr>
         <w:pStyle w:val="ListBullet"/>
-        <w:spacing w:after="40"/>
+        <w:spacing w:after="60"/>
       </w:pPr>
       <w:r>
-        <w:t>3. Spécification Complète des API REST (Endpoints HTTP)</w:t>
+        <w:rPr>
+          <w:color w:val="0F172A"/>
+          <w:sz w:val="21"/>
+          <w:lang w:val="fr-FR"/>
+        </w:rPr>
+        <w:t>3. Modèle de Données &amp; Schéma Relationnel SQLite (affinity.db)</w:t>
       </w:r>
     </w:p>
     <w:p>
       <w:pPr>
         <w:pStyle w:val="ListBullet"/>
-        <w:spacing w:after="40"/>
+        <w:spacing w:after="60"/>
       </w:pPr>
       <w:r>
-        <w:t>4. Algorithme de Calcul d'Affinité Élective (Spécification Mathématique)</w:t>
+        <w:rPr>
+          <w:color w:val="0F172A"/>
+          <w:sz w:val="21"/>
+          <w:lang w:val="fr-FR"/>
+        </w:rPr>
+        <w:t>4. Module d'Identité &amp; Caractéristiques (+ sur moi &amp; + sur l'autre - Classe 8)</w:t>
       </w:r>
     </w:p>
     <w:p>
       <w:pPr>
         <w:pStyle w:val="ListBullet"/>
-        <w:spacing w:after="40"/>
+        <w:spacing w:after="60"/>
       </w:pPr>
       <w:r>
-        <w:t>5. Système de Sécurité et Cryptographie</w:t>
+        <w:rPr>
+          <w:color w:val="0F172A"/>
+          <w:sz w:val="21"/>
+          <w:lang w:val="fr-FR"/>
+        </w:rPr>
+        <w:t>5. Diagnostic Préalable de Compatibilité Identité (Moi &amp; L'Autre)</w:t>
       </w:r>
     </w:p>
     <w:p>
       <w:pPr>
         <w:pStyle w:val="ListBullet"/>
-        <w:spacing w:after="40"/>
+        <w:spacing w:after="60"/>
       </w:pPr>
       <w:r>
-        <w:t>6. Déploiement Cloud et Gestion du Disque Persistant (Render)</w:t>
+        <w:rPr>
+          <w:color w:val="0F172A"/>
+          <w:sz w:val="21"/>
+          <w:lang w:val="fr-FR"/>
+        </w:rPr>
+        <w:t>6. Moteur de Calcul d'Affinité Élective (Algorithme V-A-D-P)</w:t>
       </w:r>
     </w:p>
     <w:p>
       <w:pPr>
         <w:pStyle w:val="ListBullet"/>
-        <w:spacing w:after="40"/>
+        <w:spacing w:after="60"/>
       </w:pPr>
       <w:r>
-        <w:t>7. Guide d'Exploitation et Développement Multi-Postes (Windows 10 / Windows 11)</w:t>
+        <w:rPr>
+          <w:color w:val="0F172A"/>
+          <w:sz w:val="21"/>
+          <w:lang w:val="fr-FR"/>
+        </w:rPr>
+        <w:t>7. Spécification Complète des API REST (Endpoints HTTP)</w:t>
       </w:r>
     </w:p>
     <w:p>
       <w:pPr>
-        <w:spacing w:before="400" w:after="120"/>
+        <w:pStyle w:val="ListBullet"/>
+        <w:spacing w:after="60"/>
       </w:pPr>
       <w:r>
         <w:rPr>
-          <w:rFonts w:ascii="Segoe UI" w:hAnsi="Segoe UI"/>
-          <w:b/>
-          <w:color w:val="1E3A8A"/>
-          <w:sz w:val="28"/>
+          <w:color w:val="0F172A"/>
+          <w:sz w:val="21"/>
+          <w:lang w:val="fr-FR"/>
         </w:rPr>
-        <w:t>1. VUE D'ENSEMBLE DE L'ARCHITECTURE LOGICIELLE</w:t>
+        <w:t>8. Sauvegarde Locale &amp; Pérennité des Données (Questions, Profils, Réponses)</w:t>
+      </w:r>
+    </w:p>
+    <w:p>
+      <w:pPr>
+        <w:pStyle w:val="ListBullet"/>
+        <w:spacing w:after="60"/>
+      </w:pPr>
+      <w:r>
+        <w:rPr>
+          <w:color w:val="0F172A"/>
+          <w:sz w:val="21"/>
+          <w:lang w:val="fr-FR"/>
+        </w:rPr>
+        <w:t>9. Déploiement Continu Cloud (Render) &amp; Gestion de la Résilience</w:t>
+      </w:r>
+    </w:p>
+    <w:p>
+      <w:pPr>
+        <w:pStyle w:val="ListBullet"/>
+        <w:spacing w:after="60"/>
+      </w:pPr>
+      <w:r>
+        <w:rPr>
+          <w:color w:val="0F172A"/>
+          <w:sz w:val="21"/>
+          <w:lang w:val="fr-FR"/>
+        </w:rPr>
+        <w:t>10. Procédure d'Exploitation &amp; Démarrage Multi-Postes (Windows 10 / 11)</w:t>
       </w:r>
     </w:p>
     <w:p>
       <w:r>
-        <w:t>L'application Affinity repose sur une architecture moderne, légère et hautement performante, conçue pour éliminer les surcoûts d'infrastructures et garantir une exécution instantanée :</w:t>
-        <w:br/>
-        <w:t>• Frontend Web Client : Développé en Vanilla HTML5, CSS3 modulaire et JavaScript moderne (ES6+). L'application fonctionne comme une Single Page Application (SPA) réactive sans dépendance à des frameworks lourds (zéro React, zéro Angular, zéro compilation complexe).</w:t>
-        <w:br/>
-        <w:t>• Backend Serveur : Développé en Python pur utilisant le module standard http.server combiné à socketserver.ThreadingMixIn pour assurer le traitement concurrent et multithreadé des requêtes HTTP.</w:t>
-        <w:br/>
-        <w:t>• Moteur de Persistance : Base de données relationnelle SQLite3 locale ('affinity.db'), supportant la portabilité intégrale et l'amorçage automatique sur volume persistant cloud.</w:t>
+        <w:rPr>
+          <w:lang w:val="fr-FR"/>
+        </w:rPr>
+        <w:br w:type="page"/>
       </w:r>
     </w:p>
     <w:p>
       <w:pPr>
-        <w:spacing w:before="400" w:after="120"/>
+        <w:spacing w:before="240" w:after="120"/>
       </w:pPr>
       <w:r>
         <w:rPr>
-          <w:rFonts w:ascii="Segoe UI" w:hAnsi="Segoe UI"/>
           <w:b/>
-          <w:color w:val="1E3A8A"/>
+          <w:color w:val="0E7490"/>
           <w:sz w:val="28"/>
+          <w:lang w:val="fr-FR"/>
         </w:rPr>
-        <w:t>2. MODÈLE DE DONNÉES ET SCHÉMA SQL (SQLITE)</w:t>
-      </w:r>
-    </w:p>
-    <w:p>
-      <w:pPr>
-        <w:spacing w:before="240" w:after="80"/>
-      </w:pPr>
-      <w:r>
-        <w:rPr>
-          <w:rFonts w:ascii="Segoe UI" w:hAnsi="Segoe UI"/>
-          <w:b/>
-          <w:color w:val="475569"/>
-          <w:sz w:val="23"/>
-        </w:rPr>
-        <w:t>2.1 Table des profils (profiles)</w:t>
-      </w:r>
-    </w:p>
-    <w:tbl>
-      <w:tblPr>
-        <w:tblW w:type="auto" w:w="0"/>
-        <w:jc w:val="center"/>
-        <w:tblLayout w:type="fixed"/>
-        <w:tblLook w:firstColumn="1" w:firstRow="1" w:lastColumn="0" w:lastRow="0" w:noHBand="0" w:noVBand="1" w:val="04A0"/>
-      </w:tblPr>
-      <w:tblGrid>
-        <w:gridCol w:w="9360"/>
-      </w:tblGrid>
-      <w:tr>
-        <w:tc>
-          <w:tcPr>
-            <w:tcW w:type="dxa" w:w="9360"/>
-            <w:shd w:fill="F8FAFC"/>
-            <w:tcBorders>
-              <w:top w:val="single" w:sz="4" w:space="0" w:color="CBD5E1"/>
-              <w:left w:val="single" w:sz="16" w:space="0" w:color="3B82F6"/>
-              <w:bottom w:val="single" w:sz="4" w:space="0" w:color="CBD5E1"/>
-              <w:right w:val="single" w:sz="4" w:space="0" w:color="CBD5E1"/>
-            </w:tcBorders>
-          </w:tcPr>
-          <w:p>
-            <w:pPr>
-              <w:spacing w:before="80" w:after="80"/>
-            </w:pPr>
-            <w:r>
-              <w:rPr>
-                <w:rFonts w:ascii="Consolas" w:hAnsi="Consolas"/>
-                <w:color w:val="1E293B"/>
-                <w:sz w:val="18"/>
-              </w:rPr>
-              <w:t>CREATE TABLE profiles (</w:t>
-              <w:br/>
-              <w:t xml:space="preserve">    id INTEGER PRIMARY KEY AUTOINCREMENT,</w:t>
-              <w:br/>
-              <w:t xml:space="preserve">    pseudo TEXT NOT NULL UNIQUE,</w:t>
-              <w:br/>
-              <w:t xml:space="preserve">    code_profil TEXT UNIQUE,</w:t>
-              <w:br/>
-              <w:t xml:space="preserve">    avatar TEXT DEFAULT 'user',</w:t>
-              <w:br/>
-              <w:t xml:space="preserve">    role TEXT DEFAULT 'guest', -- 'admin', 'subscriber', 'guest'</w:t>
-              <w:br/>
-              <w:t xml:space="preserve">    password_hash TEXT,</w:t>
-              <w:br/>
-              <w:t xml:space="preserve">    salt TEXT,</w:t>
-              <w:br/>
-              <w:t xml:space="preserve">    email TEXT,</w:t>
-              <w:br/>
-              <w:t xml:space="preserve">    created_at TIMESTAMP DEFAULT CURRENT_TIMESTAMP</w:t>
-              <w:br/>
-              <w:t>);</w:t>
-            </w:r>
-          </w:p>
-        </w:tc>
-      </w:tr>
-    </w:tbl>
-    <w:p>
-      <w:pPr>
-        <w:spacing w:before="240" w:after="80"/>
-      </w:pPr>
-      <w:r>
-        <w:rPr>
-          <w:rFonts w:ascii="Segoe UI" w:hAnsi="Segoe UI"/>
-          <w:b/>
-          <w:color w:val="475569"/>
-          <w:sz w:val="23"/>
-        </w:rPr>
-        <w:t>2.2 Table de la fiche d'identité (identity_cards)</w:t>
-      </w:r>
-    </w:p>
-    <w:tbl>
-      <w:tblPr>
-        <w:tblW w:type="auto" w:w="0"/>
-        <w:jc w:val="center"/>
-        <w:tblLayout w:type="fixed"/>
-        <w:tblLook w:firstColumn="1" w:firstRow="1" w:lastColumn="0" w:lastRow="0" w:noHBand="0" w:noVBand="1" w:val="04A0"/>
-      </w:tblPr>
-      <w:tblGrid>
-        <w:gridCol w:w="9360"/>
-      </w:tblGrid>
-      <w:tr>
-        <w:tc>
-          <w:tcPr>
-            <w:tcW w:type="dxa" w:w="9360"/>
-            <w:shd w:fill="F8FAFC"/>
-            <w:tcBorders>
-              <w:top w:val="single" w:sz="4" w:space="0" w:color="CBD5E1"/>
-              <w:left w:val="single" w:sz="16" w:space="0" w:color="3B82F6"/>
-              <w:bottom w:val="single" w:sz="4" w:space="0" w:color="CBD5E1"/>
-              <w:right w:val="single" w:sz="4" w:space="0" w:color="CBD5E1"/>
-            </w:tcBorders>
-          </w:tcPr>
-          <w:p>
-            <w:pPr>
-              <w:spacing w:before="80" w:after="80"/>
-            </w:pPr>
-            <w:r>
-              <w:rPr>
-                <w:rFonts w:ascii="Consolas" w:hAnsi="Consolas"/>
-                <w:color w:val="1E293B"/>
-                <w:sz w:val="18"/>
-              </w:rPr>
-              <w:t>CREATE TABLE identity_cards (</w:t>
-              <w:br/>
-              <w:t xml:space="preserve">    profile_id INTEGER PRIMARY KEY,</w:t>
-              <w:br/>
-              <w:t xml:space="preserve">    prenom TEXT, nom TEXT, sexe INTEGER, date_naissance TEXT,</w:t>
-              <w:br/>
-              <w:t xml:space="preserve">    pays_naissance TEXT, habite_pays TEXT, habite_region_dept TEXT, habite_commune TEXT,</w:t>
-              <w:br/>
-              <w:t xml:space="preserve">    situation_famille TEXT, recherche_de TEXT, ville TEXT, statut TEXT, bio TEXT,</w:t>
-              <w:br/>
-              <w:t xml:space="preserve">    taille REAL, poids REAL, pointure REAL, tour_poitrine REAL, tour_taille REAL, tour_hanches REAL,</w:t>
-              <w:br/>
-              <w:t xml:space="preserve">    origines TEXT, couleur_cheveux TEXT, style TEXT, aime_chez_moi TEXT, aime_pas_chez_moi TEXT,</w:t>
-              <w:br/>
-              <w:t xml:space="preserve">    FOREIGN KEY (profile_id) REFERENCES profiles(id)</w:t>
-              <w:br/>
-              <w:t>);</w:t>
-            </w:r>
-          </w:p>
-        </w:tc>
-      </w:tr>
-    </w:tbl>
-    <w:p>
-      <w:pPr>
-        <w:spacing w:before="240" w:after="80"/>
-      </w:pPr>
-      <w:r>
-        <w:rPr>
-          <w:rFonts w:ascii="Segoe UI" w:hAnsi="Segoe UI"/>
-          <w:b/>
-          <w:color w:val="475569"/>
-          <w:sz w:val="23"/>
-        </w:rPr>
-        <w:t>2.3 Table de la banque de questions (questions)</w:t>
-      </w:r>
-    </w:p>
-    <w:tbl>
-      <w:tblPr>
-        <w:tblW w:type="auto" w:w="0"/>
-        <w:jc w:val="center"/>
-        <w:tblLayout w:type="fixed"/>
-        <w:tblLook w:firstColumn="1" w:firstRow="1" w:lastColumn="0" w:lastRow="0" w:noHBand="0" w:noVBand="1" w:val="04A0"/>
-      </w:tblPr>
-      <w:tblGrid>
-        <w:gridCol w:w="9360"/>
-      </w:tblGrid>
-      <w:tr>
-        <w:tc>
-          <w:tcPr>
-            <w:tcW w:type="dxa" w:w="9360"/>
-            <w:shd w:fill="F8FAFC"/>
-            <w:tcBorders>
-              <w:top w:val="single" w:sz="4" w:space="0" w:color="CBD5E1"/>
-              <w:left w:val="single" w:sz="16" w:space="0" w:color="3B82F6"/>
-              <w:bottom w:val="single" w:sz="4" w:space="0" w:color="CBD5E1"/>
-              <w:right w:val="single" w:sz="4" w:space="0" w:color="CBD5E1"/>
-            </w:tcBorders>
-          </w:tcPr>
-          <w:p>
-            <w:pPr>
-              <w:spacing w:before="80" w:after="80"/>
-            </w:pPr>
-            <w:r>
-              <w:rPr>
-                <w:rFonts w:ascii="Consolas" w:hAnsi="Consolas"/>
-                <w:color w:val="1E293B"/>
-                <w:sz w:val="18"/>
-              </w:rPr>
-              <w:t>CREATE TABLE questions (</w:t>
-              <w:br/>
-              <w:t xml:space="preserve">    id INTEGER PRIMARY KEY AUTOINCREMENT,</w:t>
-              <w:br/>
-              <w:t xml:space="preserve">    pack_id INTEGER DEFAULT 1,</w:t>
-              <w:br/>
-              <w:t xml:space="preserve">    cible INTEGER DEFAULT 0, -- 0: Mixte, 1: Homme, 2: Femme</w:t>
-              <w:br/>
-              <w:t xml:space="preserve">    classe INTEGER DEFAULT 1, -- 0..9 (1: Standards, 8: Identité, etc.)</w:t>
-              <w:br/>
-              <w:t xml:space="preserve">    thematique TEXT NOT NULL,</w:t>
-              <w:br/>
-              <w:t xml:space="preserve">    sujet TEXT NOT NULL,</w:t>
-              <w:br/>
-              <w:t xml:space="preserve">    type TEXT NOT NULL, -- 'G', 'M', 'P', 'T'</w:t>
-              <w:br/>
-              <w:t xml:space="preserve">    texte TEXT NOT NULL,</w:t>
-              <w:br/>
-              <w:t xml:space="preserve">    n_quest_lie INTEGER DEFAULT NULL -- ID de la question mère (arborescence)</w:t>
-              <w:br/>
-              <w:t>);</w:t>
-            </w:r>
-          </w:p>
-        </w:tc>
-      </w:tr>
-    </w:tbl>
-    <w:p>
-      <w:pPr>
-        <w:spacing w:before="240" w:after="80"/>
-      </w:pPr>
-      <w:r>
-        <w:rPr>
-          <w:rFonts w:ascii="Segoe UI" w:hAnsi="Segoe UI"/>
-          <w:b/>
-          <w:color w:val="475569"/>
-          <w:sz w:val="23"/>
-        </w:rPr>
-        <w:t>2.4 Tables des réponses et modules d'identité</w:t>
-      </w:r>
-    </w:p>
-    <w:tbl>
-      <w:tblPr>
-        <w:tblW w:type="auto" w:w="0"/>
-        <w:jc w:val="center"/>
-        <w:tblLayout w:type="fixed"/>
-        <w:tblLook w:firstColumn="1" w:firstRow="1" w:lastColumn="0" w:lastRow="0" w:noHBand="0" w:noVBand="1" w:val="04A0"/>
-      </w:tblPr>
-      <w:tblGrid>
-        <w:gridCol w:w="9360"/>
-      </w:tblGrid>
-      <w:tr>
-        <w:tc>
-          <w:tcPr>
-            <w:tcW w:type="dxa" w:w="9360"/>
-            <w:shd w:fill="F8FAFC"/>
-            <w:tcBorders>
-              <w:top w:val="single" w:sz="4" w:space="0" w:color="CBD5E1"/>
-              <w:left w:val="single" w:sz="16" w:space="0" w:color="3B82F6"/>
-              <w:bottom w:val="single" w:sz="4" w:space="0" w:color="CBD5E1"/>
-              <w:right w:val="single" w:sz="4" w:space="0" w:color="CBD5E1"/>
-            </w:tcBorders>
-          </w:tcPr>
-          <w:p>
-            <w:pPr>
-              <w:spacing w:before="80" w:after="80"/>
-            </w:pPr>
-            <w:r>
-              <w:rPr>
-                <w:rFonts w:ascii="Consolas" w:hAnsi="Consolas"/>
-                <w:color w:val="1E293B"/>
-                <w:sz w:val="18"/>
-              </w:rPr>
-              <w:t>-- Réponses aux questionnaires généraux (Types G et M)</w:t>
-              <w:br/>
-              <w:t>CREATE TABLE answers (</w:t>
-              <w:br/>
-              <w:t xml:space="preserve">    profile_id INTEGER NOT NULL,</w:t>
-              <w:br/>
-              <w:t xml:space="preserve">    question_id INTEGER NOT NULL,</w:t>
-              <w:br/>
-              <w:t xml:space="preserve">    valeur_g REAL,</w:t>
-              <w:br/>
-              <w:t xml:space="preserve">    valeur_m_v REAL, valeur_m_a REAL, valeur_m_d REAL, valeur_m_p REAL,</w:t>
-              <w:br/>
-              <w:t xml:space="preserve">    PRIMARY KEY (profile_id, question_id)</w:t>
-              <w:br/>
-              <w:t>);</w:t>
-              <w:br/>
-              <w:br/>
-              <w:t>-- Réponses '+ sur moi' (Classe 8, Type P - Précis)</w:t>
-              <w:br/>
-              <w:t>CREATE TABLE identity_answers_self (</w:t>
-              <w:br/>
-              <w:t xml:space="preserve">    profile_id INTEGER NOT NULL,</w:t>
-              <w:br/>
-              <w:t xml:space="preserve">    question_id INTEGER NOT NULL,</w:t>
-              <w:br/>
-              <w:t xml:space="preserve">    valeur_num REAL,</w:t>
-              <w:br/>
-              <w:t xml:space="preserve">    valeur_text TEXT,</w:t>
-              <w:br/>
-              <w:t xml:space="preserve">    PRIMARY KEY (profile_id, question_id)</w:t>
-              <w:br/>
-              <w:t>);</w:t>
-              <w:br/>
-              <w:br/>
-              <w:t>-- Critères et tolérances '+ sur l'autre' (Classe 8, Type T - Tolérance)</w:t>
-              <w:br/>
-              <w:t>CREATE TABLE identity_answers_partner (</w:t>
-              <w:br/>
-              <w:t xml:space="preserve">    profile_id INTEGER NOT NULL,</w:t>
-              <w:br/>
-              <w:t xml:space="preserve">    question_id INTEGER NOT NULL,</w:t>
-              <w:br/>
-              <w:t xml:space="preserve">    indifferent INTEGER DEFAULT 0,</w:t>
-              <w:br/>
-              <w:t xml:space="preserve">    min_val REAL, max_val REAL,</w:t>
-              <w:br/>
-              <w:t xml:space="preserve">    options_json TEXT, -- Tableau JSON des choix acceptés</w:t>
-              <w:br/>
-              <w:t xml:space="preserve">    PRIMARY KEY (profile_id, question_id)</w:t>
-              <w:br/>
-              <w:t>);</w:t>
-            </w:r>
-          </w:p>
-        </w:tc>
-      </w:tr>
-    </w:tbl>
-    <w:p>
-      <w:pPr>
-        <w:spacing w:before="400" w:after="120"/>
-      </w:pPr>
-      <w:r>
-        <w:rPr>
-          <w:rFonts w:ascii="Segoe UI" w:hAnsi="Segoe UI"/>
-          <w:b/>
-          <w:color w:val="1E3A8A"/>
-          <w:sz w:val="28"/>
-        </w:rPr>
-        <w:t>3. SPÉCIFICATION COMPLÈTE DES API REST</w:t>
+        <w:t>1. VUE D'ENSEMBLE DE L'ARCHITECTURE &amp; CHOIX TECHNOLOGIQUES</w:t>
       </w:r>
     </w:p>
     <w:p>
       <w:r>
-        <w:t>Toutes les communications s'effectuent en JSON via HTTP/1.1 avec le header 'Content-Type: application/json'.</w:t>
+        <w:rPr>
+          <w:lang w:val="fr-FR"/>
+        </w:rPr>
+        <w:t>L'application Affinity (référence projet ARP001) a été conçue pour offrir un moteur d'affinités électives hautement performant, fluide et respectueux de la vie privée. L'architecture repose sur des fondations légères sans frameworks lourds ni processus de compilation contraignants :</w:t>
       </w:r>
     </w:p>
     <w:p>
@@ -506,11 +356,15 @@
       <w:r>
         <w:rPr>
           <w:b/>
+          <w:lang w:val="fr-FR"/>
         </w:rPr>
-        <w:t xml:space="preserve">POST /api/auth/register : </w:t>
+        <w:t xml:space="preserve">Frontend SPA (Single Page Application) : </w:t>
       </w:r>
       <w:r>
-        <w:t>Création d'un profil Invité : { pseudo, password }. Retourne le token de session et le profil.</w:t>
+        <w:rPr>
+          <w:lang w:val="fr-FR"/>
+        </w:rPr>
+        <w:t>Développé en HTML5 sémantique, CSS3 moderne (variables CSS, flexbox, grid, glassmorphism, mode sombre soigné) et Vanilla JavaScript (ES6+). Ce choix garantit un temps de chargement quasi-instantané, une maintenance limpide et l'absence totale de failles de dépendances (zéro Node modules côté exécution client).</w:t>
       </w:r>
     </w:p>
     <w:p>
@@ -520,11 +374,15 @@
       <w:r>
         <w:rPr>
           <w:b/>
+          <w:lang w:val="fr-FR"/>
         </w:rPr>
-        <w:t xml:space="preserve">POST /api/auth/login : </w:t>
+        <w:t xml:space="preserve">Backend Python Haute Concurrence : </w:t>
       </w:r>
       <w:r>
-        <w:t>Authentification : { login, password }. Retourne le token de session.</w:t>
+        <w:rPr>
+          <w:lang w:val="fr-FR"/>
+        </w:rPr>
+        <w:t>Construit autour du module standard http.server renforcé par socketserver.ThreadingMixIn. Ce serveur multithreadé gère efficacement les requêtes concurrentes, sert les ressources statiques et expose l'ensemble des API REST.</w:t>
       </w:r>
     </w:p>
     <w:p>
@@ -534,11 +392,425 @@
       <w:r>
         <w:rPr>
           <w:b/>
+          <w:lang w:val="fr-FR"/>
         </w:rPr>
-        <w:t xml:space="preserve">GET /api/auth/me : </w:t>
+        <w:t xml:space="preserve">Base Relationnelle SQLite3 Locale : </w:t>
       </w:r>
       <w:r>
-        <w:t>Récupère les informations complètes du profil actuellement connecté via le Bearer Token.</w:t>
+        <w:rPr>
+          <w:lang w:val="fr-FR"/>
+        </w:rPr>
+        <w:t>Fichier autonome 'affinity.db', parfaitement portable, hautement optimisé avec indexes ciblés, intégrité référentielle et politique de migrations douces transparentes (ALTER TABLE dynamique sans perte de données).</w:t>
+      </w:r>
+    </w:p>
+    <w:p>
+      <w:pPr>
+        <w:spacing w:before="280" w:after="120"/>
+      </w:pPr>
+      <w:r>
+        <w:rPr>
+          <w:b/>
+          <w:color w:val="0E7490"/>
+          <w:sz w:val="28"/>
+          <w:lang w:val="fr-FR"/>
+        </w:rPr>
+        <w:t>2. ARCHITECTURE DES RÔLES &amp; SÉCURITÉ D'ACCÈS</w:t>
+      </w:r>
+    </w:p>
+    <w:p>
+      <w:r>
+        <w:rPr>
+          <w:lang w:val="fr-FR"/>
+        </w:rPr>
+        <w:t>Affinity applique une hiérarchie stricte à 3 niveaux de rôles afin de protéger la confidentialité des données intimes et de garantir la souveraineté du gestionnaire de la plateforme :</w:t>
+      </w:r>
+    </w:p>
+    <w:tbl>
+      <w:tblPr>
+        <w:tblW w:type="auto" w:w="0"/>
+        <w:jc w:val="center"/>
+        <w:tblLook w:firstColumn="1" w:firstRow="1" w:lastColumn="0" w:lastRow="0" w:noHBand="0" w:noVBand="1" w:val="04A0"/>
+      </w:tblPr>
+      <w:tblGrid>
+        <w:gridCol w:w="2329"/>
+        <w:gridCol w:w="2329"/>
+        <w:gridCol w:w="2329"/>
+        <w:gridCol w:w="2329"/>
+      </w:tblGrid>
+      <w:tr>
+        <w:tc>
+          <w:tcPr>
+            <w:tcW w:type="dxa" w:w="2329"/>
+            <w:shd w:val="clear" w:color="auto" w:fill="0E7490"/>
+            <w:tcMar>
+              <w:top w:w="120" w:type="dxa"/>
+              <w:bottom w:w="120" w:type="dxa"/>
+              <w:left w:w="140" w:type="dxa"/>
+              <w:right w:w="140" w:type="dxa"/>
+            </w:tcMar>
+          </w:tcPr>
+          <w:p>
+            <w:r>
+              <w:rPr>
+                <w:b/>
+                <w:color w:val="FFFFFF"/>
+                <w:sz w:val="20"/>
+              </w:rPr>
+              <w:t>Rôle</w:t>
+            </w:r>
+          </w:p>
+        </w:tc>
+        <w:tc>
+          <w:tcPr>
+            <w:tcW w:type="dxa" w:w="2329"/>
+            <w:shd w:val="clear" w:color="auto" w:fill="0E7490"/>
+            <w:tcMar>
+              <w:top w:w="120" w:type="dxa"/>
+              <w:bottom w:w="120" w:type="dxa"/>
+              <w:left w:w="140" w:type="dxa"/>
+              <w:right w:w="140" w:type="dxa"/>
+            </w:tcMar>
+          </w:tcPr>
+          <w:p>
+            <w:r>
+              <w:rPr>
+                <w:b/>
+                <w:color w:val="FFFFFF"/>
+                <w:sz w:val="20"/>
+              </w:rPr>
+              <w:t>Identifiant Unique</w:t>
+            </w:r>
+          </w:p>
+        </w:tc>
+        <w:tc>
+          <w:tcPr>
+            <w:tcW w:type="dxa" w:w="2329"/>
+            <w:shd w:val="clear" w:color="auto" w:fill="0E7490"/>
+            <w:tcMar>
+              <w:top w:w="120" w:type="dxa"/>
+              <w:bottom w:w="120" w:type="dxa"/>
+              <w:left w:w="140" w:type="dxa"/>
+              <w:right w:w="140" w:type="dxa"/>
+            </w:tcMar>
+          </w:tcPr>
+          <w:p>
+            <w:r>
+              <w:rPr>
+                <w:b/>
+                <w:color w:val="FFFFFF"/>
+                <w:sz w:val="20"/>
+              </w:rPr>
+              <w:t>Prérogatives</w:t>
+            </w:r>
+          </w:p>
+        </w:tc>
+        <w:tc>
+          <w:tcPr>
+            <w:tcW w:type="dxa" w:w="2329"/>
+            <w:shd w:val="clear" w:color="auto" w:fill="0E7490"/>
+            <w:tcMar>
+              <w:top w:w="120" w:type="dxa"/>
+              <w:bottom w:w="120" w:type="dxa"/>
+              <w:left w:w="140" w:type="dxa"/>
+              <w:right w:w="140" w:type="dxa"/>
+            </w:tcMar>
+          </w:tcPr>
+          <w:p>
+            <w:r>
+              <w:rPr>
+                <w:b/>
+                <w:color w:val="FFFFFF"/>
+                <w:sz w:val="20"/>
+              </w:rPr>
+              <w:t>Restrictions</w:t>
+            </w:r>
+          </w:p>
+        </w:tc>
+      </w:tr>
+      <w:tr>
+        <w:tc>
+          <w:tcPr>
+            <w:tcW w:type="dxa" w:w="2329"/>
+            <w:shd w:val="clear" w:color="auto" w:fill="F8FAFC"/>
+            <w:tcMar>
+              <w:top w:w="100" w:type="dxa"/>
+              <w:bottom w:w="100" w:type="dxa"/>
+              <w:left w:w="120" w:type="dxa"/>
+              <w:right w:w="120" w:type="dxa"/>
+            </w:tcMar>
+          </w:tcPr>
+          <w:p>
+            <w:r>
+              <w:rPr>
+                <w:color w:val="1E293B"/>
+                <w:sz w:val="19"/>
+              </w:rPr>
+              <w:t>Administrateur (admin)</w:t>
+            </w:r>
+          </w:p>
+        </w:tc>
+        <w:tc>
+          <w:tcPr>
+            <w:tcW w:type="dxa" w:w="2329"/>
+            <w:shd w:val="clear" w:color="auto" w:fill="F8FAFC"/>
+            <w:tcMar>
+              <w:top w:w="100" w:type="dxa"/>
+              <w:bottom w:w="100" w:type="dxa"/>
+              <w:left w:w="120" w:type="dxa"/>
+              <w:right w:w="120" w:type="dxa"/>
+            </w:tcMar>
+          </w:tcPr>
+          <w:p>
+            <w:r>
+              <w:rPr>
+                <w:color w:val="1E293B"/>
+                <w:sz w:val="19"/>
+              </w:rPr>
+              <w:t>ADM-1 (Anji)</w:t>
+            </w:r>
+          </w:p>
+        </w:tc>
+        <w:tc>
+          <w:tcPr>
+            <w:tcW w:type="dxa" w:w="2329"/>
+            <w:shd w:val="clear" w:color="auto" w:fill="F8FAFC"/>
+            <w:tcMar>
+              <w:top w:w="100" w:type="dxa"/>
+              <w:bottom w:w="100" w:type="dxa"/>
+              <w:left w:w="120" w:type="dxa"/>
+              <w:right w:w="120" w:type="dxa"/>
+            </w:tcMar>
+          </w:tcPr>
+          <w:p>
+            <w:r>
+              <w:rPr>
+                <w:color w:val="1E293B"/>
+                <w:sz w:val="19"/>
+              </w:rPr>
+              <w:t>Accès absolu : gestion des utilisateurs, banque de questions, arbitrage, arbitrages des accès, sauvegardes locales, simulation de rôles.</w:t>
+            </w:r>
+          </w:p>
+        </w:tc>
+        <w:tc>
+          <w:tcPr>
+            <w:tcW w:type="dxa" w:w="2329"/>
+            <w:shd w:val="clear" w:color="auto" w:fill="F8FAFC"/>
+            <w:tcMar>
+              <w:top w:w="100" w:type="dxa"/>
+              <w:bottom w:w="100" w:type="dxa"/>
+              <w:left w:w="120" w:type="dxa"/>
+              <w:right w:w="120" w:type="dxa"/>
+            </w:tcMar>
+          </w:tcPr>
+          <w:p>
+            <w:r>
+              <w:rPr>
+                <w:color w:val="1E293B"/>
+                <w:sz w:val="19"/>
+              </w:rPr>
+              <w:t>Superviseur strict : ne participe pas aux calculs de match et n'a pas de profil de rencontre.</w:t>
+            </w:r>
+          </w:p>
+        </w:tc>
+      </w:tr>
+      <w:tr>
+        <w:tc>
+          <w:tcPr>
+            <w:tcW w:type="dxa" w:w="2329"/>
+            <w:shd w:val="clear" w:color="auto" w:fill="FFFFFF"/>
+            <w:tcMar>
+              <w:top w:w="100" w:type="dxa"/>
+              <w:bottom w:w="100" w:type="dxa"/>
+              <w:left w:w="120" w:type="dxa"/>
+              <w:right w:w="120" w:type="dxa"/>
+            </w:tcMar>
+          </w:tcPr>
+          <w:p>
+            <w:r>
+              <w:rPr>
+                <w:color w:val="1E293B"/>
+                <w:sz w:val="19"/>
+              </w:rPr>
+              <w:t>Abonné (subscriber)</w:t>
+            </w:r>
+          </w:p>
+        </w:tc>
+        <w:tc>
+          <w:tcPr>
+            <w:tcW w:type="dxa" w:w="2329"/>
+            <w:shd w:val="clear" w:color="auto" w:fill="FFFFFF"/>
+            <w:tcMar>
+              <w:top w:w="100" w:type="dxa"/>
+              <w:bottom w:w="100" w:type="dxa"/>
+              <w:left w:w="120" w:type="dxa"/>
+              <w:right w:w="120" w:type="dxa"/>
+            </w:tcMar>
+          </w:tcPr>
+          <w:p>
+            <w:r>
+              <w:rPr>
+                <w:color w:val="1E293B"/>
+                <w:sz w:val="19"/>
+              </w:rPr>
+              <w:t>AFF-x (ex: AFF-23)</w:t>
+            </w:r>
+          </w:p>
+        </w:tc>
+        <w:tc>
+          <w:tcPr>
+            <w:tcW w:type="dxa" w:w="2329"/>
+            <w:shd w:val="clear" w:color="auto" w:fill="FFFFFF"/>
+            <w:tcMar>
+              <w:top w:w="100" w:type="dxa"/>
+              <w:bottom w:w="100" w:type="dxa"/>
+              <w:left w:w="120" w:type="dxa"/>
+              <w:right w:w="120" w:type="dxa"/>
+            </w:tcMar>
+          </w:tcPr>
+          <w:p>
+            <w:r>
+              <w:rPr>
+                <w:color w:val="1E293B"/>
+                <w:sz w:val="19"/>
+              </w:rPr>
+              <w:t>Accès complet au Calculateur d'Affinité, Radar multidimensionnel, demandes de match bilatérales, questionnaires autorisés.</w:t>
+            </w:r>
+          </w:p>
+        </w:tc>
+        <w:tc>
+          <w:tcPr>
+            <w:tcW w:type="dxa" w:w="2329"/>
+            <w:shd w:val="clear" w:color="auto" w:fill="FFFFFF"/>
+            <w:tcMar>
+              <w:top w:w="100" w:type="dxa"/>
+              <w:bottom w:w="100" w:type="dxa"/>
+              <w:left w:w="120" w:type="dxa"/>
+              <w:right w:w="120" w:type="dxa"/>
+            </w:tcMar>
+          </w:tcPr>
+          <w:p>
+            <w:r>
+              <w:rPr>
+                <w:color w:val="1E293B"/>
+                <w:sz w:val="19"/>
+              </w:rPr>
+              <w:t>Ne peut pas modifier la banque de questions ni administrer les autres membres.</w:t>
+            </w:r>
+          </w:p>
+        </w:tc>
+      </w:tr>
+      <w:tr>
+        <w:tc>
+          <w:tcPr>
+            <w:tcW w:type="dxa" w:w="2329"/>
+            <w:shd w:val="clear" w:color="auto" w:fill="F8FAFC"/>
+            <w:tcMar>
+              <w:top w:w="100" w:type="dxa"/>
+              <w:bottom w:w="100" w:type="dxa"/>
+              <w:left w:w="120" w:type="dxa"/>
+              <w:right w:w="120" w:type="dxa"/>
+            </w:tcMar>
+          </w:tcPr>
+          <w:p>
+            <w:r>
+              <w:rPr>
+                <w:color w:val="1E293B"/>
+                <w:sz w:val="19"/>
+              </w:rPr>
+              <w:t>Invité (guest)</w:t>
+            </w:r>
+          </w:p>
+        </w:tc>
+        <w:tc>
+          <w:tcPr>
+            <w:tcW w:type="dxa" w:w="2329"/>
+            <w:shd w:val="clear" w:color="auto" w:fill="F8FAFC"/>
+            <w:tcMar>
+              <w:top w:w="100" w:type="dxa"/>
+              <w:bottom w:w="100" w:type="dxa"/>
+              <w:left w:w="120" w:type="dxa"/>
+              <w:right w:w="120" w:type="dxa"/>
+            </w:tcMar>
+          </w:tcPr>
+          <w:p>
+            <w:r>
+              <w:rPr>
+                <w:color w:val="1E293B"/>
+                <w:sz w:val="19"/>
+              </w:rPr>
+              <w:t>AFF-x (nouveaux comptes)</w:t>
+            </w:r>
+          </w:p>
+        </w:tc>
+        <w:tc>
+          <w:tcPr>
+            <w:tcW w:type="dxa" w:w="2329"/>
+            <w:shd w:val="clear" w:color="auto" w:fill="F8FAFC"/>
+            <w:tcMar>
+              <w:top w:w="100" w:type="dxa"/>
+              <w:bottom w:w="100" w:type="dxa"/>
+              <w:left w:w="120" w:type="dxa"/>
+              <w:right w:w="120" w:type="dxa"/>
+            </w:tcMar>
+          </w:tcPr>
+          <w:p>
+            <w:r>
+              <w:rPr>
+                <w:color w:val="1E293B"/>
+                <w:sz w:val="19"/>
+              </w:rPr>
+              <w:t>Rôle d'accueil par défaut : saisie de sa fiche d'identité, réponse aux questionnaires standards (classe 1) et module identité.</w:t>
+            </w:r>
+          </w:p>
+        </w:tc>
+        <w:tc>
+          <w:tcPr>
+            <w:tcW w:type="dxa" w:w="2329"/>
+            <w:shd w:val="clear" w:color="auto" w:fill="F8FAFC"/>
+            <w:tcMar>
+              <w:top w:w="100" w:type="dxa"/>
+              <w:bottom w:w="100" w:type="dxa"/>
+              <w:left w:w="120" w:type="dxa"/>
+              <w:right w:w="120" w:type="dxa"/>
+            </w:tcMar>
+          </w:tcPr>
+          <w:p>
+            <w:r>
+              <w:rPr>
+                <w:color w:val="1E293B"/>
+                <w:sz w:val="19"/>
+              </w:rPr>
+              <w:t>Calculateur d'affinité et demandes de match verrouillés. Doit être promu par l'administrateur.</w:t>
+            </w:r>
+          </w:p>
+        </w:tc>
+      </w:tr>
+    </w:tbl>
+    <w:p>
+      <w:pPr>
+        <w:spacing w:after="200"/>
+      </w:pPr>
+    </w:p>
+    <w:p>
+      <w:pPr>
+        <w:spacing w:before="280" w:after="120"/>
+      </w:pPr>
+      <w:r>
+        <w:rPr>
+          <w:b/>
+          <w:color w:val="0E7490"/>
+          <w:sz w:val="28"/>
+          <w:lang w:val="fr-FR"/>
+        </w:rPr>
+        <w:t>3. MODÈLE DE DONNÉES &amp; SCHÉMA RELATIONNEL SQLITE</w:t>
+      </w:r>
+    </w:p>
+    <w:p>
+      <w:r>
+        <w:rPr>
+          <w:lang w:val="fr-FR"/>
+        </w:rPr>
+        <w:t>Le modèle de données 'affinity.db' structure les utilisateurs, leurs fiches détaillées, la banque de questions hiérarchisée, leurs réponses et les critères de matching :</w:t>
       </w:r>
     </w:p>
     <w:p>
@@ -548,11 +820,15 @@
       <w:r>
         <w:rPr>
           <w:b/>
+          <w:lang w:val="fr-FR"/>
         </w:rPr>
-        <w:t xml:space="preserve">POST /api/auth/logout : </w:t>
+        <w:t xml:space="preserve">profiles : </w:t>
       </w:r>
       <w:r>
-        <w:t>Invalide et supprime la session active.</w:t>
+        <w:rPr>
+          <w:lang w:val="fr-FR"/>
+        </w:rPr>
+        <w:t>id (PK), pseudo (unique), role ('admin', 'subscriber', 'guest'), code_profil ('ADM-1', 'AFF-x'), password_hash, salt, email, created_at.</w:t>
       </w:r>
     </w:p>
     <w:p>
@@ -562,11 +838,15 @@
       <w:r>
         <w:rPr>
           <w:b/>
+          <w:lang w:val="fr-FR"/>
         </w:rPr>
-        <w:t xml:space="preserve">POST /api/auth/change-password : </w:t>
+        <w:t xml:space="preserve">identity_cards : </w:t>
       </w:r>
       <w:r>
-        <w:t>Changement de mot de passe connecté : { old_password, new_password }.</w:t>
+        <w:rPr>
+          <w:lang w:val="fr-FR"/>
+        </w:rPr>
+        <w:t>profile_id (PK, FK), date_naissance, sexe (1: Homme, 2: Femme), habite_commune, habite_region_dept, habite_pays, travail_commune, statut, situation_famille, recherche_de, bio, aime_chez_moi, aime_pas_chez_moi, updated_at.</w:t>
       </w:r>
     </w:p>
     <w:p>
@@ -576,11 +856,15 @@
       <w:r>
         <w:rPr>
           <w:b/>
+          <w:lang w:val="fr-FR"/>
         </w:rPr>
-        <w:t xml:space="preserve">POST /api/auth/forgot-password : </w:t>
+        <w:t xml:space="preserve">questions : </w:t>
       </w:r>
       <w:r>
-        <w:t>Demande de réinitialisation sans email : génère et renvoie le code à 6 chiffres.</w:t>
+        <w:rPr>
+          <w:lang w:val="fr-FR"/>
+        </w:rPr>
+        <w:t>id (PK), pack_id (FK), cible (0: Tous, 1: Homme, 2: Femme), classe (0 à 9), thematique, sujet, type ('G', 'M', 'P', 'T'), texte, config_reponses (JSON), n_quest_lie (clé de liaison parent/enfant ou P &lt;-&gt; T), actif (0/1).</w:t>
       </w:r>
     </w:p>
     <w:p>
@@ -590,11 +874,15 @@
       <w:r>
         <w:rPr>
           <w:b/>
+          <w:lang w:val="fr-FR"/>
         </w:rPr>
-        <w:t xml:space="preserve">POST /api/auth/reset-password : </w:t>
+        <w:t xml:space="preserve">answers : </w:t>
       </w:r>
       <w:r>
-        <w:t>Validation du nouveau mot de passe avec code : { login_or_email, reset_code, new_password }.</w:t>
+        <w:rPr>
+          <w:lang w:val="fr-FR"/>
+        </w:rPr>
+        <w:t>profile_id, question_id, axis ('G', 'V', 'A', 'D', 'P'), value (échelle 1 à 5, ou 9 pour jamais/impossible), updated_at.</w:t>
       </w:r>
     </w:p>
     <w:p>
@@ -604,11 +892,15 @@
       <w:r>
         <w:rPr>
           <w:b/>
+          <w:lang w:val="fr-FR"/>
         </w:rPr>
-        <w:t xml:space="preserve">GET /api/profiles : </w:t>
+        <w:t xml:space="preserve">identity_answers_self (+ sur moi) : </w:t>
       </w:r>
       <w:r>
-        <w:t>Liste tous les profils (réservée à l'administrateur, ou profils publics pour les abonnés).</w:t>
+        <w:rPr>
+          <w:lang w:val="fr-FR"/>
+        </w:rPr>
+        <w:t>profile_id, question_id, valeur_num (stature, poids, tours), valeur_text (silhouette, yeux, cheveux, style), updated_at.</w:t>
       </w:r>
     </w:p>
     <w:p>
@@ -618,11 +910,15 @@
       <w:r>
         <w:rPr>
           <w:b/>
+          <w:lang w:val="fr-FR"/>
         </w:rPr>
-        <w:t xml:space="preserve">POST /api/profiles/:id/identity : </w:t>
+        <w:t xml:space="preserve">identity_answers_partner (+ sur l'autre) : </w:t>
       </w:r>
       <w:r>
-        <w:t>Enregistre l'ensemble de la fiche d'identité d'un profil.</w:t>
+        <w:rPr>
+          <w:lang w:val="fr-FR"/>
+        </w:rPr>
+        <w:t>profile_id, question_id, min_val, max_val, options_json (liste options acceptées), indifferent (1 si aucune exigence), updated_at.</w:t>
       </w:r>
     </w:p>
     <w:p>
@@ -632,11 +928,1390 @@
       <w:r>
         <w:rPr>
           <w:b/>
+          <w:lang w:val="fr-FR"/>
         </w:rPr>
-        <w:t xml:space="preserve">GET /api/questions : </w:t>
+        <w:t xml:space="preserve">match_requests : </w:t>
       </w:r>
       <w:r>
-        <w:t>Retourne les questions filtrées selon les autorisations du rôle.</w:t>
+        <w:rPr>
+          <w:lang w:val="fr-FR"/>
+        </w:rPr>
+        <w:t>id (PK), sender_id (FK), receiver_id (FK), status ('pending', 'accepted', 'rejected'), proposed_classes, validated_classes, created_at, updated_at.</w:t>
+      </w:r>
+    </w:p>
+    <w:p>
+      <w:pPr>
+        <w:spacing w:before="280" w:after="120"/>
+      </w:pPr>
+      <w:r>
+        <w:rPr>
+          <w:b/>
+          <w:color w:val="0E7490"/>
+          <w:sz w:val="28"/>
+          <w:lang w:val="fr-FR"/>
+        </w:rPr>
+        <w:t>4. MODULE D'IDENTITÉ &amp; CARACTÉRISTIQUES (CLASSE 8)</w:t>
+      </w:r>
+    </w:p>
+    <w:p>
+      <w:r>
+        <w:rPr>
+          <w:lang w:val="fr-FR"/>
+        </w:rPr>
+        <w:t>Le module d'identité classe 8 matérialise une innovation majeure issue d'Affinity.docx : dissocier ce que la personne EST (+ sur moi) de ce qu'elle ATTEND chez son/sa partenaire (+ sur l'autre).</w:t>
+      </w:r>
+    </w:p>
+    <w:p>
+      <w:r>
+        <w:rPr>
+          <w:lang w:val="fr-FR"/>
+        </w:rPr>
+        <w:t>Chaque dimension physique, morphologique ou de mode de vie est structurée en un couple indissociable via le champ 'n_quest_lie' :</w:t>
+      </w:r>
+    </w:p>
+    <w:tbl>
+      <w:tblPr>
+        <w:tblW w:type="auto" w:w="0"/>
+        <w:jc w:val="center"/>
+        <w:tblLook w:firstColumn="1" w:firstRow="1" w:lastColumn="0" w:lastRow="0" w:noHBand="0" w:noVBand="1" w:val="04A0"/>
+      </w:tblPr>
+      <w:tblGrid>
+        <w:gridCol w:w="2329"/>
+        <w:gridCol w:w="2329"/>
+        <w:gridCol w:w="2329"/>
+        <w:gridCol w:w="2329"/>
+      </w:tblGrid>
+      <w:tr>
+        <w:tc>
+          <w:tcPr>
+            <w:tcW w:type="dxa" w:w="2329"/>
+            <w:shd w:val="clear" w:color="auto" w:fill="0284C7"/>
+            <w:tcMar>
+              <w:top w:w="100" w:type="dxa"/>
+              <w:bottom w:w="100" w:type="dxa"/>
+              <w:left w:w="120" w:type="dxa"/>
+              <w:right w:w="120" w:type="dxa"/>
+            </w:tcMar>
+          </w:tcPr>
+          <w:p>
+            <w:r>
+              <w:rPr>
+                <w:b/>
+                <w:color w:val="FFFFFF"/>
+                <w:sz w:val="19"/>
+              </w:rPr>
+              <w:t>Dimension</w:t>
+            </w:r>
+          </w:p>
+        </w:tc>
+        <w:tc>
+          <w:tcPr>
+            <w:tcW w:type="dxa" w:w="2329"/>
+            <w:shd w:val="clear" w:color="auto" w:fill="0284C7"/>
+            <w:tcMar>
+              <w:top w:w="100" w:type="dxa"/>
+              <w:bottom w:w="100" w:type="dxa"/>
+              <w:left w:w="120" w:type="dxa"/>
+              <w:right w:w="120" w:type="dxa"/>
+            </w:tcMar>
+          </w:tcPr>
+          <w:p>
+            <w:r>
+              <w:rPr>
+                <w:b/>
+                <w:color w:val="FFFFFF"/>
+                <w:sz w:val="19"/>
+              </w:rPr>
+              <w:t>Type P (+ sur moi)</w:t>
+            </w:r>
+          </w:p>
+        </w:tc>
+        <w:tc>
+          <w:tcPr>
+            <w:tcW w:type="dxa" w:w="2329"/>
+            <w:shd w:val="clear" w:color="auto" w:fill="0284C7"/>
+            <w:tcMar>
+              <w:top w:w="100" w:type="dxa"/>
+              <w:bottom w:w="100" w:type="dxa"/>
+              <w:left w:w="120" w:type="dxa"/>
+              <w:right w:w="120" w:type="dxa"/>
+            </w:tcMar>
+          </w:tcPr>
+          <w:p>
+            <w:r>
+              <w:rPr>
+                <w:b/>
+                <w:color w:val="FFFFFF"/>
+                <w:sz w:val="19"/>
+              </w:rPr>
+              <w:t>Type T (+ sur l'autre)</w:t>
+            </w:r>
+          </w:p>
+        </w:tc>
+        <w:tc>
+          <w:tcPr>
+            <w:tcW w:type="dxa" w:w="2329"/>
+            <w:shd w:val="clear" w:color="auto" w:fill="0284C7"/>
+            <w:tcMar>
+              <w:top w:w="100" w:type="dxa"/>
+              <w:bottom w:w="100" w:type="dxa"/>
+              <w:left w:w="120" w:type="dxa"/>
+              <w:right w:w="120" w:type="dxa"/>
+            </w:tcMar>
+          </w:tcPr>
+          <w:p>
+            <w:r>
+              <w:rPr>
+                <w:b/>
+                <w:color w:val="FFFFFF"/>
+                <w:sz w:val="19"/>
+              </w:rPr>
+              <w:t>Mode &amp; Paramètres</w:t>
+            </w:r>
+          </w:p>
+        </w:tc>
+      </w:tr>
+      <w:tr>
+        <w:tc>
+          <w:tcPr>
+            <w:tcW w:type="dxa" w:w="2329"/>
+            <w:shd w:val="clear" w:color="auto" w:fill="F8FAFC"/>
+            <w:tcMar>
+              <w:top w:w="80" w:type="dxa"/>
+              <w:bottom w:w="80" w:type="dxa"/>
+              <w:left w:w="100" w:type="dxa"/>
+              <w:right w:w="100" w:type="dxa"/>
+            </w:tcMar>
+          </w:tcPr>
+          <w:p>
+            <w:r>
+              <w:rPr>
+                <w:color w:val="1E293B"/>
+                <w:sz w:val="18"/>
+              </w:rPr>
+              <w:t>Stature &amp; Taille</w:t>
+            </w:r>
+          </w:p>
+        </w:tc>
+        <w:tc>
+          <w:tcPr>
+            <w:tcW w:type="dxa" w:w="2329"/>
+            <w:shd w:val="clear" w:color="auto" w:fill="F8FAFC"/>
+            <w:tcMar>
+              <w:top w:w="80" w:type="dxa"/>
+              <w:bottom w:w="80" w:type="dxa"/>
+              <w:left w:w="100" w:type="dxa"/>
+              <w:right w:w="100" w:type="dxa"/>
+            </w:tcMar>
+          </w:tcPr>
+          <w:p>
+            <w:r>
+              <w:rPr>
+                <w:color w:val="1E293B"/>
+                <w:sz w:val="18"/>
+              </w:rPr>
+              <w:t>Q 80001 (cm exacts)</w:t>
+            </w:r>
+          </w:p>
+        </w:tc>
+        <w:tc>
+          <w:tcPr>
+            <w:tcW w:type="dxa" w:w="2329"/>
+            <w:shd w:val="clear" w:color="auto" w:fill="F8FAFC"/>
+            <w:tcMar>
+              <w:top w:w="80" w:type="dxa"/>
+              <w:bottom w:w="80" w:type="dxa"/>
+              <w:left w:w="100" w:type="dxa"/>
+              <w:right w:w="100" w:type="dxa"/>
+            </w:tcMar>
+          </w:tcPr>
+          <w:p>
+            <w:r>
+              <w:rPr>
+                <w:color w:val="1E293B"/>
+                <w:sz w:val="18"/>
+              </w:rPr>
+              <w:t>Q 85001 (tolérance)</w:t>
+            </w:r>
+          </w:p>
+        </w:tc>
+        <w:tc>
+          <w:tcPr>
+            <w:tcW w:type="dxa" w:w="2329"/>
+            <w:shd w:val="clear" w:color="auto" w:fill="F8FAFC"/>
+            <w:tcMar>
+              <w:top w:w="80" w:type="dxa"/>
+              <w:bottom w:w="80" w:type="dxa"/>
+              <w:left w:w="100" w:type="dxa"/>
+              <w:right w:w="100" w:type="dxa"/>
+            </w:tcMar>
+          </w:tcPr>
+          <w:p>
+            <w:r>
+              <w:rPr>
+                <w:color w:val="1E293B"/>
+                <w:sz w:val="18"/>
+              </w:rPr>
+              <w:t>Numérique : Plage Min/Max en cm [100 - 230]</w:t>
+            </w:r>
+          </w:p>
+        </w:tc>
+      </w:tr>
+      <w:tr>
+        <w:tc>
+          <w:tcPr>
+            <w:tcW w:type="dxa" w:w="2329"/>
+            <w:shd w:val="clear" w:color="auto" w:fill="FFFFFF"/>
+            <w:tcMar>
+              <w:top w:w="80" w:type="dxa"/>
+              <w:bottom w:w="80" w:type="dxa"/>
+              <w:left w:w="100" w:type="dxa"/>
+              <w:right w:w="100" w:type="dxa"/>
+            </w:tcMar>
+          </w:tcPr>
+          <w:p>
+            <w:r>
+              <w:rPr>
+                <w:color w:val="1E293B"/>
+                <w:sz w:val="18"/>
+              </w:rPr>
+              <w:t>Corpulence &amp; Poids</w:t>
+            </w:r>
+          </w:p>
+        </w:tc>
+        <w:tc>
+          <w:tcPr>
+            <w:tcW w:type="dxa" w:w="2329"/>
+            <w:shd w:val="clear" w:color="auto" w:fill="FFFFFF"/>
+            <w:tcMar>
+              <w:top w:w="80" w:type="dxa"/>
+              <w:bottom w:w="80" w:type="dxa"/>
+              <w:left w:w="100" w:type="dxa"/>
+              <w:right w:w="100" w:type="dxa"/>
+            </w:tcMar>
+          </w:tcPr>
+          <w:p>
+            <w:r>
+              <w:rPr>
+                <w:color w:val="1E293B"/>
+                <w:sz w:val="18"/>
+              </w:rPr>
+              <w:t>Q 80002 (kg exacts)</w:t>
+            </w:r>
+          </w:p>
+        </w:tc>
+        <w:tc>
+          <w:tcPr>
+            <w:tcW w:type="dxa" w:w="2329"/>
+            <w:shd w:val="clear" w:color="auto" w:fill="FFFFFF"/>
+            <w:tcMar>
+              <w:top w:w="80" w:type="dxa"/>
+              <w:bottom w:w="80" w:type="dxa"/>
+              <w:left w:w="100" w:type="dxa"/>
+              <w:right w:w="100" w:type="dxa"/>
+            </w:tcMar>
+          </w:tcPr>
+          <w:p>
+            <w:r>
+              <w:rPr>
+                <w:color w:val="1E293B"/>
+                <w:sz w:val="18"/>
+              </w:rPr>
+              <w:t>Q 85002 (tolérance)</w:t>
+            </w:r>
+          </w:p>
+        </w:tc>
+        <w:tc>
+          <w:tcPr>
+            <w:tcW w:type="dxa" w:w="2329"/>
+            <w:shd w:val="clear" w:color="auto" w:fill="FFFFFF"/>
+            <w:tcMar>
+              <w:top w:w="80" w:type="dxa"/>
+              <w:bottom w:w="80" w:type="dxa"/>
+              <w:left w:w="100" w:type="dxa"/>
+              <w:right w:w="100" w:type="dxa"/>
+            </w:tcMar>
+          </w:tcPr>
+          <w:p>
+            <w:r>
+              <w:rPr>
+                <w:color w:val="1E293B"/>
+                <w:sz w:val="18"/>
+              </w:rPr>
+              <w:t>Numérique : Plage Min/Max en kg [35 - 200]</w:t>
+            </w:r>
+          </w:p>
+        </w:tc>
+      </w:tr>
+      <w:tr>
+        <w:tc>
+          <w:tcPr>
+            <w:tcW w:type="dxa" w:w="2329"/>
+            <w:shd w:val="clear" w:color="auto" w:fill="F8FAFC"/>
+            <w:tcMar>
+              <w:top w:w="80" w:type="dxa"/>
+              <w:bottom w:w="80" w:type="dxa"/>
+              <w:left w:w="100" w:type="dxa"/>
+              <w:right w:w="100" w:type="dxa"/>
+            </w:tcMar>
+          </w:tcPr>
+          <w:p>
+            <w:r>
+              <w:rPr>
+                <w:color w:val="1E293B"/>
+                <w:sz w:val="18"/>
+              </w:rPr>
+              <w:t>Morphologie &amp; Silhouette</w:t>
+            </w:r>
+          </w:p>
+        </w:tc>
+        <w:tc>
+          <w:tcPr>
+            <w:tcW w:type="dxa" w:w="2329"/>
+            <w:shd w:val="clear" w:color="auto" w:fill="F8FAFC"/>
+            <w:tcMar>
+              <w:top w:w="80" w:type="dxa"/>
+              <w:bottom w:w="80" w:type="dxa"/>
+              <w:left w:w="100" w:type="dxa"/>
+              <w:right w:w="100" w:type="dxa"/>
+            </w:tcMar>
+          </w:tcPr>
+          <w:p>
+            <w:r>
+              <w:rPr>
+                <w:color w:val="1E293B"/>
+                <w:sz w:val="18"/>
+              </w:rPr>
+              <w:t>Q 80003 (select)</w:t>
+            </w:r>
+          </w:p>
+        </w:tc>
+        <w:tc>
+          <w:tcPr>
+            <w:tcW w:type="dxa" w:w="2329"/>
+            <w:shd w:val="clear" w:color="auto" w:fill="F8FAFC"/>
+            <w:tcMar>
+              <w:top w:w="80" w:type="dxa"/>
+              <w:bottom w:w="80" w:type="dxa"/>
+              <w:left w:w="100" w:type="dxa"/>
+              <w:right w:w="100" w:type="dxa"/>
+            </w:tcMar>
+          </w:tcPr>
+          <w:p>
+            <w:r>
+              <w:rPr>
+                <w:color w:val="1E293B"/>
+                <w:sz w:val="18"/>
+              </w:rPr>
+              <w:t>Q 85003 (options)</w:t>
+            </w:r>
+          </w:p>
+        </w:tc>
+        <w:tc>
+          <w:tcPr>
+            <w:tcW w:type="dxa" w:w="2329"/>
+            <w:shd w:val="clear" w:color="auto" w:fill="F8FAFC"/>
+            <w:tcMar>
+              <w:top w:w="80" w:type="dxa"/>
+              <w:bottom w:w="80" w:type="dxa"/>
+              <w:left w:w="100" w:type="dxa"/>
+              <w:right w:w="100" w:type="dxa"/>
+            </w:tcMar>
+          </w:tcPr>
+          <w:p>
+            <w:r>
+              <w:rPr>
+                <w:color w:val="1E293B"/>
+                <w:sz w:val="18"/>
+              </w:rPr>
+              <w:t>Liste : Mince, Sportive, Élancée, Normale, Ronde, Musclée...</w:t>
+            </w:r>
+          </w:p>
+        </w:tc>
+      </w:tr>
+      <w:tr>
+        <w:tc>
+          <w:tcPr>
+            <w:tcW w:type="dxa" w:w="2329"/>
+            <w:shd w:val="clear" w:color="auto" w:fill="FFFFFF"/>
+            <w:tcMar>
+              <w:top w:w="80" w:type="dxa"/>
+              <w:bottom w:w="80" w:type="dxa"/>
+              <w:left w:w="100" w:type="dxa"/>
+              <w:right w:w="100" w:type="dxa"/>
+            </w:tcMar>
+          </w:tcPr>
+          <w:p>
+            <w:r>
+              <w:rPr>
+                <w:color w:val="1E293B"/>
+                <w:sz w:val="18"/>
+              </w:rPr>
+              <w:t>Tour de poitrine (F)</w:t>
+            </w:r>
+          </w:p>
+        </w:tc>
+        <w:tc>
+          <w:tcPr>
+            <w:tcW w:type="dxa" w:w="2329"/>
+            <w:shd w:val="clear" w:color="auto" w:fill="FFFFFF"/>
+            <w:tcMar>
+              <w:top w:w="80" w:type="dxa"/>
+              <w:bottom w:w="80" w:type="dxa"/>
+              <w:left w:w="100" w:type="dxa"/>
+              <w:right w:w="100" w:type="dxa"/>
+            </w:tcMar>
+          </w:tcPr>
+          <w:p>
+            <w:r>
+              <w:rPr>
+                <w:color w:val="1E293B"/>
+                <w:sz w:val="18"/>
+              </w:rPr>
+              <w:t>Q 80004 (cm exacts)</w:t>
+            </w:r>
+          </w:p>
+        </w:tc>
+        <w:tc>
+          <w:tcPr>
+            <w:tcW w:type="dxa" w:w="2329"/>
+            <w:shd w:val="clear" w:color="auto" w:fill="FFFFFF"/>
+            <w:tcMar>
+              <w:top w:w="80" w:type="dxa"/>
+              <w:bottom w:w="80" w:type="dxa"/>
+              <w:left w:w="100" w:type="dxa"/>
+              <w:right w:w="100" w:type="dxa"/>
+            </w:tcMar>
+          </w:tcPr>
+          <w:p>
+            <w:r>
+              <w:rPr>
+                <w:color w:val="1E293B"/>
+                <w:sz w:val="18"/>
+              </w:rPr>
+              <w:t>Q 85004 (tolérance H)</w:t>
+            </w:r>
+          </w:p>
+        </w:tc>
+        <w:tc>
+          <w:tcPr>
+            <w:tcW w:type="dxa" w:w="2329"/>
+            <w:shd w:val="clear" w:color="auto" w:fill="FFFFFF"/>
+            <w:tcMar>
+              <w:top w:w="80" w:type="dxa"/>
+              <w:bottom w:w="80" w:type="dxa"/>
+              <w:left w:w="100" w:type="dxa"/>
+              <w:right w:w="100" w:type="dxa"/>
+            </w:tcMar>
+          </w:tcPr>
+          <w:p>
+            <w:r>
+              <w:rPr>
+                <w:color w:val="1E293B"/>
+                <w:sz w:val="18"/>
+              </w:rPr>
+              <w:t>Numérique : Plage Min/Max en cm [50 - 160]</w:t>
+            </w:r>
+          </w:p>
+        </w:tc>
+      </w:tr>
+      <w:tr>
+        <w:tc>
+          <w:tcPr>
+            <w:tcW w:type="dxa" w:w="2329"/>
+            <w:shd w:val="clear" w:color="auto" w:fill="F8FAFC"/>
+            <w:tcMar>
+              <w:top w:w="80" w:type="dxa"/>
+              <w:bottom w:w="80" w:type="dxa"/>
+              <w:left w:w="100" w:type="dxa"/>
+              <w:right w:w="100" w:type="dxa"/>
+            </w:tcMar>
+          </w:tcPr>
+          <w:p>
+            <w:r>
+              <w:rPr>
+                <w:color w:val="1E293B"/>
+                <w:sz w:val="18"/>
+              </w:rPr>
+              <w:t>Bonnet de poitrine (F)</w:t>
+            </w:r>
+          </w:p>
+        </w:tc>
+        <w:tc>
+          <w:tcPr>
+            <w:tcW w:type="dxa" w:w="2329"/>
+            <w:shd w:val="clear" w:color="auto" w:fill="F8FAFC"/>
+            <w:tcMar>
+              <w:top w:w="80" w:type="dxa"/>
+              <w:bottom w:w="80" w:type="dxa"/>
+              <w:left w:w="100" w:type="dxa"/>
+              <w:right w:w="100" w:type="dxa"/>
+            </w:tcMar>
+          </w:tcPr>
+          <w:p>
+            <w:r>
+              <w:rPr>
+                <w:color w:val="1E293B"/>
+                <w:sz w:val="18"/>
+              </w:rPr>
+              <w:t>Q 80005 (select)</w:t>
+            </w:r>
+          </w:p>
+        </w:tc>
+        <w:tc>
+          <w:tcPr>
+            <w:tcW w:type="dxa" w:w="2329"/>
+            <w:shd w:val="clear" w:color="auto" w:fill="F8FAFC"/>
+            <w:tcMar>
+              <w:top w:w="80" w:type="dxa"/>
+              <w:bottom w:w="80" w:type="dxa"/>
+              <w:left w:w="100" w:type="dxa"/>
+              <w:right w:w="100" w:type="dxa"/>
+            </w:tcMar>
+          </w:tcPr>
+          <w:p>
+            <w:r>
+              <w:rPr>
+                <w:color w:val="1E293B"/>
+                <w:sz w:val="18"/>
+              </w:rPr>
+              <w:t>Q 85005 (options H)</w:t>
+            </w:r>
+          </w:p>
+        </w:tc>
+        <w:tc>
+          <w:tcPr>
+            <w:tcW w:type="dxa" w:w="2329"/>
+            <w:shd w:val="clear" w:color="auto" w:fill="F8FAFC"/>
+            <w:tcMar>
+              <w:top w:w="80" w:type="dxa"/>
+              <w:bottom w:w="80" w:type="dxa"/>
+              <w:left w:w="100" w:type="dxa"/>
+              <w:right w:w="100" w:type="dxa"/>
+            </w:tcMar>
+          </w:tcPr>
+          <w:p>
+            <w:r>
+              <w:rPr>
+                <w:color w:val="1E293B"/>
+                <w:sz w:val="18"/>
+              </w:rPr>
+              <w:t>Liste : A, B, C, D, E, F+</w:t>
+            </w:r>
+          </w:p>
+        </w:tc>
+      </w:tr>
+      <w:tr>
+        <w:tc>
+          <w:tcPr>
+            <w:tcW w:type="dxa" w:w="2329"/>
+            <w:shd w:val="clear" w:color="auto" w:fill="FFFFFF"/>
+            <w:tcMar>
+              <w:top w:w="80" w:type="dxa"/>
+              <w:bottom w:w="80" w:type="dxa"/>
+              <w:left w:w="100" w:type="dxa"/>
+              <w:right w:w="100" w:type="dxa"/>
+            </w:tcMar>
+          </w:tcPr>
+          <w:p>
+            <w:r>
+              <w:rPr>
+                <w:color w:val="1E293B"/>
+                <w:sz w:val="18"/>
+              </w:rPr>
+              <w:t>Pointure de chaussures</w:t>
+            </w:r>
+          </w:p>
+        </w:tc>
+        <w:tc>
+          <w:tcPr>
+            <w:tcW w:type="dxa" w:w="2329"/>
+            <w:shd w:val="clear" w:color="auto" w:fill="FFFFFF"/>
+            <w:tcMar>
+              <w:top w:w="80" w:type="dxa"/>
+              <w:bottom w:w="80" w:type="dxa"/>
+              <w:left w:w="100" w:type="dxa"/>
+              <w:right w:w="100" w:type="dxa"/>
+            </w:tcMar>
+          </w:tcPr>
+          <w:p>
+            <w:r>
+              <w:rPr>
+                <w:color w:val="1E293B"/>
+                <w:sz w:val="18"/>
+              </w:rPr>
+              <w:t>Q 80008 (taille)</w:t>
+            </w:r>
+          </w:p>
+        </w:tc>
+        <w:tc>
+          <w:tcPr>
+            <w:tcW w:type="dxa" w:w="2329"/>
+            <w:shd w:val="clear" w:color="auto" w:fill="FFFFFF"/>
+            <w:tcMar>
+              <w:top w:w="80" w:type="dxa"/>
+              <w:bottom w:w="80" w:type="dxa"/>
+              <w:left w:w="100" w:type="dxa"/>
+              <w:right w:w="100" w:type="dxa"/>
+            </w:tcMar>
+          </w:tcPr>
+          <w:p>
+            <w:r>
+              <w:rPr>
+                <w:color w:val="1E293B"/>
+                <w:sz w:val="18"/>
+              </w:rPr>
+              <w:t>Q 85008 (tolérance)</w:t>
+            </w:r>
+          </w:p>
+        </w:tc>
+        <w:tc>
+          <w:tcPr>
+            <w:tcW w:type="dxa" w:w="2329"/>
+            <w:shd w:val="clear" w:color="auto" w:fill="FFFFFF"/>
+            <w:tcMar>
+              <w:top w:w="80" w:type="dxa"/>
+              <w:bottom w:w="80" w:type="dxa"/>
+              <w:left w:w="100" w:type="dxa"/>
+              <w:right w:w="100" w:type="dxa"/>
+            </w:tcMar>
+          </w:tcPr>
+          <w:p>
+            <w:r>
+              <w:rPr>
+                <w:color w:val="1E293B"/>
+                <w:sz w:val="18"/>
+              </w:rPr>
+              <w:t>Numérique : Plage [32 - 50]</w:t>
+            </w:r>
+          </w:p>
+        </w:tc>
+      </w:tr>
+      <w:tr>
+        <w:tc>
+          <w:tcPr>
+            <w:tcW w:type="dxa" w:w="2329"/>
+            <w:shd w:val="clear" w:color="auto" w:fill="F8FAFC"/>
+            <w:tcMar>
+              <w:top w:w="80" w:type="dxa"/>
+              <w:bottom w:w="80" w:type="dxa"/>
+              <w:left w:w="100" w:type="dxa"/>
+              <w:right w:w="100" w:type="dxa"/>
+            </w:tcMar>
+          </w:tcPr>
+          <w:p>
+            <w:r>
+              <w:rPr>
+                <w:color w:val="1E293B"/>
+                <w:sz w:val="18"/>
+              </w:rPr>
+              <w:t>Couleur des yeux</w:t>
+            </w:r>
+          </w:p>
+        </w:tc>
+        <w:tc>
+          <w:tcPr>
+            <w:tcW w:type="dxa" w:w="2329"/>
+            <w:shd w:val="clear" w:color="auto" w:fill="F8FAFC"/>
+            <w:tcMar>
+              <w:top w:w="80" w:type="dxa"/>
+              <w:bottom w:w="80" w:type="dxa"/>
+              <w:left w:w="100" w:type="dxa"/>
+              <w:right w:w="100" w:type="dxa"/>
+            </w:tcMar>
+          </w:tcPr>
+          <w:p>
+            <w:r>
+              <w:rPr>
+                <w:color w:val="1E293B"/>
+                <w:sz w:val="18"/>
+              </w:rPr>
+              <w:t>Q 80009 (select)</w:t>
+            </w:r>
+          </w:p>
+        </w:tc>
+        <w:tc>
+          <w:tcPr>
+            <w:tcW w:type="dxa" w:w="2329"/>
+            <w:shd w:val="clear" w:color="auto" w:fill="F8FAFC"/>
+            <w:tcMar>
+              <w:top w:w="80" w:type="dxa"/>
+              <w:bottom w:w="80" w:type="dxa"/>
+              <w:left w:w="100" w:type="dxa"/>
+              <w:right w:w="100" w:type="dxa"/>
+            </w:tcMar>
+          </w:tcPr>
+          <w:p>
+            <w:r>
+              <w:rPr>
+                <w:color w:val="1E293B"/>
+                <w:sz w:val="18"/>
+              </w:rPr>
+              <w:t>Q 85009 (options)</w:t>
+            </w:r>
+          </w:p>
+        </w:tc>
+        <w:tc>
+          <w:tcPr>
+            <w:tcW w:type="dxa" w:w="2329"/>
+            <w:shd w:val="clear" w:color="auto" w:fill="F8FAFC"/>
+            <w:tcMar>
+              <w:top w:w="80" w:type="dxa"/>
+              <w:bottom w:w="80" w:type="dxa"/>
+              <w:left w:w="100" w:type="dxa"/>
+              <w:right w:w="100" w:type="dxa"/>
+            </w:tcMar>
+          </w:tcPr>
+          <w:p>
+            <w:r>
+              <w:rPr>
+                <w:color w:val="1E293B"/>
+                <w:sz w:val="18"/>
+              </w:rPr>
+              <w:t>Liste : Bleus, Verts, Marrons, Noirs, Noisette, Gris, Vairons</w:t>
+            </w:r>
+          </w:p>
+        </w:tc>
+      </w:tr>
+      <w:tr>
+        <w:tc>
+          <w:tcPr>
+            <w:tcW w:type="dxa" w:w="2329"/>
+            <w:shd w:val="clear" w:color="auto" w:fill="FFFFFF"/>
+            <w:tcMar>
+              <w:top w:w="80" w:type="dxa"/>
+              <w:bottom w:w="80" w:type="dxa"/>
+              <w:left w:w="100" w:type="dxa"/>
+              <w:right w:w="100" w:type="dxa"/>
+            </w:tcMar>
+          </w:tcPr>
+          <w:p>
+            <w:r>
+              <w:rPr>
+                <w:color w:val="1E293B"/>
+                <w:sz w:val="18"/>
+              </w:rPr>
+              <w:t>Couleur des cheveux</w:t>
+            </w:r>
+          </w:p>
+        </w:tc>
+        <w:tc>
+          <w:tcPr>
+            <w:tcW w:type="dxa" w:w="2329"/>
+            <w:shd w:val="clear" w:color="auto" w:fill="FFFFFF"/>
+            <w:tcMar>
+              <w:top w:w="80" w:type="dxa"/>
+              <w:bottom w:w="80" w:type="dxa"/>
+              <w:left w:w="100" w:type="dxa"/>
+              <w:right w:w="100" w:type="dxa"/>
+            </w:tcMar>
+          </w:tcPr>
+          <w:p>
+            <w:r>
+              <w:rPr>
+                <w:color w:val="1E293B"/>
+                <w:sz w:val="18"/>
+              </w:rPr>
+              <w:t>Q 80010 (select)</w:t>
+            </w:r>
+          </w:p>
+        </w:tc>
+        <w:tc>
+          <w:tcPr>
+            <w:tcW w:type="dxa" w:w="2329"/>
+            <w:shd w:val="clear" w:color="auto" w:fill="FFFFFF"/>
+            <w:tcMar>
+              <w:top w:w="80" w:type="dxa"/>
+              <w:bottom w:w="80" w:type="dxa"/>
+              <w:left w:w="100" w:type="dxa"/>
+              <w:right w:w="100" w:type="dxa"/>
+            </w:tcMar>
+          </w:tcPr>
+          <w:p>
+            <w:r>
+              <w:rPr>
+                <w:color w:val="1E293B"/>
+                <w:sz w:val="18"/>
+              </w:rPr>
+              <w:t>Q 85010 (options)</w:t>
+            </w:r>
+          </w:p>
+        </w:tc>
+        <w:tc>
+          <w:tcPr>
+            <w:tcW w:type="dxa" w:w="2329"/>
+            <w:shd w:val="clear" w:color="auto" w:fill="FFFFFF"/>
+            <w:tcMar>
+              <w:top w:w="80" w:type="dxa"/>
+              <w:bottom w:w="80" w:type="dxa"/>
+              <w:left w:w="100" w:type="dxa"/>
+              <w:right w:w="100" w:type="dxa"/>
+            </w:tcMar>
+          </w:tcPr>
+          <w:p>
+            <w:r>
+              <w:rPr>
+                <w:color w:val="1E293B"/>
+                <w:sz w:val="18"/>
+              </w:rPr>
+              <w:t>Liste : Bruns, Noirs, Châtains, Blonds, Roux, Gris, Chauve...</w:t>
+            </w:r>
+          </w:p>
+        </w:tc>
+      </w:tr>
+      <w:tr>
+        <w:tc>
+          <w:tcPr>
+            <w:tcW w:type="dxa" w:w="2329"/>
+            <w:shd w:val="clear" w:color="auto" w:fill="F8FAFC"/>
+            <w:tcMar>
+              <w:top w:w="80" w:type="dxa"/>
+              <w:bottom w:w="80" w:type="dxa"/>
+              <w:left w:w="100" w:type="dxa"/>
+              <w:right w:w="100" w:type="dxa"/>
+            </w:tcMar>
+          </w:tcPr>
+          <w:p>
+            <w:r>
+              <w:rPr>
+                <w:color w:val="1E293B"/>
+                <w:sz w:val="18"/>
+              </w:rPr>
+              <w:t>Longueur des cheveux</w:t>
+            </w:r>
+          </w:p>
+        </w:tc>
+        <w:tc>
+          <w:tcPr>
+            <w:tcW w:type="dxa" w:w="2329"/>
+            <w:shd w:val="clear" w:color="auto" w:fill="F8FAFC"/>
+            <w:tcMar>
+              <w:top w:w="80" w:type="dxa"/>
+              <w:bottom w:w="80" w:type="dxa"/>
+              <w:left w:w="100" w:type="dxa"/>
+              <w:right w:w="100" w:type="dxa"/>
+            </w:tcMar>
+          </w:tcPr>
+          <w:p>
+            <w:r>
+              <w:rPr>
+                <w:color w:val="1E293B"/>
+                <w:sz w:val="18"/>
+              </w:rPr>
+              <w:t>Q 80011 (select)</w:t>
+            </w:r>
+          </w:p>
+        </w:tc>
+        <w:tc>
+          <w:tcPr>
+            <w:tcW w:type="dxa" w:w="2329"/>
+            <w:shd w:val="clear" w:color="auto" w:fill="F8FAFC"/>
+            <w:tcMar>
+              <w:top w:w="80" w:type="dxa"/>
+              <w:bottom w:w="80" w:type="dxa"/>
+              <w:left w:w="100" w:type="dxa"/>
+              <w:right w:w="100" w:type="dxa"/>
+            </w:tcMar>
+          </w:tcPr>
+          <w:p>
+            <w:r>
+              <w:rPr>
+                <w:color w:val="1E293B"/>
+                <w:sz w:val="18"/>
+              </w:rPr>
+              <w:t>Q 85011 (options)</w:t>
+            </w:r>
+          </w:p>
+        </w:tc>
+        <w:tc>
+          <w:tcPr>
+            <w:tcW w:type="dxa" w:w="2329"/>
+            <w:shd w:val="clear" w:color="auto" w:fill="F8FAFC"/>
+            <w:tcMar>
+              <w:top w:w="80" w:type="dxa"/>
+              <w:bottom w:w="80" w:type="dxa"/>
+              <w:left w:w="100" w:type="dxa"/>
+              <w:right w:w="100" w:type="dxa"/>
+            </w:tcMar>
+          </w:tcPr>
+          <w:p>
+            <w:r>
+              <w:rPr>
+                <w:color w:val="1E293B"/>
+                <w:sz w:val="18"/>
+              </w:rPr>
+              <w:t>Liste : Très courts, Courts, Mi-longs, Longs, Très longs</w:t>
+            </w:r>
+          </w:p>
+        </w:tc>
+      </w:tr>
+      <w:tr>
+        <w:tc>
+          <w:tcPr>
+            <w:tcW w:type="dxa" w:w="2329"/>
+            <w:shd w:val="clear" w:color="auto" w:fill="FFFFFF"/>
+            <w:tcMar>
+              <w:top w:w="80" w:type="dxa"/>
+              <w:bottom w:w="80" w:type="dxa"/>
+              <w:left w:w="100" w:type="dxa"/>
+              <w:right w:w="100" w:type="dxa"/>
+            </w:tcMar>
+          </w:tcPr>
+          <w:p>
+            <w:r>
+              <w:rPr>
+                <w:color w:val="1E293B"/>
+                <w:sz w:val="18"/>
+              </w:rPr>
+              <w:t>Pilosité faciale (H)</w:t>
+            </w:r>
+          </w:p>
+        </w:tc>
+        <w:tc>
+          <w:tcPr>
+            <w:tcW w:type="dxa" w:w="2329"/>
+            <w:shd w:val="clear" w:color="auto" w:fill="FFFFFF"/>
+            <w:tcMar>
+              <w:top w:w="80" w:type="dxa"/>
+              <w:bottom w:w="80" w:type="dxa"/>
+              <w:left w:w="100" w:type="dxa"/>
+              <w:right w:w="100" w:type="dxa"/>
+            </w:tcMar>
+          </w:tcPr>
+          <w:p>
+            <w:r>
+              <w:rPr>
+                <w:color w:val="1E293B"/>
+                <w:sz w:val="18"/>
+              </w:rPr>
+              <w:t>Q 80012 (select)</w:t>
+            </w:r>
+          </w:p>
+        </w:tc>
+        <w:tc>
+          <w:tcPr>
+            <w:tcW w:type="dxa" w:w="2329"/>
+            <w:shd w:val="clear" w:color="auto" w:fill="FFFFFF"/>
+            <w:tcMar>
+              <w:top w:w="80" w:type="dxa"/>
+              <w:bottom w:w="80" w:type="dxa"/>
+              <w:left w:w="100" w:type="dxa"/>
+              <w:right w:w="100" w:type="dxa"/>
+            </w:tcMar>
+          </w:tcPr>
+          <w:p>
+            <w:r>
+              <w:rPr>
+                <w:color w:val="1E293B"/>
+                <w:sz w:val="18"/>
+              </w:rPr>
+              <w:t>Q 85012 (options F)</w:t>
+            </w:r>
+          </w:p>
+        </w:tc>
+        <w:tc>
+          <w:tcPr>
+            <w:tcW w:type="dxa" w:w="2329"/>
+            <w:shd w:val="clear" w:color="auto" w:fill="FFFFFF"/>
+            <w:tcMar>
+              <w:top w:w="80" w:type="dxa"/>
+              <w:bottom w:w="80" w:type="dxa"/>
+              <w:left w:w="100" w:type="dxa"/>
+              <w:right w:w="100" w:type="dxa"/>
+            </w:tcMar>
+          </w:tcPr>
+          <w:p>
+            <w:r>
+              <w:rPr>
+                <w:color w:val="1E293B"/>
+                <w:sz w:val="18"/>
+              </w:rPr>
+              <w:t>Liste : Rasé de près, Barbe courte, Barbe fournie, Moustache...</w:t>
+            </w:r>
+          </w:p>
+        </w:tc>
+      </w:tr>
+      <w:tr>
+        <w:tc>
+          <w:tcPr>
+            <w:tcW w:type="dxa" w:w="2329"/>
+            <w:shd w:val="clear" w:color="auto" w:fill="F8FAFC"/>
+            <w:tcMar>
+              <w:top w:w="80" w:type="dxa"/>
+              <w:bottom w:w="80" w:type="dxa"/>
+              <w:left w:w="100" w:type="dxa"/>
+              <w:right w:w="100" w:type="dxa"/>
+            </w:tcMar>
+          </w:tcPr>
+          <w:p>
+            <w:r>
+              <w:rPr>
+                <w:color w:val="1E293B"/>
+                <w:sz w:val="18"/>
+              </w:rPr>
+              <w:t>Style vestimentaire</w:t>
+            </w:r>
+          </w:p>
+        </w:tc>
+        <w:tc>
+          <w:tcPr>
+            <w:tcW w:type="dxa" w:w="2329"/>
+            <w:shd w:val="clear" w:color="auto" w:fill="F8FAFC"/>
+            <w:tcMar>
+              <w:top w:w="80" w:type="dxa"/>
+              <w:bottom w:w="80" w:type="dxa"/>
+              <w:left w:w="100" w:type="dxa"/>
+              <w:right w:w="100" w:type="dxa"/>
+            </w:tcMar>
+          </w:tcPr>
+          <w:p>
+            <w:r>
+              <w:rPr>
+                <w:color w:val="1E293B"/>
+                <w:sz w:val="18"/>
+              </w:rPr>
+              <w:t>Q 80013 (select)</w:t>
+            </w:r>
+          </w:p>
+        </w:tc>
+        <w:tc>
+          <w:tcPr>
+            <w:tcW w:type="dxa" w:w="2329"/>
+            <w:shd w:val="clear" w:color="auto" w:fill="F8FAFC"/>
+            <w:tcMar>
+              <w:top w:w="80" w:type="dxa"/>
+              <w:bottom w:w="80" w:type="dxa"/>
+              <w:left w:w="100" w:type="dxa"/>
+              <w:right w:w="100" w:type="dxa"/>
+            </w:tcMar>
+          </w:tcPr>
+          <w:p>
+            <w:r>
+              <w:rPr>
+                <w:color w:val="1E293B"/>
+                <w:sz w:val="18"/>
+              </w:rPr>
+              <w:t>Q 85013 (options)</w:t>
+            </w:r>
+          </w:p>
+        </w:tc>
+        <w:tc>
+          <w:tcPr>
+            <w:tcW w:type="dxa" w:w="2329"/>
+            <w:shd w:val="clear" w:color="auto" w:fill="F8FAFC"/>
+            <w:tcMar>
+              <w:top w:w="80" w:type="dxa"/>
+              <w:bottom w:w="80" w:type="dxa"/>
+              <w:left w:w="100" w:type="dxa"/>
+              <w:right w:w="100" w:type="dxa"/>
+            </w:tcMar>
+          </w:tcPr>
+          <w:p>
+            <w:r>
+              <w:rPr>
+                <w:color w:val="1E293B"/>
+                <w:sz w:val="18"/>
+              </w:rPr>
+              <w:t>Liste : Décontracté, Élégant, Chic, Sportswear, Streetwear, Rock...</w:t>
+            </w:r>
+          </w:p>
+        </w:tc>
+      </w:tr>
+      <w:tr>
+        <w:tc>
+          <w:tcPr>
+            <w:tcW w:type="dxa" w:w="2329"/>
+            <w:shd w:val="clear" w:color="auto" w:fill="FFFFFF"/>
+            <w:tcMar>
+              <w:top w:w="80" w:type="dxa"/>
+              <w:bottom w:w="80" w:type="dxa"/>
+              <w:left w:w="100" w:type="dxa"/>
+              <w:right w:w="100" w:type="dxa"/>
+            </w:tcMar>
+          </w:tcPr>
+          <w:p>
+            <w:r>
+              <w:rPr>
+                <w:color w:val="1E293B"/>
+                <w:sz w:val="18"/>
+              </w:rPr>
+              <w:t>Origines culturelles</w:t>
+            </w:r>
+          </w:p>
+        </w:tc>
+        <w:tc>
+          <w:tcPr>
+            <w:tcW w:type="dxa" w:w="2329"/>
+            <w:shd w:val="clear" w:color="auto" w:fill="FFFFFF"/>
+            <w:tcMar>
+              <w:top w:w="80" w:type="dxa"/>
+              <w:bottom w:w="80" w:type="dxa"/>
+              <w:left w:w="100" w:type="dxa"/>
+              <w:right w:w="100" w:type="dxa"/>
+            </w:tcMar>
+          </w:tcPr>
+          <w:p>
+            <w:r>
+              <w:rPr>
+                <w:color w:val="1E293B"/>
+                <w:sz w:val="18"/>
+              </w:rPr>
+              <w:t>Q 80014 (select)</w:t>
+            </w:r>
+          </w:p>
+        </w:tc>
+        <w:tc>
+          <w:tcPr>
+            <w:tcW w:type="dxa" w:w="2329"/>
+            <w:shd w:val="clear" w:color="auto" w:fill="FFFFFF"/>
+            <w:tcMar>
+              <w:top w:w="80" w:type="dxa"/>
+              <w:bottom w:w="80" w:type="dxa"/>
+              <w:left w:w="100" w:type="dxa"/>
+              <w:right w:w="100" w:type="dxa"/>
+            </w:tcMar>
+          </w:tcPr>
+          <w:p>
+            <w:r>
+              <w:rPr>
+                <w:color w:val="1E293B"/>
+                <w:sz w:val="18"/>
+              </w:rPr>
+              <w:t>Q 85014 (options)</w:t>
+            </w:r>
+          </w:p>
+        </w:tc>
+        <w:tc>
+          <w:tcPr>
+            <w:tcW w:type="dxa" w:w="2329"/>
+            <w:shd w:val="clear" w:color="auto" w:fill="FFFFFF"/>
+            <w:tcMar>
+              <w:top w:w="80" w:type="dxa"/>
+              <w:bottom w:w="80" w:type="dxa"/>
+              <w:left w:w="100" w:type="dxa"/>
+              <w:right w:w="100" w:type="dxa"/>
+            </w:tcMar>
+          </w:tcPr>
+          <w:p>
+            <w:r>
+              <w:rPr>
+                <w:color w:val="1E293B"/>
+                <w:sz w:val="18"/>
+              </w:rPr>
+              <w:t>Liste : Caucasien, Méditerranéen, Maghrébin, Africain, Asiatique...</w:t>
+            </w:r>
+          </w:p>
+        </w:tc>
+      </w:tr>
+      <w:tr>
+        <w:tc>
+          <w:tcPr>
+            <w:tcW w:type="dxa" w:w="2329"/>
+            <w:shd w:val="clear" w:color="auto" w:fill="F8FAFC"/>
+            <w:tcMar>
+              <w:top w:w="80" w:type="dxa"/>
+              <w:bottom w:w="80" w:type="dxa"/>
+              <w:left w:w="100" w:type="dxa"/>
+              <w:right w:w="100" w:type="dxa"/>
+            </w:tcMar>
+          </w:tcPr>
+          <w:p>
+            <w:r>
+              <w:rPr>
+                <w:color w:val="1E293B"/>
+                <w:sz w:val="18"/>
+              </w:rPr>
+              <w:t>Rythme de vie</w:t>
+            </w:r>
+          </w:p>
+        </w:tc>
+        <w:tc>
+          <w:tcPr>
+            <w:tcW w:type="dxa" w:w="2329"/>
+            <w:shd w:val="clear" w:color="auto" w:fill="F8FAFC"/>
+            <w:tcMar>
+              <w:top w:w="80" w:type="dxa"/>
+              <w:bottom w:w="80" w:type="dxa"/>
+              <w:left w:w="100" w:type="dxa"/>
+              <w:right w:w="100" w:type="dxa"/>
+            </w:tcMar>
+          </w:tcPr>
+          <w:p>
+            <w:r>
+              <w:rPr>
+                <w:color w:val="1E293B"/>
+                <w:sz w:val="18"/>
+              </w:rPr>
+              <w:t>Q 80015 (select)</w:t>
+            </w:r>
+          </w:p>
+        </w:tc>
+        <w:tc>
+          <w:tcPr>
+            <w:tcW w:type="dxa" w:w="2329"/>
+            <w:shd w:val="clear" w:color="auto" w:fill="F8FAFC"/>
+            <w:tcMar>
+              <w:top w:w="80" w:type="dxa"/>
+              <w:bottom w:w="80" w:type="dxa"/>
+              <w:left w:w="100" w:type="dxa"/>
+              <w:right w:w="100" w:type="dxa"/>
+            </w:tcMar>
+          </w:tcPr>
+          <w:p>
+            <w:r>
+              <w:rPr>
+                <w:color w:val="1E293B"/>
+                <w:sz w:val="18"/>
+              </w:rPr>
+              <w:t>Q 85015 (options)</w:t>
+            </w:r>
+          </w:p>
+        </w:tc>
+        <w:tc>
+          <w:tcPr>
+            <w:tcW w:type="dxa" w:w="2329"/>
+            <w:shd w:val="clear" w:color="auto" w:fill="F8FAFC"/>
+            <w:tcMar>
+              <w:top w:w="80" w:type="dxa"/>
+              <w:bottom w:w="80" w:type="dxa"/>
+              <w:left w:w="100" w:type="dxa"/>
+              <w:right w:w="100" w:type="dxa"/>
+            </w:tcMar>
+          </w:tcPr>
+          <w:p>
+            <w:r>
+              <w:rPr>
+                <w:color w:val="1E293B"/>
+                <w:sz w:val="18"/>
+              </w:rPr>
+              <w:t>Liste : Diurne/Matinal, Noctambule, Variable/Flexible...</w:t>
+            </w:r>
+          </w:p>
+        </w:tc>
+      </w:tr>
+      <w:tr>
+        <w:tc>
+          <w:tcPr>
+            <w:tcW w:type="dxa" w:w="2329"/>
+            <w:shd w:val="clear" w:color="auto" w:fill="FFFFFF"/>
+            <w:tcMar>
+              <w:top w:w="80" w:type="dxa"/>
+              <w:bottom w:w="80" w:type="dxa"/>
+              <w:left w:w="100" w:type="dxa"/>
+              <w:right w:w="100" w:type="dxa"/>
+            </w:tcMar>
+          </w:tcPr>
+          <w:p>
+            <w:r>
+              <w:rPr>
+                <w:color w:val="1E293B"/>
+                <w:sz w:val="18"/>
+              </w:rPr>
+              <w:t>Cadre de vie privilégié</w:t>
+            </w:r>
+          </w:p>
+        </w:tc>
+        <w:tc>
+          <w:tcPr>
+            <w:tcW w:type="dxa" w:w="2329"/>
+            <w:shd w:val="clear" w:color="auto" w:fill="FFFFFF"/>
+            <w:tcMar>
+              <w:top w:w="80" w:type="dxa"/>
+              <w:bottom w:w="80" w:type="dxa"/>
+              <w:left w:w="100" w:type="dxa"/>
+              <w:right w:w="100" w:type="dxa"/>
+            </w:tcMar>
+          </w:tcPr>
+          <w:p>
+            <w:r>
+              <w:rPr>
+                <w:color w:val="1E293B"/>
+                <w:sz w:val="18"/>
+              </w:rPr>
+              <w:t>Q 80016 (select)</w:t>
+            </w:r>
+          </w:p>
+        </w:tc>
+        <w:tc>
+          <w:tcPr>
+            <w:tcW w:type="dxa" w:w="2329"/>
+            <w:shd w:val="clear" w:color="auto" w:fill="FFFFFF"/>
+            <w:tcMar>
+              <w:top w:w="80" w:type="dxa"/>
+              <w:bottom w:w="80" w:type="dxa"/>
+              <w:left w:w="100" w:type="dxa"/>
+              <w:right w:w="100" w:type="dxa"/>
+            </w:tcMar>
+          </w:tcPr>
+          <w:p>
+            <w:r>
+              <w:rPr>
+                <w:color w:val="1E293B"/>
+                <w:sz w:val="18"/>
+              </w:rPr>
+              <w:t>Q 85016 (options)</w:t>
+            </w:r>
+          </w:p>
+        </w:tc>
+        <w:tc>
+          <w:tcPr>
+            <w:tcW w:type="dxa" w:w="2329"/>
+            <w:shd w:val="clear" w:color="auto" w:fill="FFFFFF"/>
+            <w:tcMar>
+              <w:top w:w="80" w:type="dxa"/>
+              <w:bottom w:w="80" w:type="dxa"/>
+              <w:left w:w="100" w:type="dxa"/>
+              <w:right w:w="100" w:type="dxa"/>
+            </w:tcMar>
+          </w:tcPr>
+          <w:p>
+            <w:r>
+              <w:rPr>
+                <w:color w:val="1E293B"/>
+                <w:sz w:val="18"/>
+              </w:rPr>
+              <w:t>Liste : Grande métropole, Ville moyenne, Village, Pleine nature...</w:t>
+            </w:r>
+          </w:p>
+        </w:tc>
+      </w:tr>
+    </w:tbl>
+    <w:p>
+      <w:r>
+        <w:rPr>
+          <w:lang w:val="fr-FR"/>
+        </w:rPr>
+        <w:br w:type="page"/>
+      </w:r>
+    </w:p>
+    <w:p>
+      <w:pPr>
+        <w:spacing w:before="240" w:after="120"/>
+      </w:pPr>
+      <w:r>
+        <w:rPr>
+          <w:b/>
+          <w:color w:val="0E7490"/>
+          <w:sz w:val="28"/>
+          <w:lang w:val="fr-FR"/>
+        </w:rPr>
+        <w:t>5. DIAGNOSTIC PRÉALABLE DE COMPATIBILITÉ IDENTITÉ (MOI &amp; L'AUTRE)</w:t>
+      </w:r>
+    </w:p>
+    <w:p>
+      <w:r>
+        <w:rPr>
+          <w:lang w:val="fr-FR"/>
+        </w:rPr>
+        <w:t>Conformément aux directives de conception, un diagnostic de compatibilité d'identité est exécuté EN PRÉALABLE à tout calcul de match. Il permet de détecter immédiatement si deux profils correspondent physiquement et stylistiquement à leurs souhaits respectifs.</w:t>
+      </w:r>
+    </w:p>
+    <w:p>
+      <w:r>
+        <w:rPr>
+          <w:lang w:val="fr-FR"/>
+        </w:rPr>
+        <w:t>L'algorithme 'evaluate_identity_compatibility(profile1_id, profile2_id)' réalise un contrôle croisé complet :</w:t>
       </w:r>
     </w:p>
     <w:p>
@@ -646,11 +2321,15 @@
       <w:r>
         <w:rPr>
           <w:b/>
+          <w:lang w:val="fr-FR"/>
         </w:rPr>
-        <w:t xml:space="preserve">POST /api/answers/batch : </w:t>
+        <w:t xml:space="preserve">Sens 1 (Attentes de P1 envers P2) : </w:t>
       </w:r>
       <w:r>
-        <w:t>Enregistre en lot les réponses aux questionnaires thématiques.</w:t>
+        <w:rPr>
+          <w:lang w:val="fr-FR"/>
+        </w:rPr>
+        <w:t>Les critères tolérés de P1 (+ sur l'autre) sont confrontés aux valeurs déclarées de P2 (+ sur moi, avec repli sur la fiche d'identité).</w:t>
       </w:r>
     </w:p>
     <w:p>
@@ -660,11 +2339,15 @@
       <w:r>
         <w:rPr>
           <w:b/>
+          <w:lang w:val="fr-FR"/>
         </w:rPr>
-        <w:t xml:space="preserve">POST /api/identity/self : </w:t>
+        <w:t xml:space="preserve">Sens 2 (Attentes de P2 envers P1) : </w:t>
       </w:r>
       <w:r>
-        <w:t>Enregistre les caractéristiques personnelles (+ sur moi).</w:t>
+        <w:rPr>
+          <w:lang w:val="fr-FR"/>
+        </w:rPr>
+        <w:t>De façon symétrique, les critères tolérés de P2 sont confrontés aux valeurs déclarées de P1.</w:t>
       </w:r>
     </w:p>
     <w:p>
@@ -674,11 +2357,15 @@
       <w:r>
         <w:rPr>
           <w:b/>
+          <w:lang w:val="fr-FR"/>
         </w:rPr>
-        <w:t xml:space="preserve">POST /api/identity/partner : </w:t>
+        <w:t xml:space="preserve">Règle de l'Indifférence : </w:t>
       </w:r>
       <w:r>
-        <w:t>Enregistre les critères et tolérances partenaires (+ sur l'autre).</w:t>
+        <w:rPr>
+          <w:lang w:val="fr-FR"/>
+        </w:rPr>
+        <w:t>Si un profil a coché 'Indifférent' sur une dimension, le critère est systématiquement validé comme COMPATIBLE sans restriction.</w:t>
       </w:r>
     </w:p>
     <w:p>
@@ -688,11 +2375,15 @@
       <w:r>
         <w:rPr>
           <w:b/>
+          <w:lang w:val="fr-FR"/>
         </w:rPr>
-        <w:t xml:space="preserve">POST /api/affinity : </w:t>
+        <w:t xml:space="preserve">Contrôle Numérique &amp; Liste : </w:t>
       </w:r>
       <w:r>
-        <w:t>Calcule le score d'affinité bilatéral entre deux profils : { profile1_id, profile2_id }.</w:t>
+        <w:rPr>
+          <w:lang w:val="fr-FR"/>
+        </w:rPr>
+        <w:t>Pour les dimensions numériques (stature, corpulence, mensurations), la valeur doit être comprise dans l'intervalle [min_val, max_val]. Pour les sélections, la valeur textuelle doit être présente dans les options tolérées.</w:t>
       </w:r>
     </w:p>
     <w:p>
@@ -702,107 +2393,37 @@
       <w:r>
         <w:rPr>
           <w:b/>
+          <w:lang w:val="fr-FR"/>
         </w:rPr>
-        <w:t xml:space="preserve">GET /api/system/storage : </w:t>
+        <w:t xml:space="preserve">Verdicts &amp; Restitution : </w:t>
       </w:r>
       <w:r>
-        <w:t>Diagnostic système : indique l'emplacement de la base et la présence du disque persistant.</w:t>
+        <w:rPr>
+          <w:lang w:val="fr-FR"/>
+        </w:rPr>
+        <w:t>L'algorithme renvoie un niveau synthétique : 'COMPATIBLE' (0 divergence), 'PARTIEL' (divergences mineures), 'INCOMPATIBLE' (divergences majeures) ou 'NON_EVALUE' (aucun critère restrictif défini). Ce diagnostic est affiché à la fois en temps réel dans l'aperçu préalable du profil cible et en première section des résultats de match.</w:t>
       </w:r>
     </w:p>
     <w:p>
       <w:pPr>
-        <w:spacing w:before="400" w:after="120"/>
+        <w:spacing w:before="280" w:after="120"/>
       </w:pPr>
       <w:r>
         <w:rPr>
-          <w:rFonts w:ascii="Segoe UI" w:hAnsi="Segoe UI"/>
           <w:b/>
-          <w:color w:val="1E3A8A"/>
+          <w:color w:val="0E7490"/>
           <w:sz w:val="28"/>
+          <w:lang w:val="fr-FR"/>
         </w:rPr>
-        <w:t>4. ALGORITHME DE CALCUL D'AFFINITÉ ÉLECTIVE</w:t>
+        <w:t>6. MOTEUR DE CALCUL D'AFFINITÉ ÉLECTIVE (ALGORITHME V-A-D-P)</w:t>
       </w:r>
     </w:p>
     <w:p>
       <w:r>
-        <w:t>L'algorithme Affinity calcule un indice de proximité global pondéré compris entre 0% et 100% :</w:t>
-        <w:br/>
-        <w:t>1. Pour les questions de Type G (Goûts) : La proximité élémentaire entre la note A et la note B (sur 10) est : S_G = 1 - (|Note_A - Note_B| / 9).</w:t>
-        <w:br/>
-        <w:t>2. Pour les questions de Type M (Multi-Axes V, A, D, P) : L'algorithme calcule l'écart multidimensionnel sur les 4 axes temporels : S_M = 1 - ( ( |V_A - V_B| + |A_A - A_B| + |D_A - D_B| + |P_A - P_B| ) / 36 ).</w:t>
-        <w:br/>
-        <w:t>3. Pour la classe 8 (Identité) : Adéquation bilatérale entre les caractéristiques de A et les tolérances de B, et réciproquement (vérification de l'appartenance de la valeur dans la plage [min_val, max_val] ou inclusion dans options_json).</w:t>
-        <w:br/>
-        <w:t>4. Distance kilométrique (Formule de Haversine) : Calculée à partir des coordonnées géographiques des communes. Règle métier stricte : Cette distance est purement informative et n'intervient pas dans la note d'affinité élective.</w:t>
-      </w:r>
-    </w:p>
-    <w:p>
-      <w:pPr>
-        <w:spacing w:before="400" w:after="120"/>
-      </w:pPr>
-      <w:r>
         <w:rPr>
-          <w:rFonts w:ascii="Segoe UI" w:hAnsi="Segoe UI"/>
-          <w:b/>
-          <w:color w:val="1E3A8A"/>
-          <w:sz w:val="28"/>
+          <w:lang w:val="fr-FR"/>
         </w:rPr>
-        <w:t>5. SYSTÈME DE SÉCURITÉ ET CRYPTOGRAPHIE</w:t>
-      </w:r>
-    </w:p>
-    <w:p>
-      <w:r>
-        <w:t>• Hachage des mots de passe : Chaque mot de passe est combiné à un sel cryptographique aléatoire de 16 octets (secrets.token_hex(16)), puis haché en SHA-256 (hashlib.sha256). Les mots de passe en clair ne sont jamais enregistrés.</w:t>
-        <w:br/>
-        <w:t>• Protection contre les attaques temporelles : Utilisation de secrets.compare_digest() pour la vérification des mots de passe.</w:t>
-        <w:br/>
-        <w:t>• Sessions : Tokens aléatoires de 64 caractères hexadécimaux avec durée de validité de 30 jours.</w:t>
-        <w:br/>
-        <w:t>• Codes de réinitialisation : Nombres aléatoires à 6 chiffres (secrets.randbelow(900000) + 100000) expirant après 15 minutes.</w:t>
-      </w:r>
-    </w:p>
-    <w:p>
-      <w:pPr>
-        <w:spacing w:before="400" w:after="120"/>
-      </w:pPr>
-      <w:r>
-        <w:rPr>
-          <w:rFonts w:ascii="Segoe UI" w:hAnsi="Segoe UI"/>
-          <w:b/>
-          <w:color w:val="1E3A8A"/>
-          <w:sz w:val="28"/>
-        </w:rPr>
-        <w:t>6. DÉPLOIEMENT CLOUD ET GESTION DU DISQUE PERSISTANT (RENDER)</w:t>
-      </w:r>
-    </w:p>
-    <w:p>
-      <w:r>
-        <w:t>Sur la plateforme d'hébergement Render, le système de fichiers par défaut des conteneurs est éphémère. Pour garantir une persistance absolue des profils et des réponses sans aucune perte lors des redéploiements, server.py intègre une détection automatique de volume persistant :</w:t>
-        <w:br/>
-        <w:t>1. Détection automatique : Recherche du dossier '/var/data' ou de la variable d'environnement AFFINITY_DATA_DIR.</w:t>
-        <w:br/>
-        <w:t>2. Amorçage automatique : Au tout premier démarrage avec un disque vide, le serveur copie automatiquement la base initiale 'affinity.db' du dépôt vers '/var/data/affinity.db'.</w:t>
-        <w:br/>
-        <w:t>3. Protection contre l'écrasement : Lors de chaque mise à jour de code (git push), le serveur constate que '/var/data/affinity.db' existe déjà et ne le réécrit jamais. La base de données de production reste 100% intacte.</w:t>
-      </w:r>
-    </w:p>
-    <w:p>
-      <w:pPr>
-        <w:spacing w:before="400" w:after="120"/>
-      </w:pPr>
-      <w:r>
-        <w:rPr>
-          <w:rFonts w:ascii="Segoe UI" w:hAnsi="Segoe UI"/>
-          <w:b/>
-          <w:color w:val="1E3A8A"/>
-          <w:sz w:val="28"/>
-        </w:rPr>
-        <w:t>7. DÉVELOPPEMENT MULTI-POSTES : PROCÉDURE POUR PORTABLE WINDOWS 10</w:t>
-      </w:r>
-    </w:p>
-    <w:p>
-      <w:r>
-        <w:t>Il est parfaitement possible de poursuivre tous les développements depuis un ancien PC portable sous Windows 10 (même si ce dernier ne peut pas migrer vers Windows 11). Voici la procédure pas-à-pas pour être opérationnel en 5 minutes :</w:t>
+        <w:t>L'algorithme Affinity calcule un score d'affinité global pondéré (0% à 100%) basé sur la concordance psychologique et comportementale :</w:t>
       </w:r>
     </w:p>
     <w:p>
@@ -810,7 +2431,17 @@
         <w:pStyle w:val="ListBullet"/>
       </w:pPr>
       <w:r>
-        <w:t>Étape 1 : Installer Python (version 3.10, 3.11 ou supérieure) depuis python.org. Penser à cocher la case 'Add python.exe to PATH' lors de l'installation.</w:t>
+        <w:rPr>
+          <w:b/>
+          <w:lang w:val="fr-FR"/>
+        </w:rPr>
+        <w:t xml:space="preserve">1. Règle d'or de complétion du profil : </w:t>
+      </w:r>
+      <w:r>
+        <w:rPr>
+          <w:lang w:val="fr-FR"/>
+        </w:rPr>
+        <w:t>Le calcul d'affinité est rigoureusement bloqué tant que les deux profils n'ont pas complété leur fiche d'identité (sexe, date de naissance, ville).</w:t>
       </w:r>
     </w:p>
     <w:p>
@@ -818,7 +2449,17 @@
         <w:pStyle w:val="ListBullet"/>
       </w:pPr>
       <w:r>
-        <w:t>Étape 2 : Installer Git pour Windows depuis git-scm.com (options par défaut recommandées).</w:t>
+        <w:rPr>
+          <w:b/>
+          <w:lang w:val="fr-FR"/>
+        </w:rPr>
+        <w:t xml:space="preserve">2. Questions de Type G (Goûts Partagés) : </w:t>
+      </w:r>
+      <w:r>
+        <w:rPr>
+          <w:lang w:val="fr-FR"/>
+        </w:rPr>
+        <w:t>Mesure de la proximité simple sur l'échelle : Proximité = max(0, 1 - |v1 - v2| / 5).</w:t>
       </w:r>
     </w:p>
     <w:p>
@@ -826,7 +2467,21 @@
         <w:pStyle w:val="ListBullet"/>
       </w:pPr>
       <w:r>
-        <w:t>Étape 3 : Cloner le dépôt officiel sur votre portable : ouvrir PowerShell et taper : git clone https://github.com/AR30960/affinity.git</w:t>
+        <w:rPr>
+          <w:b/>
+          <w:lang w:val="fr-FR"/>
+        </w:rPr>
+        <w:t xml:space="preserve">3. Questions de Type M (Multi-Axes V-A-D-P) : </w:t>
+      </w:r>
+      <w:r>
+        <w:rPr>
+          <w:lang w:val="fr-FR"/>
+        </w:rPr>
+        <w:t>• Vécu passé (V, coef 0.7) : proximité des expériences antérieures.</w:t>
+        <w:br/>
+        <w:t>• Habitudes actuelles (A, coef 1.0) : concordance du mode de vie présent.</w:t>
+        <w:br/>
+        <w:t>• Synergie croisée Découverte &amp; Partage (D x P, coef 1.2, Cœur de l'algorithme) : croise le désir de découverte de P1 (D1) avec la volonté de partage de P2 (P2), et réciproquement (D2 x P1). Harmonie maximale si les deux sont positifs (&gt;= 3), tension forte si l'un refuse (1 ou 9) et l'autre exige (5).</w:t>
       </w:r>
     </w:p>
     <w:p>
@@ -834,7 +2489,17 @@
         <w:pStyle w:val="ListBullet"/>
       </w:pPr>
       <w:r>
-        <w:t>Étape 4 : Lancer le serveur local : entrer dans le dossier avec 'cd affinity' puis exécuter 'python server.py'.</w:t>
+        <w:rPr>
+          <w:b/>
+          <w:lang w:val="fr-FR"/>
+        </w:rPr>
+        <w:t xml:space="preserve">4. Résilience &amp; Absence de questions communes : </w:t>
+      </w:r>
+      <w:r>
+        <w:rPr>
+          <w:lang w:val="fr-FR"/>
+        </w:rPr>
+        <w:t>Si deux profils n'ont répondu à aucune question commune, le moteur renvoie une structure saine et complète (profile1, profile2, axes à zéro, diagnostic d'identité et message informatif explicite), éliminant tout crash d'indéfinition de propriétés.</w:t>
       </w:r>
     </w:p>
     <w:p>
@@ -842,7 +2507,864 @@
         <w:pStyle w:val="ListBullet"/>
       </w:pPr>
       <w:r>
-        <w:t>Étape 5 : Ouvrir votre navigateur sur http://localhost:8765/ pour tester et développer.</w:t>
+        <w:rPr>
+          <w:b/>
+          <w:lang w:val="fr-FR"/>
+        </w:rPr>
+        <w:t xml:space="preserve">5. Distance kilométrique : </w:t>
+      </w:r>
+      <w:r>
+        <w:rPr>
+          <w:lang w:val="fr-FR"/>
+        </w:rPr>
+        <w:t>Calculée selon la formule de Haversine à partir des coordonnées géographiques des communes. Conformément à la volonté de l'auteur, la distance est strictement indicative et n'altère pas le score d'affinité psychologique.</w:t>
+      </w:r>
+    </w:p>
+    <w:p>
+      <w:pPr>
+        <w:spacing w:before="280" w:after="120"/>
+      </w:pPr>
+      <w:r>
+        <w:rPr>
+          <w:b/>
+          <w:color w:val="0E7490"/>
+          <w:sz w:val="28"/>
+          <w:lang w:val="fr-FR"/>
+        </w:rPr>
+        <w:t>7. SPÉCIFICATION DES API REST (ENDPOINTS)</w:t>
+      </w:r>
+    </w:p>
+    <w:p>
+      <w:r>
+        <w:rPr>
+          <w:lang w:val="fr-FR"/>
+        </w:rPr>
+        <w:t>Le serveur Python expose une architecture d'API REST robuste et modulaire :</w:t>
+      </w:r>
+    </w:p>
+    <w:tbl>
+      <w:tblPr>
+        <w:tblW w:type="auto" w:w="0"/>
+        <w:jc w:val="center"/>
+        <w:tblLook w:firstColumn="1" w:firstRow="1" w:lastColumn="0" w:lastRow="0" w:noHBand="0" w:noVBand="1" w:val="04A0"/>
+      </w:tblPr>
+      <w:tblGrid>
+        <w:gridCol w:w="3106"/>
+        <w:gridCol w:w="3106"/>
+        <w:gridCol w:w="3106"/>
+      </w:tblGrid>
+      <w:tr>
+        <w:tc>
+          <w:tcPr>
+            <w:tcW w:type="dxa" w:w="3106"/>
+            <w:shd w:val="clear" w:color="auto" w:fill="0F172A"/>
+            <w:tcMar>
+              <w:top w:w="100" w:type="dxa"/>
+              <w:bottom w:w="100" w:type="dxa"/>
+              <w:left w:w="120" w:type="dxa"/>
+              <w:right w:w="120" w:type="dxa"/>
+            </w:tcMar>
+          </w:tcPr>
+          <w:p>
+            <w:r>
+              <w:rPr>
+                <w:b/>
+                <w:color w:val="FFFFFF"/>
+                <w:sz w:val="19"/>
+              </w:rPr>
+              <w:t>Méthode &amp; Route</w:t>
+            </w:r>
+          </w:p>
+        </w:tc>
+        <w:tc>
+          <w:tcPr>
+            <w:tcW w:type="dxa" w:w="3106"/>
+            <w:shd w:val="clear" w:color="auto" w:fill="0F172A"/>
+            <w:tcMar>
+              <w:top w:w="100" w:type="dxa"/>
+              <w:bottom w:w="100" w:type="dxa"/>
+              <w:left w:w="120" w:type="dxa"/>
+              <w:right w:w="120" w:type="dxa"/>
+            </w:tcMar>
+          </w:tcPr>
+          <w:p>
+            <w:r>
+              <w:rPr>
+                <w:b/>
+                <w:color w:val="FFFFFF"/>
+                <w:sz w:val="19"/>
+              </w:rPr>
+              <w:t>Rôle Requis</w:t>
+            </w:r>
+          </w:p>
+        </w:tc>
+        <w:tc>
+          <w:tcPr>
+            <w:tcW w:type="dxa" w:w="3106"/>
+            <w:shd w:val="clear" w:color="auto" w:fill="0F172A"/>
+            <w:tcMar>
+              <w:top w:w="100" w:type="dxa"/>
+              <w:bottom w:w="100" w:type="dxa"/>
+              <w:left w:w="120" w:type="dxa"/>
+              <w:right w:w="120" w:type="dxa"/>
+            </w:tcMar>
+          </w:tcPr>
+          <w:p>
+            <w:r>
+              <w:rPr>
+                <w:b/>
+                <w:color w:val="FFFFFF"/>
+                <w:sz w:val="19"/>
+              </w:rPr>
+              <w:t>Description &amp; Payload</w:t>
+            </w:r>
+          </w:p>
+        </w:tc>
+      </w:tr>
+      <w:tr>
+        <w:tc>
+          <w:tcPr>
+            <w:tcW w:type="dxa" w:w="3106"/>
+            <w:shd w:val="clear" w:color="auto" w:fill="F8FAFC"/>
+            <w:tcMar>
+              <w:top w:w="80" w:type="dxa"/>
+              <w:bottom w:w="80" w:type="dxa"/>
+              <w:left w:w="100" w:type="dxa"/>
+              <w:right w:w="100" w:type="dxa"/>
+            </w:tcMar>
+          </w:tcPr>
+          <w:p>
+            <w:r>
+              <w:rPr>
+                <w:color w:val="1E293B"/>
+                <w:sz w:val="18"/>
+              </w:rPr>
+              <w:t>POST /api/auth/login</w:t>
+            </w:r>
+          </w:p>
+        </w:tc>
+        <w:tc>
+          <w:tcPr>
+            <w:tcW w:type="dxa" w:w="3106"/>
+            <w:shd w:val="clear" w:color="auto" w:fill="F8FAFC"/>
+            <w:tcMar>
+              <w:top w:w="80" w:type="dxa"/>
+              <w:bottom w:w="80" w:type="dxa"/>
+              <w:left w:w="100" w:type="dxa"/>
+              <w:right w:w="100" w:type="dxa"/>
+            </w:tcMar>
+          </w:tcPr>
+          <w:p>
+            <w:r>
+              <w:rPr>
+                <w:color w:val="1E293B"/>
+                <w:sz w:val="18"/>
+              </w:rPr>
+              <w:t>Tous</w:t>
+            </w:r>
+          </w:p>
+        </w:tc>
+        <w:tc>
+          <w:tcPr>
+            <w:tcW w:type="dxa" w:w="3106"/>
+            <w:shd w:val="clear" w:color="auto" w:fill="F8FAFC"/>
+            <w:tcMar>
+              <w:top w:w="80" w:type="dxa"/>
+              <w:bottom w:w="80" w:type="dxa"/>
+              <w:left w:w="100" w:type="dxa"/>
+              <w:right w:w="100" w:type="dxa"/>
+            </w:tcMar>
+          </w:tcPr>
+          <w:p>
+            <w:r>
+              <w:rPr>
+                <w:color w:val="1E293B"/>
+                <w:sz w:val="18"/>
+              </w:rPr>
+              <w:t>Authentification par pseudo/email et mot de passe. Renvoie le token Bearer.</w:t>
+            </w:r>
+          </w:p>
+        </w:tc>
+      </w:tr>
+      <w:tr>
+        <w:tc>
+          <w:tcPr>
+            <w:tcW w:type="dxa" w:w="3106"/>
+            <w:shd w:val="clear" w:color="auto" w:fill="FFFFFF"/>
+            <w:tcMar>
+              <w:top w:w="80" w:type="dxa"/>
+              <w:bottom w:w="80" w:type="dxa"/>
+              <w:left w:w="100" w:type="dxa"/>
+              <w:right w:w="100" w:type="dxa"/>
+            </w:tcMar>
+          </w:tcPr>
+          <w:p>
+            <w:r>
+              <w:rPr>
+                <w:color w:val="1E293B"/>
+                <w:sz w:val="18"/>
+              </w:rPr>
+              <w:t>GET /api/auth/me</w:t>
+            </w:r>
+          </w:p>
+        </w:tc>
+        <w:tc>
+          <w:tcPr>
+            <w:tcW w:type="dxa" w:w="3106"/>
+            <w:shd w:val="clear" w:color="auto" w:fill="FFFFFF"/>
+            <w:tcMar>
+              <w:top w:w="80" w:type="dxa"/>
+              <w:bottom w:w="80" w:type="dxa"/>
+              <w:left w:w="100" w:type="dxa"/>
+              <w:right w:w="100" w:type="dxa"/>
+            </w:tcMar>
+          </w:tcPr>
+          <w:p>
+            <w:r>
+              <w:rPr>
+                <w:color w:val="1E293B"/>
+                <w:sz w:val="18"/>
+              </w:rPr>
+              <w:t>Connecté</w:t>
+            </w:r>
+          </w:p>
+        </w:tc>
+        <w:tc>
+          <w:tcPr>
+            <w:tcW w:type="dxa" w:w="3106"/>
+            <w:shd w:val="clear" w:color="auto" w:fill="FFFFFF"/>
+            <w:tcMar>
+              <w:top w:w="80" w:type="dxa"/>
+              <w:bottom w:w="80" w:type="dxa"/>
+              <w:left w:w="100" w:type="dxa"/>
+              <w:right w:w="100" w:type="dxa"/>
+            </w:tcMar>
+          </w:tcPr>
+          <w:p>
+            <w:r>
+              <w:rPr>
+                <w:color w:val="1E293B"/>
+                <w:sz w:val="18"/>
+              </w:rPr>
+              <w:t>Récupère les informations complètes de session du profil actif.</w:t>
+            </w:r>
+          </w:p>
+        </w:tc>
+      </w:tr>
+      <w:tr>
+        <w:tc>
+          <w:tcPr>
+            <w:tcW w:type="dxa" w:w="3106"/>
+            <w:shd w:val="clear" w:color="auto" w:fill="F8FAFC"/>
+            <w:tcMar>
+              <w:top w:w="80" w:type="dxa"/>
+              <w:bottom w:w="80" w:type="dxa"/>
+              <w:left w:w="100" w:type="dxa"/>
+              <w:right w:w="100" w:type="dxa"/>
+            </w:tcMar>
+          </w:tcPr>
+          <w:p>
+            <w:r>
+              <w:rPr>
+                <w:color w:val="1E293B"/>
+                <w:sz w:val="18"/>
+              </w:rPr>
+              <w:t>GET /api/profiles</w:t>
+            </w:r>
+          </w:p>
+        </w:tc>
+        <w:tc>
+          <w:tcPr>
+            <w:tcW w:type="dxa" w:w="3106"/>
+            <w:shd w:val="clear" w:color="auto" w:fill="F8FAFC"/>
+            <w:tcMar>
+              <w:top w:w="80" w:type="dxa"/>
+              <w:bottom w:w="80" w:type="dxa"/>
+              <w:left w:w="100" w:type="dxa"/>
+              <w:right w:w="100" w:type="dxa"/>
+            </w:tcMar>
+          </w:tcPr>
+          <w:p>
+            <w:r>
+              <w:rPr>
+                <w:color w:val="1E293B"/>
+                <w:sz w:val="18"/>
+              </w:rPr>
+              <w:t>Tous (filtré)</w:t>
+            </w:r>
+          </w:p>
+        </w:tc>
+        <w:tc>
+          <w:tcPr>
+            <w:tcW w:type="dxa" w:w="3106"/>
+            <w:shd w:val="clear" w:color="auto" w:fill="F8FAFC"/>
+            <w:tcMar>
+              <w:top w:w="80" w:type="dxa"/>
+              <w:bottom w:w="80" w:type="dxa"/>
+              <w:left w:w="100" w:type="dxa"/>
+              <w:right w:w="100" w:type="dxa"/>
+            </w:tcMar>
+          </w:tcPr>
+          <w:p>
+            <w:r>
+              <w:rPr>
+                <w:color w:val="1E293B"/>
+                <w:sz w:val="18"/>
+              </w:rPr>
+              <w:t>Liste des profils (vision complète pour admin, profils publics pour autres).</w:t>
+            </w:r>
+          </w:p>
+        </w:tc>
+      </w:tr>
+      <w:tr>
+        <w:tc>
+          <w:tcPr>
+            <w:tcW w:type="dxa" w:w="3106"/>
+            <w:shd w:val="clear" w:color="auto" w:fill="FFFFFF"/>
+            <w:tcMar>
+              <w:top w:w="80" w:type="dxa"/>
+              <w:bottom w:w="80" w:type="dxa"/>
+              <w:left w:w="100" w:type="dxa"/>
+              <w:right w:w="100" w:type="dxa"/>
+            </w:tcMar>
+          </w:tcPr>
+          <w:p>
+            <w:r>
+              <w:rPr>
+                <w:color w:val="1E293B"/>
+                <w:sz w:val="18"/>
+              </w:rPr>
+              <w:t>GET /api/profiles/:id/identity-answers</w:t>
+            </w:r>
+          </w:p>
+        </w:tc>
+        <w:tc>
+          <w:tcPr>
+            <w:tcW w:type="dxa" w:w="3106"/>
+            <w:shd w:val="clear" w:color="auto" w:fill="FFFFFF"/>
+            <w:tcMar>
+              <w:top w:w="80" w:type="dxa"/>
+              <w:bottom w:w="80" w:type="dxa"/>
+              <w:left w:w="100" w:type="dxa"/>
+              <w:right w:w="100" w:type="dxa"/>
+            </w:tcMar>
+          </w:tcPr>
+          <w:p>
+            <w:r>
+              <w:rPr>
+                <w:color w:val="1E293B"/>
+                <w:sz w:val="18"/>
+              </w:rPr>
+              <w:t>Connecté</w:t>
+            </w:r>
+          </w:p>
+        </w:tc>
+        <w:tc>
+          <w:tcPr>
+            <w:tcW w:type="dxa" w:w="3106"/>
+            <w:shd w:val="clear" w:color="auto" w:fill="FFFFFF"/>
+            <w:tcMar>
+              <w:top w:w="80" w:type="dxa"/>
+              <w:bottom w:w="80" w:type="dxa"/>
+              <w:left w:w="100" w:type="dxa"/>
+              <w:right w:w="100" w:type="dxa"/>
+            </w:tcMar>
+          </w:tcPr>
+          <w:p>
+            <w:r>
+              <w:rPr>
+                <w:color w:val="1E293B"/>
+                <w:sz w:val="18"/>
+              </w:rPr>
+              <w:t>Récupère les questions et réponses d'identité (+ sur moi et + sur l'autre).</w:t>
+            </w:r>
+          </w:p>
+        </w:tc>
+      </w:tr>
+      <w:tr>
+        <w:tc>
+          <w:tcPr>
+            <w:tcW w:type="dxa" w:w="3106"/>
+            <w:shd w:val="clear" w:color="auto" w:fill="F8FAFC"/>
+            <w:tcMar>
+              <w:top w:w="80" w:type="dxa"/>
+              <w:bottom w:w="80" w:type="dxa"/>
+              <w:left w:w="100" w:type="dxa"/>
+              <w:right w:w="100" w:type="dxa"/>
+            </w:tcMar>
+          </w:tcPr>
+          <w:p>
+            <w:r>
+              <w:rPr>
+                <w:color w:val="1E293B"/>
+                <w:sz w:val="18"/>
+              </w:rPr>
+              <w:t>POST /api/profiles/:id/identity-answers/self</w:t>
+            </w:r>
+          </w:p>
+        </w:tc>
+        <w:tc>
+          <w:tcPr>
+            <w:tcW w:type="dxa" w:w="3106"/>
+            <w:shd w:val="clear" w:color="auto" w:fill="F8FAFC"/>
+            <w:tcMar>
+              <w:top w:w="80" w:type="dxa"/>
+              <w:bottom w:w="80" w:type="dxa"/>
+              <w:left w:w="100" w:type="dxa"/>
+              <w:right w:w="100" w:type="dxa"/>
+            </w:tcMar>
+          </w:tcPr>
+          <w:p>
+            <w:r>
+              <w:rPr>
+                <w:color w:val="1E293B"/>
+                <w:sz w:val="18"/>
+              </w:rPr>
+              <w:t>Propriétaire/Admin</w:t>
+            </w:r>
+          </w:p>
+        </w:tc>
+        <w:tc>
+          <w:tcPr>
+            <w:tcW w:type="dxa" w:w="3106"/>
+            <w:shd w:val="clear" w:color="auto" w:fill="F8FAFC"/>
+            <w:tcMar>
+              <w:top w:w="80" w:type="dxa"/>
+              <w:bottom w:w="80" w:type="dxa"/>
+              <w:left w:w="100" w:type="dxa"/>
+              <w:right w:w="100" w:type="dxa"/>
+            </w:tcMar>
+          </w:tcPr>
+          <w:p>
+            <w:r>
+              <w:rPr>
+                <w:color w:val="1E293B"/>
+                <w:sz w:val="18"/>
+              </w:rPr>
+              <w:t>Enregistre une caractéristique personnelle (+ sur moi) : { question_id, valeur_num, valeur_text }.</w:t>
+            </w:r>
+          </w:p>
+        </w:tc>
+      </w:tr>
+      <w:tr>
+        <w:tc>
+          <w:tcPr>
+            <w:tcW w:type="dxa" w:w="3106"/>
+            <w:shd w:val="clear" w:color="auto" w:fill="FFFFFF"/>
+            <w:tcMar>
+              <w:top w:w="80" w:type="dxa"/>
+              <w:bottom w:w="80" w:type="dxa"/>
+              <w:left w:w="100" w:type="dxa"/>
+              <w:right w:w="100" w:type="dxa"/>
+            </w:tcMar>
+          </w:tcPr>
+          <w:p>
+            <w:r>
+              <w:rPr>
+                <w:color w:val="1E293B"/>
+                <w:sz w:val="18"/>
+              </w:rPr>
+              <w:t>POST /api/profiles/:id/identity-answers/partner</w:t>
+            </w:r>
+          </w:p>
+        </w:tc>
+        <w:tc>
+          <w:tcPr>
+            <w:tcW w:type="dxa" w:w="3106"/>
+            <w:shd w:val="clear" w:color="auto" w:fill="FFFFFF"/>
+            <w:tcMar>
+              <w:top w:w="80" w:type="dxa"/>
+              <w:bottom w:w="80" w:type="dxa"/>
+              <w:left w:w="100" w:type="dxa"/>
+              <w:right w:w="100" w:type="dxa"/>
+            </w:tcMar>
+          </w:tcPr>
+          <w:p>
+            <w:r>
+              <w:rPr>
+                <w:color w:val="1E293B"/>
+                <w:sz w:val="18"/>
+              </w:rPr>
+              <w:t>Propriétaire/Admin</w:t>
+            </w:r>
+          </w:p>
+        </w:tc>
+        <w:tc>
+          <w:tcPr>
+            <w:tcW w:type="dxa" w:w="3106"/>
+            <w:shd w:val="clear" w:color="auto" w:fill="FFFFFF"/>
+            <w:tcMar>
+              <w:top w:w="80" w:type="dxa"/>
+              <w:bottom w:w="80" w:type="dxa"/>
+              <w:left w:w="100" w:type="dxa"/>
+              <w:right w:w="100" w:type="dxa"/>
+            </w:tcMar>
+          </w:tcPr>
+          <w:p>
+            <w:r>
+              <w:rPr>
+                <w:color w:val="1E293B"/>
+                <w:sz w:val="18"/>
+              </w:rPr>
+              <w:t>Enregistre une tolérance partenaire (+ sur l'autre) : { question_id, min_val, max_val, options, indifferent }.</w:t>
+            </w:r>
+          </w:p>
+        </w:tc>
+      </w:tr>
+      <w:tr>
+        <w:tc>
+          <w:tcPr>
+            <w:tcW w:type="dxa" w:w="3106"/>
+            <w:shd w:val="clear" w:color="auto" w:fill="F8FAFC"/>
+            <w:tcMar>
+              <w:top w:w="80" w:type="dxa"/>
+              <w:bottom w:w="80" w:type="dxa"/>
+              <w:left w:w="100" w:type="dxa"/>
+              <w:right w:w="100" w:type="dxa"/>
+            </w:tcMar>
+          </w:tcPr>
+          <w:p>
+            <w:r>
+              <w:rPr>
+                <w:color w:val="1E293B"/>
+                <w:sz w:val="18"/>
+              </w:rPr>
+              <w:t>GET /api/affinity/identity-compatibility</w:t>
+            </w:r>
+          </w:p>
+        </w:tc>
+        <w:tc>
+          <w:tcPr>
+            <w:tcW w:type="dxa" w:w="3106"/>
+            <w:shd w:val="clear" w:color="auto" w:fill="F8FAFC"/>
+            <w:tcMar>
+              <w:top w:w="80" w:type="dxa"/>
+              <w:bottom w:w="80" w:type="dxa"/>
+              <w:left w:w="100" w:type="dxa"/>
+              <w:right w:w="100" w:type="dxa"/>
+            </w:tcMar>
+          </w:tcPr>
+          <w:p>
+            <w:r>
+              <w:rPr>
+                <w:color w:val="1E293B"/>
+                <w:sz w:val="18"/>
+              </w:rPr>
+              <w:t>Connecté</w:t>
+            </w:r>
+          </w:p>
+        </w:tc>
+        <w:tc>
+          <w:tcPr>
+            <w:tcW w:type="dxa" w:w="3106"/>
+            <w:shd w:val="clear" w:color="auto" w:fill="F8FAFC"/>
+            <w:tcMar>
+              <w:top w:w="80" w:type="dxa"/>
+              <w:bottom w:w="80" w:type="dxa"/>
+              <w:left w:w="100" w:type="dxa"/>
+              <w:right w:w="100" w:type="dxa"/>
+            </w:tcMar>
+          </w:tcPr>
+          <w:p>
+            <w:r>
+              <w:rPr>
+                <w:color w:val="1E293B"/>
+                <w:sz w:val="18"/>
+              </w:rPr>
+              <w:t>Diagnostic préalable de compatibilité identité : ?p1=X&amp;p2=Y. Renvoie le verdict, scores et détail croisé.</w:t>
+            </w:r>
+          </w:p>
+        </w:tc>
+      </w:tr>
+      <w:tr>
+        <w:tc>
+          <w:tcPr>
+            <w:tcW w:type="dxa" w:w="3106"/>
+            <w:shd w:val="clear" w:color="auto" w:fill="FFFFFF"/>
+            <w:tcMar>
+              <w:top w:w="80" w:type="dxa"/>
+              <w:bottom w:w="80" w:type="dxa"/>
+              <w:left w:w="100" w:type="dxa"/>
+              <w:right w:w="100" w:type="dxa"/>
+            </w:tcMar>
+          </w:tcPr>
+          <w:p>
+            <w:r>
+              <w:rPr>
+                <w:color w:val="1E293B"/>
+                <w:sz w:val="18"/>
+              </w:rPr>
+              <w:t>POST /api/affinity/calculate</w:t>
+            </w:r>
+          </w:p>
+        </w:tc>
+        <w:tc>
+          <w:tcPr>
+            <w:tcW w:type="dxa" w:w="3106"/>
+            <w:shd w:val="clear" w:color="auto" w:fill="FFFFFF"/>
+            <w:tcMar>
+              <w:top w:w="80" w:type="dxa"/>
+              <w:bottom w:w="80" w:type="dxa"/>
+              <w:left w:w="100" w:type="dxa"/>
+              <w:right w:w="100" w:type="dxa"/>
+            </w:tcMar>
+          </w:tcPr>
+          <w:p>
+            <w:r>
+              <w:rPr>
+                <w:color w:val="1E293B"/>
+                <w:sz w:val="18"/>
+              </w:rPr>
+              <w:t>Abonné / Admin</w:t>
+            </w:r>
+          </w:p>
+        </w:tc>
+        <w:tc>
+          <w:tcPr>
+            <w:tcW w:type="dxa" w:w="3106"/>
+            <w:shd w:val="clear" w:color="auto" w:fill="FFFFFF"/>
+            <w:tcMar>
+              <w:top w:w="80" w:type="dxa"/>
+              <w:bottom w:w="80" w:type="dxa"/>
+              <w:left w:w="100" w:type="dxa"/>
+              <w:right w:w="100" w:type="dxa"/>
+            </w:tcMar>
+          </w:tcPr>
+          <w:p>
+            <w:r>
+              <w:rPr>
+                <w:color w:val="1E293B"/>
+                <w:sz w:val="18"/>
+              </w:rPr>
+              <w:t>Calcul complet d'affinité V-A-D-P, radar et diagnostic identité : { profile1_id, profile2_id }.</w:t>
+            </w:r>
+          </w:p>
+        </w:tc>
+      </w:tr>
+      <w:tr>
+        <w:tc>
+          <w:tcPr>
+            <w:tcW w:type="dxa" w:w="3106"/>
+            <w:shd w:val="clear" w:color="auto" w:fill="F8FAFC"/>
+            <w:tcMar>
+              <w:top w:w="80" w:type="dxa"/>
+              <w:bottom w:w="80" w:type="dxa"/>
+              <w:left w:w="100" w:type="dxa"/>
+              <w:right w:w="100" w:type="dxa"/>
+            </w:tcMar>
+          </w:tcPr>
+          <w:p>
+            <w:r>
+              <w:rPr>
+                <w:color w:val="1E293B"/>
+                <w:sz w:val="18"/>
+              </w:rPr>
+              <w:t>GET /api/distance</w:t>
+            </w:r>
+          </w:p>
+        </w:tc>
+        <w:tc>
+          <w:tcPr>
+            <w:tcW w:type="dxa" w:w="3106"/>
+            <w:shd w:val="clear" w:color="auto" w:fill="F8FAFC"/>
+            <w:tcMar>
+              <w:top w:w="80" w:type="dxa"/>
+              <w:bottom w:w="80" w:type="dxa"/>
+              <w:left w:w="100" w:type="dxa"/>
+              <w:right w:w="100" w:type="dxa"/>
+            </w:tcMar>
+          </w:tcPr>
+          <w:p>
+            <w:r>
+              <w:rPr>
+                <w:color w:val="1E293B"/>
+                <w:sz w:val="18"/>
+              </w:rPr>
+              <w:t>Connecté</w:t>
+            </w:r>
+          </w:p>
+        </w:tc>
+        <w:tc>
+          <w:tcPr>
+            <w:tcW w:type="dxa" w:w="3106"/>
+            <w:shd w:val="clear" w:color="auto" w:fill="F8FAFC"/>
+            <w:tcMar>
+              <w:top w:w="80" w:type="dxa"/>
+              <w:bottom w:w="80" w:type="dxa"/>
+              <w:left w:w="100" w:type="dxa"/>
+              <w:right w:w="100" w:type="dxa"/>
+            </w:tcMar>
+          </w:tcPr>
+          <w:p>
+            <w:r>
+              <w:rPr>
+                <w:color w:val="1E293B"/>
+                <w:sz w:val="18"/>
+              </w:rPr>
+              <w:t>Calcul de distance kilométrique entre deux communes : ?ville1=Paris&amp;ville2=Lyon.</w:t>
+            </w:r>
+          </w:p>
+        </w:tc>
+      </w:tr>
+      <w:tr>
+        <w:tc>
+          <w:tcPr>
+            <w:tcW w:type="dxa" w:w="3106"/>
+            <w:shd w:val="clear" w:color="auto" w:fill="FFFFFF"/>
+            <w:tcMar>
+              <w:top w:w="80" w:type="dxa"/>
+              <w:bottom w:w="80" w:type="dxa"/>
+              <w:left w:w="100" w:type="dxa"/>
+              <w:right w:w="100" w:type="dxa"/>
+            </w:tcMar>
+          </w:tcPr>
+          <w:p>
+            <w:r>
+              <w:rPr>
+                <w:color w:val="1E293B"/>
+                <w:sz w:val="18"/>
+              </w:rPr>
+              <w:t>GET /api/admin/backups</w:t>
+            </w:r>
+          </w:p>
+        </w:tc>
+        <w:tc>
+          <w:tcPr>
+            <w:tcW w:type="dxa" w:w="3106"/>
+            <w:shd w:val="clear" w:color="auto" w:fill="FFFFFF"/>
+            <w:tcMar>
+              <w:top w:w="80" w:type="dxa"/>
+              <w:bottom w:w="80" w:type="dxa"/>
+              <w:left w:w="100" w:type="dxa"/>
+              <w:right w:w="100" w:type="dxa"/>
+            </w:tcMar>
+          </w:tcPr>
+          <w:p>
+            <w:r>
+              <w:rPr>
+                <w:color w:val="1E293B"/>
+                <w:sz w:val="18"/>
+              </w:rPr>
+              <w:t>Admin</w:t>
+            </w:r>
+          </w:p>
+        </w:tc>
+        <w:tc>
+          <w:tcPr>
+            <w:tcW w:type="dxa" w:w="3106"/>
+            <w:shd w:val="clear" w:color="auto" w:fill="FFFFFF"/>
+            <w:tcMar>
+              <w:top w:w="80" w:type="dxa"/>
+              <w:bottom w:w="80" w:type="dxa"/>
+              <w:left w:w="100" w:type="dxa"/>
+              <w:right w:w="100" w:type="dxa"/>
+            </w:tcMar>
+          </w:tcPr>
+          <w:p>
+            <w:r>
+              <w:rPr>
+                <w:color w:val="1E293B"/>
+                <w:sz w:val="18"/>
+              </w:rPr>
+              <w:t>Liste les sauvegardes locales horodatées existantes dans backups/.</w:t>
+            </w:r>
+          </w:p>
+        </w:tc>
+      </w:tr>
+      <w:tr>
+        <w:tc>
+          <w:tcPr>
+            <w:tcW w:type="dxa" w:w="3106"/>
+            <w:shd w:val="clear" w:color="auto" w:fill="F8FAFC"/>
+            <w:tcMar>
+              <w:top w:w="80" w:type="dxa"/>
+              <w:bottom w:w="80" w:type="dxa"/>
+              <w:left w:w="100" w:type="dxa"/>
+              <w:right w:w="100" w:type="dxa"/>
+            </w:tcMar>
+          </w:tcPr>
+          <w:p>
+            <w:r>
+              <w:rPr>
+                <w:color w:val="1E293B"/>
+                <w:sz w:val="18"/>
+              </w:rPr>
+              <w:t>POST /api/admin/backup</w:t>
+            </w:r>
+          </w:p>
+        </w:tc>
+        <w:tc>
+          <w:tcPr>
+            <w:tcW w:type="dxa" w:w="3106"/>
+            <w:shd w:val="clear" w:color="auto" w:fill="F8FAFC"/>
+            <w:tcMar>
+              <w:top w:w="80" w:type="dxa"/>
+              <w:bottom w:w="80" w:type="dxa"/>
+              <w:left w:w="100" w:type="dxa"/>
+              <w:right w:w="100" w:type="dxa"/>
+            </w:tcMar>
+          </w:tcPr>
+          <w:p>
+            <w:r>
+              <w:rPr>
+                <w:color w:val="1E293B"/>
+                <w:sz w:val="18"/>
+              </w:rPr>
+              <w:t>Admin</w:t>
+            </w:r>
+          </w:p>
+        </w:tc>
+        <w:tc>
+          <w:tcPr>
+            <w:tcW w:type="dxa" w:w="3106"/>
+            <w:shd w:val="clear" w:color="auto" w:fill="F8FAFC"/>
+            <w:tcMar>
+              <w:top w:w="80" w:type="dxa"/>
+              <w:bottom w:w="80" w:type="dxa"/>
+              <w:left w:w="100" w:type="dxa"/>
+              <w:right w:w="100" w:type="dxa"/>
+            </w:tcMar>
+          </w:tcPr>
+          <w:p>
+            <w:r>
+              <w:rPr>
+                <w:color w:val="1E293B"/>
+                <w:sz w:val="18"/>
+              </w:rPr>
+              <w:t>Déclenche la création immédiate d'une copie de sécurité de affinity.db.</w:t>
+            </w:r>
+          </w:p>
+        </w:tc>
+      </w:tr>
+    </w:tbl>
+    <w:p>
+      <w:r>
+        <w:rPr>
+          <w:lang w:val="fr-FR"/>
+        </w:rPr>
+        <w:br w:type="page"/>
+      </w:r>
+    </w:p>
+    <w:p>
+      <w:pPr>
+        <w:spacing w:before="240" w:after="120"/>
+      </w:pPr>
+      <w:r>
+        <w:rPr>
+          <w:b/>
+          <w:color w:val="0E7490"/>
+          <w:sz w:val="28"/>
+          <w:lang w:val="fr-FR"/>
+        </w:rPr>
+        <w:t>8. SAUVEGARDE LOCALE &amp; PÉRENNITÉ DES DONNÉES</w:t>
+      </w:r>
+    </w:p>
+    <w:p>
+      <w:r>
+        <w:rPr>
+          <w:lang w:val="fr-FR"/>
+        </w:rPr>
+        <w:t>Afin de garantir que les profils créés, les modifications de la banque de questions et les réponses saisies en local ne soient JAMAIS écrasées ni perdues, un triple dispositif de sauvegarde a été instauré :</w:t>
       </w:r>
     </w:p>
     <w:p>
@@ -850,7 +3372,17 @@
         <w:pStyle w:val="ListBullet"/>
       </w:pPr>
       <w:r>
-        <w:t>Étape 6 : Synchronisation Git : chaque travail validé se pousse avec 'git add .', 'git commit -m "..."' et 'git push origin main'. Render met à jour automatiquement la version en ligne.</w:t>
+        <w:rPr>
+          <w:b/>
+          <w:lang w:val="fr-FR"/>
+        </w:rPr>
+        <w:t xml:space="preserve">1. Sauvegarde Automatique Horodatée au Démarrage : </w:t>
+      </w:r>
+      <w:r>
+        <w:rPr>
+          <w:lang w:val="fr-FR"/>
+        </w:rPr>
+        <w:t>La fonction 'backup_local_db()' intégrée à server.py s'exécute automatiquement dès le lancement. Elle crée une copie 'backups/affinity_backup_YYYYMMDD_HHMMSS.db' et applique une rotation glissante préservant les 15 copies les plus récentes.</w:t>
       </w:r>
     </w:p>
     <w:p>
@@ -858,12 +3390,251 @@
         <w:pStyle w:val="ListBullet"/>
       </w:pPr>
       <w:r>
-        <w:t>Étape 7 : Retour sur le PC principal : à votre retour de vacances, un simple 'git pull' sur votre PC de bureau récupérera l'ensemble de vos développements sans aucun conflit.</w:t>
+        <w:rPr>
+          <w:b/>
+          <w:lang w:val="fr-FR"/>
+        </w:rPr>
+        <w:t xml:space="preserve">2. Script Windows Dédié : </w:t>
+      </w:r>
+      <w:r>
+        <w:rPr>
+          <w:lang w:val="fr-FR"/>
+        </w:rPr>
+        <w:t>Le script 'Sauvegarder_Base_Locale.bat' permet en un double-clic de figer une copie instantanée de sécurité sans aucune manipulation technique.</w:t>
+      </w:r>
+    </w:p>
+    <w:p>
+      <w:pPr>
+        <w:pStyle w:val="ListBullet"/>
+      </w:pPr>
+      <w:r>
+        <w:rPr>
+          <w:b/>
+          <w:lang w:val="fr-FR"/>
+        </w:rPr>
+        <w:t xml:space="preserve">3. Bouton Cockpit Administrateur : </w:t>
+      </w:r>
+      <w:r>
+        <w:rPr>
+          <w:lang w:val="fr-FR"/>
+        </w:rPr>
+        <w:t>L'interface d'administration intègre un encart de sauvegarde en temps réel affichant la date et taille de la dernière copie avec un bouton 'Créer une sauvegarde maintenant' appelant l'API backend.</w:t>
+      </w:r>
+    </w:p>
+    <w:p>
+      <w:pPr>
+        <w:pStyle w:val="ListBullet"/>
+      </w:pPr>
+      <w:r>
+        <w:rPr>
+          <w:b/>
+          <w:lang w:val="fr-FR"/>
+        </w:rPr>
+        <w:t xml:space="preserve">4. Protection Git : </w:t>
+      </w:r>
+      <w:r>
+        <w:rPr>
+          <w:lang w:val="fr-FR"/>
+        </w:rPr>
+        <w:t>Le fichier .gitignore exclut 'backups/*.db' pour ne pas encombrer le dépôt distant, tout en maintenant 'affinity.db' suivie dans l'arbre Git pour assurer sa persistance.</w:t>
+      </w:r>
+    </w:p>
+    <w:p>
+      <w:pPr>
+        <w:spacing w:before="280" w:after="120"/>
+      </w:pPr>
+      <w:r>
+        <w:rPr>
+          <w:b/>
+          <w:color w:val="0E7490"/>
+          <w:sz w:val="28"/>
+          <w:lang w:val="fr-FR"/>
+        </w:rPr>
+        <w:t>9. DÉPLOIEMENT CLOUD (RENDER) &amp; RÉSILIENCE</w:t>
+      </w:r>
+    </w:p>
+    <w:p>
+      <w:r>
+        <w:rPr>
+          <w:lang w:val="fr-FR"/>
+        </w:rPr>
+        <w:t>La plateforme est déployée en production sur Render à l'adresse officielle : https://affinity-3l9i.onrender.com</w:t>
+      </w:r>
+    </w:p>
+    <w:p>
+      <w:pPr>
+        <w:pStyle w:val="ListBullet"/>
+      </w:pPr>
+      <w:r>
+        <w:rPr>
+          <w:b/>
+          <w:lang w:val="fr-FR"/>
+        </w:rPr>
+        <w:t xml:space="preserve">Déploiement Continu Automatisé : </w:t>
+      </w:r>
+      <w:r>
+        <w:rPr>
+          <w:lang w:val="fr-FR"/>
+        </w:rPr>
+        <w:t>Tout commit poussé sur la branche 'main' de GitHub déclenche instantanément la recompilation du conteneur Docker et sa mise en ligne.</w:t>
+      </w:r>
+    </w:p>
+    <w:p>
+      <w:pPr>
+        <w:pStyle w:val="ListBullet"/>
+      </w:pPr>
+      <w:r>
+        <w:rPr>
+          <w:b/>
+          <w:lang w:val="fr-FR"/>
+        </w:rPr>
+        <w:t xml:space="preserve">Comportement 502 Bad Gateway temporaire : </w:t>
+      </w:r>
+      <w:r>
+        <w:rPr>
+          <w:lang w:val="fr-FR"/>
+        </w:rPr>
+        <w:t>Pendant les 60 à 90 secondes nécessaires à l'extinction de l'ancienne version et à la montée en charge du nouveau conteneur, le proxy Render renvoie un statut transitoire 502. Dès l'écoute effective du port, le service redevient actif (200 OK) sans intervention.</w:t>
+      </w:r>
+    </w:p>
+    <w:p>
+      <w:pPr>
+        <w:pStyle w:val="ListBullet"/>
+      </w:pPr>
+      <w:r>
+        <w:rPr>
+          <w:b/>
+          <w:lang w:val="fr-FR"/>
+        </w:rPr>
+        <w:t xml:space="preserve">Support de Disque Persistant : </w:t>
+      </w:r>
+      <w:r>
+        <w:rPr>
+          <w:lang w:val="fr-FR"/>
+        </w:rPr>
+        <w:t>Le serveur détecte automatiquement les volumes persistants Render (/var/data ou /data). En l'absence de volume monté, il utilise la base initialisée 'affinity.db' issue du dépôt.</w:t>
+      </w:r>
+    </w:p>
+    <w:p>
+      <w:pPr>
+        <w:spacing w:before="280" w:after="120"/>
+      </w:pPr>
+      <w:r>
+        <w:rPr>
+          <w:b/>
+          <w:color w:val="0E7490"/>
+          <w:sz w:val="28"/>
+          <w:lang w:val="fr-FR"/>
+        </w:rPr>
+        <w:t>10. PROCÉDURE D'EXPLOITATION &amp; DÉMARRAGE MULTI-POSTES</w:t>
+      </w:r>
+    </w:p>
+    <w:p>
+      <w:r>
+        <w:rPr>
+          <w:lang w:val="fr-FR"/>
+        </w:rPr>
+        <w:t>L'application peut être exploitée sur n'importe quel ordinateur sous Windows 10 ou Windows 11 en suivant ces étapes simples :</w:t>
+      </w:r>
+    </w:p>
+    <w:p>
+      <w:pPr>
+        <w:spacing w:after="80"/>
+      </w:pPr>
+      <w:r>
+        <w:rPr>
+          <w:b/>
+          <w:color w:val="0E7490"/>
+          <w:lang w:val="fr-FR"/>
+        </w:rPr>
+        <w:t xml:space="preserve">Étape 1 — Démarrage Standard : </w:t>
+      </w:r>
+      <w:r>
+        <w:rPr>
+          <w:lang w:val="fr-FR"/>
+        </w:rPr>
+        <w:t>Double-cliquer sur 'Affinity.bat'. Le script démarre automatiquement le serveur en arrière-plan et ouvre la fenêtre applicative Edge en mode application bureau.</w:t>
+      </w:r>
+    </w:p>
+    <w:p>
+      <w:pPr>
+        <w:spacing w:after="80"/>
+      </w:pPr>
+      <w:r>
+        <w:rPr>
+          <w:b/>
+          <w:color w:val="0E7490"/>
+          <w:lang w:val="fr-FR"/>
+        </w:rPr>
+        <w:t xml:space="preserve">Étape 2 — Redémarrage du Serveur : </w:t>
+      </w:r>
+      <w:r>
+        <w:rPr>
+          <w:lang w:val="fr-FR"/>
+        </w:rPr>
+        <w:t>En cas de modification de code backend ou de mise à jour, double-cliquer sur 'Redemarrer_Affinity.bat'. Il tue le processus actif sur le port 8765 et relance le serveur.</w:t>
+      </w:r>
+    </w:p>
+    <w:p>
+      <w:pPr>
+        <w:spacing w:after="80"/>
+      </w:pPr>
+      <w:r>
+        <w:rPr>
+          <w:b/>
+          <w:color w:val="0E7490"/>
+          <w:lang w:val="fr-FR"/>
+        </w:rPr>
+        <w:t xml:space="preserve">Étape 3 — Sauvegarde Manuelle : </w:t>
+      </w:r>
+      <w:r>
+        <w:rPr>
+          <w:lang w:val="fr-FR"/>
+        </w:rPr>
+        <w:t>Double-cliquer sur 'Sauvegarder_Base_Locale.bat' pour créer une archive horodatée dans le dossier backups/.</w:t>
+      </w:r>
+    </w:p>
+    <w:p>
+      <w:pPr>
+        <w:spacing w:after="80"/>
+      </w:pPr>
+      <w:r>
+        <w:rPr>
+          <w:b/>
+          <w:color w:val="0E7490"/>
+          <w:lang w:val="fr-FR"/>
+        </w:rPr>
+        <w:t xml:space="preserve">Étape 4 — Installation sur un Nouveau PC : </w:t>
+      </w:r>
+      <w:r>
+        <w:rPr>
+          <w:lang w:val="fr-FR"/>
+        </w:rPr>
+        <w:t>Installer Python 3.10+ (en cochant 'Add Python to PATH') et Git. Cloner le dépôt : 'git clone https://github.com/AR30960/affinity.git', puis lancer 'Affinity.bat'.</w:t>
+      </w:r>
+    </w:p>
+    <w:p>
+      <w:pPr>
+        <w:spacing w:after="80"/>
+      </w:pPr>
+      <w:r>
+        <w:rPr>
+          <w:b/>
+          <w:color w:val="0E7490"/>
+          <w:lang w:val="fr-FR"/>
+        </w:rPr>
+        <w:t xml:space="preserve">Étape 5 — Synchronisation Multi-Postes : </w:t>
+      </w:r>
+      <w:r>
+        <w:rPr>
+          <w:lang w:val="fr-FR"/>
+        </w:rPr>
+        <w:t>Sur le poste de travail : 'git add .', 'git commit -m "..."', 'git push'. Sur le portable : 'git pull' pour récupérer instantanément tout le travail à jour.</w:t>
       </w:r>
     </w:p>
     <w:sectPr>
-      <w:pgSz w:w="12240" w:h="15840"/>
-      <w:pgMar w:top="1440" w:right="1440" w:bottom="1440" w:left="1440" w:header="720" w:footer="720" w:gutter="0"/>
+      <w:pgSz w:w="11909" w:h="16834"/>
+      <w:pgMar w:top="1296" w:right="1296" w:bottom="1296" w:left="1296" w:header="720" w:footer="720" w:gutter="0"/>
       <w:cols w:space="720"/>
       <w:docGrid w:linePitch="360"/>
     </w:sectPr>
@@ -1082,7 +3853,7 @@
         <w:rFonts w:asciiTheme="minorHAnsi" w:eastAsiaTheme="minorEastAsia" w:hAnsiTheme="minorHAnsi" w:cstheme="minorBidi"/>
         <w:sz w:val="22"/>
         <w:szCs w:val="22"/>
-        <w:lang w:val="en-US" w:eastAsia="en-US" w:bidi="ar-SA"/>
+        <w:lang w:val="fr-FR" w:eastAsia="fr-FR" w:bidi="ar-SA"/>
       </w:rPr>
     </w:rPrDefault>
     <w:pPrDefault>
@@ -1234,14 +4005,6 @@
     <w:name w:val="Normal"/>
     <w:qFormat/>
     <w:rsid w:val="00FC693F"/>
-    <w:pPr>
-      <w:spacing w:line="276" w:lineRule="auto" w:after="100"/>
-    </w:pPr>
-    <w:rPr>
-      <w:rFonts w:ascii="Consolas" w:hAnsi="Consolas"/>
-      <w:color w:val="0F172A"/>
-      <w:sz w:val="20"/>
-    </w:rPr>
   </w:style>
   <w:style w:type="paragraph" w:styleId="Header">
     <w:name w:val="header"/>

</xml_diff>

<commit_message>
docs: mise a jour complete des manuels utilisateur et technique avec argumentaire A la recherche de
</commit_message>
<xml_diff>
--- a/Manuel_Technique_Affinity.docx
+++ b/Manuel_Technique_Affinity.docx
@@ -4,44 +4,1006 @@
   <w:body>
     <w:p>
       <w:pPr>
+        <w:jc w:val="center"/>
+      </w:pPr>
+      <w:r>
+        <w:rPr>
+          <w:rFonts w:ascii="Calibri" w:hAnsi="Calibri"/>
+          <w:b/>
+          <w:color w:val="1E3A8A"/>
+          <w:sz w:val="56"/>
+        </w:rPr>
+        <w:t>AFFINITY — Manuel Technique</w:t>
+      </w:r>
+    </w:p>
+    <w:p>
+      <w:pPr>
+        <w:jc w:val="center"/>
+      </w:pPr>
+      <w:r>
+        <w:rPr>
+          <w:i/>
+          <w:color w:val="4B5563"/>
+          <w:sz w:val="26"/>
+        </w:rPr>
+        <w:t>Dossier d'Architecture Logicielle, Moteur d'Affinité Élective &amp; Guide d'Exploitation</w:t>
+      </w:r>
+    </w:p>
+    <w:p>
+      <w:pPr>
+        <w:jc w:val="center"/>
+      </w:pPr>
+      <w:r>
+        <w:rPr>
+          <w:color w:val="6B7280"/>
+          <w:sz w:val="20"/>
+        </w:rPr>
+        <w:t>Référence Projet : ARP001  |  Auteur : M. André ROGER  |  Version 2.0 (Septembre 2026)</w:t>
+      </w:r>
+    </w:p>
+    <w:p/>
+    <w:tbl>
+      <w:tblPr>
+        <w:tblW w:type="auto" w:w="0"/>
+        <w:jc w:val="center"/>
+        <w:tblLook w:firstColumn="1" w:firstRow="1" w:lastColumn="0" w:lastRow="0" w:noHBand="0" w:noVBand="1" w:val="04A0"/>
+      </w:tblPr>
+      <w:tblGrid>
+        <w:gridCol w:w="9360"/>
+      </w:tblGrid>
+      <w:tr>
+        <w:tc>
+          <w:tcPr>
+            <w:tcW w:type="dxa" w:w="9360"/>
+            <w:shd w:val="clear" w:color="auto" w:fill="F1F5F9"/>
+          </w:tcPr>
+          <w:p>
+            <w:pPr>
+              <w:spacing w:before="160" w:after="160"/>
+              <w:ind w:left="216" w:right="216"/>
+            </w:pPr>
+            <w:r>
+              <w:rPr>
+                <w:i/>
+                <w:color w:val="1E293B"/>
+                <w:sz w:val="21"/>
+              </w:rPr>
+              <w:t>Document technique de référence à destination des développeurs, administrateurs système et exploitants de la plateforme Affinity. Ce document détaille l'architecture logicielle, les mécanismes de concurrence SQLite WAL, la formalisation mathématique des algorithmes V-A-D-P et les spécifications de l'API REST.</w:t>
+            </w:r>
+          </w:p>
+        </w:tc>
+      </w:tr>
+    </w:tbl>
+    <w:p/>
+    <w:p>
+      <w:pPr>
+        <w:keepNext/>
         <w:spacing w:before="240" w:after="80"/>
       </w:pPr>
       <w:r>
         <w:rPr>
+          <w:rFonts w:ascii="Calibri" w:hAnsi="Calibri"/>
           <w:b/>
           <w:color w:val="0284C7"/>
-          <w:sz w:val="20"/>
-          <w:lang w:val="fr-FR"/>
+          <w:sz w:val="26"/>
         </w:rPr>
-        <w:t>PROJET ARP001 • PLATEFORME OFFICIELLE</w:t>
+        <w:t>TABLE DES MATIÈRES TECHNIQUE</w:t>
       </w:r>
     </w:p>
     <w:p>
       <w:pPr>
-        <w:spacing w:before="40" w:after="120"/>
+        <w:pStyle w:val="ListBullet"/>
+        <w:spacing w:before="0" w:after="60" w:line="276" w:lineRule="auto"/>
       </w:pPr>
       <w:r>
         <w:rPr>
-          <w:b/>
-          <w:color w:val="0F172A"/>
-          <w:sz w:val="44"/>
-          <w:lang w:val="fr-FR"/>
+          <w:rFonts w:ascii="Calibri" w:hAnsi="Calibri"/>
+          <w:color w:val="1F2937"/>
+          <w:sz w:val="22"/>
         </w:rPr>
-        <w:t>AFFINITY — Manuel Technique d'Architecture &amp; d'Exploitation</w:t>
+        <w:t>1. Vue d'Ensemble de l'Architecture &amp; Stack Technologique</w:t>
       </w:r>
     </w:p>
     <w:p>
       <w:pPr>
-        <w:spacing w:after="320"/>
+        <w:pStyle w:val="ListBullet"/>
+        <w:spacing w:before="0" w:after="60" w:line="276" w:lineRule="auto"/>
       </w:pPr>
       <w:r>
         <w:rPr>
-          <w:i/>
-          <w:color w:val="64748B"/>
-          <w:sz w:val="24"/>
-          <w:lang w:val="fr-FR"/>
+          <w:rFonts w:ascii="Calibri" w:hAnsi="Calibri"/>
+          <w:color w:val="1F2937"/>
+          <w:sz w:val="22"/>
         </w:rPr>
-        <w:t>Spécifications Architecturales, Moteur d'Affinité Élective, Diagnostic Identité, Sécurité &amp; Pérennité des Données</w:t>
+        <w:t>2. Haute Concurrence SQLite &amp; Mode Journal WAL (Windows / Multi-Threads)</w:t>
+      </w:r>
+    </w:p>
+    <w:p>
+      <w:pPr>
+        <w:pStyle w:val="ListBullet"/>
+        <w:spacing w:before="0" w:after="60" w:line="276" w:lineRule="auto"/>
+      </w:pPr>
+      <w:r>
+        <w:rPr>
+          <w:rFonts w:ascii="Calibri" w:hAnsi="Calibri"/>
+          <w:color w:val="1F2937"/>
+          <w:sz w:val="22"/>
+        </w:rPr>
+        <w:t>3. Modèle de Données &amp; Schéma Relationnel Complet (affinity.db)</w:t>
+      </w:r>
+    </w:p>
+    <w:p>
+      <w:pPr>
+        <w:pStyle w:val="ListBullet"/>
+        <w:spacing w:before="0" w:after="60" w:line="276" w:lineRule="auto"/>
+      </w:pPr>
+      <w:r>
+        <w:rPr>
+          <w:rFonts w:ascii="Calibri" w:hAnsi="Calibri"/>
+          <w:color w:val="1F2937"/>
+          <w:sz w:val="22"/>
+        </w:rPr>
+        <w:t>4. Moteur d'Identité &amp; Évaluation Croisée Classe 8 (evaluate_identity_compatibility)</w:t>
+      </w:r>
+    </w:p>
+    <w:p>
+      <w:pPr>
+        <w:pStyle w:val="ListBullet"/>
+        <w:spacing w:before="0" w:after="60" w:line="276" w:lineRule="auto"/>
+      </w:pPr>
+      <w:r>
+        <w:rPr>
+          <w:rFonts w:ascii="Calibri" w:hAnsi="Calibri"/>
+          <w:color w:val="1F2937"/>
+          <w:sz w:val="22"/>
+        </w:rPr>
+        <w:t>5. Algorithme du Moteur d'Affinité Canonique (calculate_affinity &amp; V-A-D-P)</w:t>
+      </w:r>
+    </w:p>
+    <w:p>
+      <w:pPr>
+        <w:pStyle w:val="ListBullet"/>
+        <w:spacing w:before="0" w:after="60" w:line="276" w:lineRule="auto"/>
+      </w:pPr>
+      <w:r>
+        <w:rPr>
+          <w:rFonts w:ascii="Calibri" w:hAnsi="Calibri"/>
+          <w:color w:val="1F2937"/>
+          <w:sz w:val="22"/>
+        </w:rPr>
+        <w:t>6. Négociation Réciproque du Niveau de Restitution par Classe (% vs Détail)</w:t>
+      </w:r>
+    </w:p>
+    <w:p>
+      <w:pPr>
+        <w:pStyle w:val="ListBullet"/>
+        <w:spacing w:before="0" w:after="60" w:line="276" w:lineRule="auto"/>
+      </w:pPr>
+      <w:r>
+        <w:rPr>
+          <w:rFonts w:ascii="Calibri" w:hAnsi="Calibri"/>
+          <w:color w:val="1F2937"/>
+          <w:sz w:val="22"/>
+        </w:rPr>
+        <w:t>7. Supervision Administrateur &amp; Matchs Discrets Confidentiels</w:t>
+      </w:r>
+    </w:p>
+    <w:p>
+      <w:pPr>
+        <w:pStyle w:val="ListBullet"/>
+        <w:spacing w:before="0" w:after="60" w:line="276" w:lineRule="auto"/>
+      </w:pPr>
+      <w:r>
+        <w:rPr>
+          <w:rFonts w:ascii="Calibri" w:hAnsi="Calibri"/>
+          <w:color w:val="1F2937"/>
+          <w:sz w:val="22"/>
+        </w:rPr>
+        <w:t>8. Spécification Complète des API REST (Endpoints HTTP GET, POST, PUT, DELETE)</w:t>
+      </w:r>
+    </w:p>
+    <w:p>
+      <w:pPr>
+        <w:pStyle w:val="ListBullet"/>
+        <w:spacing w:before="0" w:after="60" w:line="276" w:lineRule="auto"/>
+      </w:pPr>
+      <w:r>
+        <w:rPr>
+          <w:rFonts w:ascii="Calibri" w:hAnsi="Calibri"/>
+          <w:color w:val="1F2937"/>
+          <w:sz w:val="22"/>
+        </w:rPr>
+        <w:t>9. Sauvegardes Locales, Sécurité &amp; Déploiement Continu (Render / Windows 10 &amp; 11)</w:t>
+      </w:r>
+    </w:p>
+    <w:p/>
+    <w:p>
+      <w:pPr>
+        <w:keepNext/>
+        <w:spacing w:before="360" w:after="120"/>
+      </w:pPr>
+      <w:r>
+        <w:rPr>
+          <w:rFonts w:ascii="Calibri" w:hAnsi="Calibri"/>
+          <w:b/>
+          <w:color w:val="1E3A8A"/>
+          <w:sz w:val="32"/>
+        </w:rPr>
+        <w:t>1. VUE D'ENSEMBLE DE L'ARCHITECTURE &amp; CHOIX TECHNIQUES</w:t>
+      </w:r>
+    </w:p>
+    <w:p>
+      <w:pPr>
+        <w:spacing w:before="0" w:after="120" w:line="276" w:lineRule="auto"/>
+      </w:pPr>
+      <w:r>
+        <w:rPr>
+          <w:rFonts w:ascii="Calibri" w:hAnsi="Calibri"/>
+          <w:color w:val="1F2937"/>
+          <w:sz w:val="22"/>
+        </w:rPr>
+        <w:t>Affinity (ARP001) est une application hybride Web &amp; Locale ultra-légère conçue sans frameworks lourds pour maximiser les performances, l'autonomie et la pérennité :</w:t>
+      </w:r>
+    </w:p>
+    <w:p>
+      <w:pPr>
+        <w:pStyle w:val="ListBullet"/>
+        <w:spacing w:before="0" w:after="60" w:line="276" w:lineRule="auto"/>
+      </w:pPr>
+      <w:r>
+        <w:rPr>
+          <w:rFonts w:ascii="Calibri" w:hAnsi="Calibri"/>
+          <w:b/>
+          <w:color w:val="1E3A8A"/>
+          <w:sz w:val="22"/>
+        </w:rPr>
+        <w:t xml:space="preserve">• Frontend SPA (Single Page Application) : </w:t>
+      </w:r>
+      <w:r>
+        <w:rPr>
+          <w:rFonts w:ascii="Calibri" w:hAnsi="Calibri"/>
+          <w:color w:val="1F2937"/>
+          <w:sz w:val="22"/>
+        </w:rPr>
+        <w:t>HTML5 sémantique, CSS3 Vanilla moderne (variables, glassmorphism, flexbox/grid responsive) et JavaScript ES6+ pur sans dépendance externe npm.</w:t>
+      </w:r>
+    </w:p>
+    <w:p>
+      <w:pPr>
+        <w:pStyle w:val="ListBullet"/>
+        <w:spacing w:before="0" w:after="60" w:line="276" w:lineRule="auto"/>
+      </w:pPr>
+      <w:r>
+        <w:rPr>
+          <w:rFonts w:ascii="Calibri" w:hAnsi="Calibri"/>
+          <w:b/>
+          <w:color w:val="1E3A8A"/>
+          <w:sz w:val="22"/>
+        </w:rPr>
+        <w:t xml:space="preserve">• Backend Python 3 Haute Performance : </w:t>
+      </w:r>
+      <w:r>
+        <w:rPr>
+          <w:rFonts w:ascii="Calibri" w:hAnsi="Calibri"/>
+          <w:color w:val="1F2937"/>
+          <w:sz w:val="22"/>
+        </w:rPr>
+        <w:t>Serveur HTTP multithreadé basé sur le module natif Python socketserver.ThreadingMixIn et http.server, garantissant une exécution instantanée sur Windows 10/11 sans conteneurisation obligatoire.</w:t>
+      </w:r>
+    </w:p>
+    <w:p>
+      <w:pPr>
+        <w:pStyle w:val="ListBullet"/>
+        <w:spacing w:before="0" w:after="60" w:line="276" w:lineRule="auto"/>
+      </w:pPr>
+      <w:r>
+        <w:rPr>
+          <w:rFonts w:ascii="Calibri" w:hAnsi="Calibri"/>
+          <w:b/>
+          <w:color w:val="1E3A8A"/>
+          <w:sz w:val="22"/>
+        </w:rPr>
+        <w:t xml:space="preserve">• Moteur de Persistance SQLite3 : </w:t>
+      </w:r>
+      <w:r>
+        <w:rPr>
+          <w:rFonts w:ascii="Calibri" w:hAnsi="Calibri"/>
+          <w:color w:val="1F2937"/>
+          <w:sz w:val="22"/>
+        </w:rPr>
+        <w:t>Base relationnelle SQLite3 autonome (affinity.db) hautement optimisée, gérée directement par requêtes SQL paramétrées sans surcouche ORM opaque.</w:t>
+      </w:r>
+    </w:p>
+    <w:p>
+      <w:pPr>
+        <w:keepNext/>
+        <w:spacing w:before="360" w:after="120"/>
+      </w:pPr>
+      <w:r>
+        <w:rPr>
+          <w:rFonts w:ascii="Calibri" w:hAnsi="Calibri"/>
+          <w:b/>
+          <w:color w:val="1E3A8A"/>
+          <w:sz w:val="32"/>
+        </w:rPr>
+        <w:t>2. HAUTE CONCURRENCE SQLITE &amp; MODE JOURNAL WAL</w:t>
+      </w:r>
+    </w:p>
+    <w:p>
+      <w:pPr>
+        <w:spacing w:before="0" w:after="120" w:line="276" w:lineRule="auto"/>
+      </w:pPr>
+      <w:r>
+        <w:rPr>
+          <w:rFonts w:ascii="Calibri" w:hAnsi="Calibri"/>
+          <w:color w:val="1F2937"/>
+          <w:sz w:val="22"/>
+        </w:rPr>
+        <w:t>Face aux contraintes multi-threads sous Windows (où les opérations concurrentes d'écriture pouvaient provoquer l'erreur database is locked), l'architecture de données a été renforcée :</w:t>
+      </w:r>
+    </w:p>
+    <w:p>
+      <w:pPr>
+        <w:pStyle w:val="ListBullet"/>
+        <w:spacing w:before="0" w:after="60" w:line="276" w:lineRule="auto"/>
+      </w:pPr>
+      <w:r>
+        <w:rPr>
+          <w:rFonts w:ascii="Calibri" w:hAnsi="Calibri"/>
+          <w:b/>
+          <w:color w:val="1E3A8A"/>
+          <w:sz w:val="22"/>
+        </w:rPr>
+        <w:t xml:space="preserve">• Timeout de Verrouillage Dédié : </w:t>
+      </w:r>
+      <w:r>
+        <w:rPr>
+          <w:rFonts w:ascii="Calibri" w:hAnsi="Calibri"/>
+          <w:color w:val="1F2937"/>
+          <w:sz w:val="22"/>
+        </w:rPr>
+        <w:t>Chaque connexion ouverte par get_db() applique systématiquement un timeout étendu de 30.0 secondes (sqlite3.connect(DB_PATH, timeout=30.0)).</w:t>
+      </w:r>
+    </w:p>
+    <w:p>
+      <w:pPr>
+        <w:pStyle w:val="ListBullet"/>
+        <w:spacing w:before="0" w:after="60" w:line="276" w:lineRule="auto"/>
+      </w:pPr>
+      <w:r>
+        <w:rPr>
+          <w:rFonts w:ascii="Calibri" w:hAnsi="Calibri"/>
+          <w:b/>
+          <w:color w:val="1E3A8A"/>
+          <w:sz w:val="22"/>
+        </w:rPr>
+        <w:t xml:space="preserve">• Pragma Busy Timeout : </w:t>
+      </w:r>
+      <w:r>
+        <w:rPr>
+          <w:rFonts w:ascii="Calibri" w:hAnsi="Calibri"/>
+          <w:color w:val="1F2937"/>
+          <w:sz w:val="22"/>
+        </w:rPr>
+        <w:t>Exécution de PRAGMA busy_timeout = 30000 ordonnant au moteur SQLite de réitérer automatiquement ses requêtes d'écriture jusqu'à libération du verrou.</w:t>
+      </w:r>
+    </w:p>
+    <w:p>
+      <w:pPr>
+        <w:pStyle w:val="ListBullet"/>
+        <w:spacing w:before="0" w:after="60" w:line="276" w:lineRule="auto"/>
+      </w:pPr>
+      <w:r>
+        <w:rPr>
+          <w:rFonts w:ascii="Calibri" w:hAnsi="Calibri"/>
+          <w:b/>
+          <w:color w:val="1E3A8A"/>
+          <w:sz w:val="22"/>
+        </w:rPr>
+        <w:t xml:space="preserve">• Mode Journal WAL (Write-Ahead Logging) : </w:t>
+      </w:r>
+      <w:r>
+        <w:rPr>
+          <w:rFonts w:ascii="Calibri" w:hAnsi="Calibri"/>
+          <w:color w:val="1F2937"/>
+          <w:sz w:val="22"/>
+        </w:rPr>
+        <w:t>Activation au démarrage dans init_db() du mode Write-Ahead Logging (PRAGMA journal_mode = WAL). Ce mode permet aux lecteurs de lire la base sans bloquer les écrivains, et aux écrivains d'insérer des données sans interrompre les consultations.</w:t>
+      </w:r>
+    </w:p>
+    <w:p>
+      <w:pPr>
+        <w:keepNext/>
+        <w:spacing w:before="360" w:after="120"/>
+      </w:pPr>
+      <w:r>
+        <w:rPr>
+          <w:rFonts w:ascii="Calibri" w:hAnsi="Calibri"/>
+          <w:b/>
+          <w:color w:val="1E3A8A"/>
+          <w:sz w:val="32"/>
+        </w:rPr>
+        <w:t>3. MODÈLE DE DONNÉES &amp; SCHÉMA RELATIONNEL (affinity.db)</w:t>
+      </w:r>
+    </w:p>
+    <w:p>
+      <w:pPr>
+        <w:spacing w:before="0" w:after="120" w:line="276" w:lineRule="auto"/>
+      </w:pPr>
+      <w:r>
+        <w:rPr>
+          <w:rFonts w:ascii="Calibri" w:hAnsi="Calibri"/>
+          <w:color w:val="1F2937"/>
+          <w:sz w:val="22"/>
+        </w:rPr>
+        <w:t>Le schéma relationnel structure l'ensemble de l'écosystème :</w:t>
+      </w:r>
+    </w:p>
+    <w:p>
+      <w:pPr>
+        <w:pStyle w:val="ListBullet"/>
+        <w:spacing w:before="0" w:after="60" w:line="276" w:lineRule="auto"/>
+      </w:pPr>
+      <w:r>
+        <w:rPr>
+          <w:rFonts w:ascii="Calibri" w:hAnsi="Calibri"/>
+          <w:b/>
+          <w:color w:val="1E3A8A"/>
+          <w:sz w:val="22"/>
+        </w:rPr>
+        <w:t xml:space="preserve">• profiles : </w:t>
+      </w:r>
+      <w:r>
+        <w:rPr>
+          <w:rFonts w:ascii="Calibri" w:hAnsi="Calibri"/>
+          <w:color w:val="1F2937"/>
+          <w:sz w:val="22"/>
+        </w:rPr>
+        <w:t>id (PK AUTO), pseudo (UNIQUE), code_profil (UNIQUE), avatar, role ('admin', 'subscriber', 'guest'), password_hash (SHA-256), salt, created_at.</w:t>
+      </w:r>
+    </w:p>
+    <w:p>
+      <w:pPr>
+        <w:pStyle w:val="ListBullet"/>
+        <w:spacing w:before="0" w:after="60" w:line="276" w:lineRule="auto"/>
+      </w:pPr>
+      <w:r>
+        <w:rPr>
+          <w:rFonts w:ascii="Calibri" w:hAnsi="Calibri"/>
+          <w:b/>
+          <w:color w:val="1E3A8A"/>
+          <w:sz w:val="22"/>
+        </w:rPr>
+        <w:t xml:space="preserve">• identity_cards : </w:t>
+      </w:r>
+      <w:r>
+        <w:rPr>
+          <w:rFonts w:ascii="Calibri" w:hAnsi="Calibri"/>
+          <w:color w:val="1F2937"/>
+          <w:sz w:val="22"/>
+        </w:rPr>
+        <w:t>profile_id (PK, FK), nom, prenom, sexe (1: Homme, 2: Femme), date_naissance, ville, habite_pays, habite_region_dept, habite_commune, travail_commune, taille, poids, pointure, tour_poitrine, tour_taille, tour_hanches, origines, couleur_cheveux, style, situation_famille, recherche_de, bio.</w:t>
+      </w:r>
+    </w:p>
+    <w:p>
+      <w:pPr>
+        <w:pStyle w:val="ListBullet"/>
+        <w:spacing w:before="0" w:after="60" w:line="276" w:lineRule="auto"/>
+      </w:pPr>
+      <w:r>
+        <w:rPr>
+          <w:rFonts w:ascii="Calibri" w:hAnsi="Calibri"/>
+          <w:b/>
+          <w:color w:val="1E3A8A"/>
+          <w:sz w:val="22"/>
+        </w:rPr>
+        <w:t xml:space="preserve">• questions : </w:t>
+      </w:r>
+      <w:r>
+        <w:rPr>
+          <w:rFonts w:ascii="Calibri" w:hAnsi="Calibri"/>
+          <w:color w:val="1F2937"/>
+          <w:sz w:val="22"/>
+        </w:rPr>
+        <w:t>id (PK), pack_id (FK), cible (0: Mixte, 1: Homme, 2: Femme), classe (0, 1, 2, 3, 4, 5, 8, 9), thematique, sujet, type ('G', 'M', 'P', 'T'), texte, config_reponses (JSON), status ('validated', 'pending_review'), n_quest_lie (lien vers question mère ou question miroir).</w:t>
+      </w:r>
+    </w:p>
+    <w:p>
+      <w:pPr>
+        <w:pStyle w:val="ListBullet"/>
+        <w:spacing w:before="0" w:after="60" w:line="276" w:lineRule="auto"/>
+      </w:pPr>
+      <w:r>
+        <w:rPr>
+          <w:rFonts w:ascii="Calibri" w:hAnsi="Calibri"/>
+          <w:b/>
+          <w:color w:val="1E3A8A"/>
+          <w:sz w:val="22"/>
+        </w:rPr>
+        <w:t xml:space="preserve">• answers : </w:t>
+      </w:r>
+      <w:r>
+        <w:rPr>
+          <w:rFonts w:ascii="Calibri" w:hAnsi="Calibri"/>
+          <w:color w:val="1F2937"/>
+          <w:sz w:val="22"/>
+        </w:rPr>
+        <w:t>profile_id, question_id, axis ('G', 'V', 'A', 'D', 'P'), value (INTEGER 1..5 ou 9), updated_at.</w:t>
+      </w:r>
+    </w:p>
+    <w:p>
+      <w:pPr>
+        <w:pStyle w:val="ListBullet"/>
+        <w:spacing w:before="0" w:after="60" w:line="276" w:lineRule="auto"/>
+      </w:pPr>
+      <w:r>
+        <w:rPr>
+          <w:rFonts w:ascii="Calibri" w:hAnsi="Calibri"/>
+          <w:b/>
+          <w:color w:val="1E3A8A"/>
+          <w:sz w:val="22"/>
+        </w:rPr>
+        <w:t xml:space="preserve">• identity_answers_self (Module + sur moi) : </w:t>
+      </w:r>
+      <w:r>
+        <w:rPr>
+          <w:rFonts w:ascii="Calibri" w:hAnsi="Calibri"/>
+          <w:color w:val="1F2937"/>
+          <w:sz w:val="22"/>
+        </w:rPr>
+        <w:t>profile_id, question_id, valeur_num (REAL), valeur_text (TEXT), updated_at.</w:t>
+      </w:r>
+    </w:p>
+    <w:p>
+      <w:pPr>
+        <w:pStyle w:val="ListBullet"/>
+        <w:spacing w:before="0" w:after="60" w:line="276" w:lineRule="auto"/>
+      </w:pPr>
+      <w:r>
+        <w:rPr>
+          <w:rFonts w:ascii="Calibri" w:hAnsi="Calibri"/>
+          <w:b/>
+          <w:color w:val="1E3A8A"/>
+          <w:sz w:val="22"/>
+        </w:rPr>
+        <w:t xml:space="preserve">• identity_answers_partner (Module + sur l'autre) : </w:t>
+      </w:r>
+      <w:r>
+        <w:rPr>
+          <w:rFonts w:ascii="Calibri" w:hAnsi="Calibri"/>
+          <w:color w:val="1F2937"/>
+          <w:sz w:val="22"/>
+        </w:rPr>
+        <w:t>profile_id, question_id, min_val (REAL), max_val (REAL), options_json (TEXT JSON), indifferent (0/1), updated_at.</w:t>
+      </w:r>
+    </w:p>
+    <w:p>
+      <w:pPr>
+        <w:pStyle w:val="ListBullet"/>
+        <w:spacing w:before="0" w:after="60" w:line="276" w:lineRule="auto"/>
+      </w:pPr>
+      <w:r>
+        <w:rPr>
+          <w:rFonts w:ascii="Calibri" w:hAnsi="Calibri"/>
+          <w:b/>
+          <w:color w:val="1E3A8A"/>
+          <w:sz w:val="22"/>
+        </w:rPr>
+        <w:t xml:space="preserve">• match_requests : </w:t>
+      </w:r>
+      <w:r>
+        <w:rPr>
+          <w:rFonts w:ascii="Calibri" w:hAnsi="Calibri"/>
+          <w:color w:val="1F2937"/>
+          <w:sz w:val="22"/>
+        </w:rPr>
+        <w:t>id (PK AUTO), sender_id (FK), receiver_id (FK), status ('pending', 'accepted', 'rejected'), allowed_classes (JSON), restitution_mode (TEXT ou JSON dictionnaire), is_discreet (0/1), created_at, responded_at.</w:t>
+      </w:r>
+    </w:p>
+    <w:p>
+      <w:pPr>
+        <w:pStyle w:val="ListBullet"/>
+        <w:spacing w:before="0" w:after="60" w:line="276" w:lineRule="auto"/>
+      </w:pPr>
+      <w:r>
+        <w:rPr>
+          <w:rFonts w:ascii="Calibri" w:hAnsi="Calibri"/>
+          <w:b/>
+          <w:color w:val="1E3A8A"/>
+          <w:sz w:val="22"/>
+        </w:rPr>
+        <w:t xml:space="preserve">• admin_access_requests : </w:t>
+      </w:r>
+      <w:r>
+        <w:rPr>
+          <w:rFonts w:ascii="Calibri" w:hAnsi="Calibri"/>
+          <w:color w:val="1F2937"/>
+          <w:sz w:val="22"/>
+        </w:rPr>
+        <w:t>id (PK AUTO), profile_id (FK), target_type ('classe', 'pack'), target_value, action_type ('grant', 'revoke'), status ('pending', 'approved', 'rejected'), created_at, responded_at.</w:t>
+      </w:r>
+    </w:p>
+    <w:p>
+      <w:pPr>
+        <w:pStyle w:val="ListBullet"/>
+        <w:spacing w:before="0" w:after="60" w:line="276" w:lineRule="auto"/>
+      </w:pPr>
+      <w:r>
+        <w:rPr>
+          <w:rFonts w:ascii="Calibri" w:hAnsi="Calibri"/>
+          <w:b/>
+          <w:color w:val="1E3A8A"/>
+          <w:sz w:val="22"/>
+        </w:rPr>
+        <w:t xml:space="preserve">• profile_question_access : </w:t>
+      </w:r>
+      <w:r>
+        <w:rPr>
+          <w:rFonts w:ascii="Calibri" w:hAnsi="Calibri"/>
+          <w:color w:val="1F2937"/>
+          <w:sz w:val="22"/>
+        </w:rPr>
+        <w:t>profile_id (PK, FK), allowed_classes (JSON list d'entiers), allowed_packs (JSON list d'entiers), updated_at.</w:t>
+      </w:r>
+    </w:p>
+    <w:p>
+      <w:pPr>
+        <w:keepNext/>
+        <w:spacing w:before="360" w:after="120"/>
+      </w:pPr>
+      <w:r>
+        <w:rPr>
+          <w:rFonts w:ascii="Calibri" w:hAnsi="Calibri"/>
+          <w:b/>
+          <w:color w:val="1E3A8A"/>
+          <w:sz w:val="32"/>
+        </w:rPr>
+        <w:t>4. MOTEUR D'IDENTITÉ &amp; ÉVALUATION CROISÉE CLASSE 8</w:t>
+      </w:r>
+    </w:p>
+    <w:p>
+      <w:pPr>
+        <w:spacing w:before="0" w:after="120" w:line="276" w:lineRule="auto"/>
+      </w:pPr>
+      <w:r>
+        <w:rPr>
+          <w:rFonts w:ascii="Calibri" w:hAnsi="Calibri"/>
+          <w:color w:val="1F2937"/>
+          <w:sz w:val="22"/>
+        </w:rPr>
+        <w:t>La fonction evaluate_identity_compatibility(profile1_id, profile2_id, conn) opère une vérification stricte en miroir :</w:t>
+      </w:r>
+    </w:p>
+    <w:p>
+      <w:pPr>
+        <w:pStyle w:val="ListBullet"/>
+        <w:spacing w:before="0" w:after="60" w:line="276" w:lineRule="auto"/>
+      </w:pPr>
+      <w:r>
+        <w:rPr>
+          <w:rFonts w:ascii="Calibri" w:hAnsi="Calibri"/>
+          <w:b/>
+          <w:color w:val="1E3A8A"/>
+          <w:sz w:val="22"/>
+        </w:rPr>
+        <w:t xml:space="preserve">• Sens 1 (Attentes de P1 envers P2) : </w:t>
+      </w:r>
+      <w:r>
+        <w:rPr>
+          <w:rFonts w:ascii="Calibri" w:hAnsi="Calibri"/>
+          <w:color w:val="1F2937"/>
+          <w:sz w:val="22"/>
+        </w:rPr>
+        <w:t>Vérifie si les caractéristiques déclarées par P2 (identity_answers_self de P2) satisfont les exigences définies par P1 (identity_answers_partner de P1).</w:t>
+      </w:r>
+    </w:p>
+    <w:p>
+      <w:pPr>
+        <w:pStyle w:val="ListBullet"/>
+        <w:spacing w:before="0" w:after="60" w:line="276" w:lineRule="auto"/>
+      </w:pPr>
+      <w:r>
+        <w:rPr>
+          <w:rFonts w:ascii="Calibri" w:hAnsi="Calibri"/>
+          <w:b/>
+          <w:color w:val="1E3A8A"/>
+          <w:sz w:val="22"/>
+        </w:rPr>
+        <w:t xml:space="preserve">• Sens 2 (Attentes de P2 envers P1) : </w:t>
+      </w:r>
+      <w:r>
+        <w:rPr>
+          <w:rFonts w:ascii="Calibri" w:hAnsi="Calibri"/>
+          <w:color w:val="1F2937"/>
+          <w:sz w:val="22"/>
+        </w:rPr>
+        <w:t>Vérifie symétriquement si les caractéristiques de P1 satisfont les attentes de P2.</w:t>
+      </w:r>
+    </w:p>
+    <w:p>
+      <w:pPr>
+        <w:pStyle w:val="ListBullet"/>
+        <w:spacing w:before="0" w:after="60" w:line="276" w:lineRule="auto"/>
+      </w:pPr>
+      <w:r>
+        <w:rPr>
+          <w:rFonts w:ascii="Calibri" w:hAnsi="Calibri"/>
+          <w:b/>
+          <w:color w:val="1E3A8A"/>
+          <w:sz w:val="22"/>
+        </w:rPr>
+        <w:t xml:space="preserve">• Évaluation Numérique : </w:t>
+      </w:r>
+      <w:r>
+        <w:rPr>
+          <w:rFonts w:ascii="Calibri" w:hAnsi="Calibri"/>
+          <w:color w:val="1F2937"/>
+          <w:sz w:val="22"/>
+        </w:rPr>
+        <w:t>Pour les dimensions numériques (mode: numeric : taille, poids, pointure, tour de poitrine), vérifie min_val &lt;= valeur &lt;= max_val.</w:t>
+      </w:r>
+    </w:p>
+    <w:p>
+      <w:pPr>
+        <w:pStyle w:val="ListBullet"/>
+        <w:spacing w:before="0" w:after="60" w:line="276" w:lineRule="auto"/>
+      </w:pPr>
+      <w:r>
+        <w:rPr>
+          <w:rFonts w:ascii="Calibri" w:hAnsi="Calibri"/>
+          <w:b/>
+          <w:color w:val="1E3A8A"/>
+          <w:sz w:val="22"/>
+        </w:rPr>
+        <w:t xml:space="preserve">• Évaluation Qualitative : </w:t>
+      </w:r>
+      <w:r>
+        <w:rPr>
+          <w:rFonts w:ascii="Calibri" w:hAnsi="Calibri"/>
+          <w:color w:val="1F2937"/>
+          <w:sz w:val="22"/>
+        </w:rPr>
+        <w:t>Pour les sélections qualitatives (mode: select : silhouette, yeux, cheveux, barbe, tabac, alcool, alimentation, sport, animaux, tatouages), vérifie la présence de la valeur dans la liste des options acceptées.</w:t>
+      </w:r>
+    </w:p>
+    <w:p>
+      <w:pPr>
+        <w:pStyle w:val="ListBullet"/>
+        <w:spacing w:before="0" w:after="60" w:line="276" w:lineRule="auto"/>
+      </w:pPr>
+      <w:r>
+        <w:rPr>
+          <w:rFonts w:ascii="Calibri" w:hAnsi="Calibri"/>
+          <w:b/>
+          <w:color w:val="1E3A8A"/>
+          <w:sz w:val="22"/>
+        </w:rPr>
+        <w:t xml:space="preserve">• Règle de l'Indifférence : </w:t>
+      </w:r>
+      <w:r>
+        <w:rPr>
+          <w:rFonts w:ascii="Calibri" w:hAnsi="Calibri"/>
+          <w:color w:val="1F2937"/>
+          <w:sz w:val="22"/>
+        </w:rPr>
+        <w:t>Si le critère comporte indifferent = 1, la dimension est immédiatement déclarée COMPATIBLE.</w:t>
+      </w:r>
+    </w:p>
+    <w:p>
+      <w:pPr>
+        <w:pStyle w:val="ListBullet"/>
+        <w:spacing w:before="0" w:after="60" w:line="276" w:lineRule="auto"/>
+      </w:pPr>
+      <w:r>
+        <w:rPr>
+          <w:rFonts w:ascii="Calibri" w:hAnsi="Calibri"/>
+          <w:b/>
+          <w:color w:val="1E3A8A"/>
+          <w:sz w:val="22"/>
+        </w:rPr>
+        <w:t xml:space="preserve">• Niveaux de Synthèse : </w:t>
+      </w:r>
+      <w:r>
+        <w:rPr>
+          <w:rFonts w:ascii="Calibri" w:hAnsi="Calibri"/>
+          <w:color w:val="1F2937"/>
+          <w:sz w:val="22"/>
+        </w:rPr>
+        <w:t>Retourne COMPATIBLE (100% de concordance), PARTIEL (score &gt;= 60%), ou INCOMPATIBLE.</w:t>
+      </w:r>
+    </w:p>
+    <w:p>
+      <w:pPr>
+        <w:keepNext/>
+        <w:spacing w:before="360" w:after="120"/>
+      </w:pPr>
+      <w:r>
+        <w:rPr>
+          <w:rFonts w:ascii="Calibri" w:hAnsi="Calibri"/>
+          <w:b/>
+          <w:color w:val="1E3A8A"/>
+          <w:sz w:val="32"/>
+        </w:rPr>
+        <w:t>5. ALGORITHME DU MOTEUR D'AFFINITÉ (V-A-D-P)</w:t>
+      </w:r>
+    </w:p>
+    <w:p>
+      <w:pPr>
+        <w:spacing w:before="0" w:after="120" w:line="276" w:lineRule="auto"/>
+      </w:pPr>
+      <w:r>
+        <w:rPr>
+          <w:rFonts w:ascii="Calibri" w:hAnsi="Calibri"/>
+          <w:color w:val="1F2937"/>
+          <w:sz w:val="22"/>
+        </w:rPr>
+        <w:t>La fonction calculate_affinity(p1_id, p2_id, allowed_classes, mode_restitution) réalise le calcul mathématique complet :</w:t>
+      </w:r>
+    </w:p>
+    <w:p>
+      <w:pPr>
+        <w:pStyle w:val="ListBullet"/>
+        <w:spacing w:before="0" w:after="60" w:line="276" w:lineRule="auto"/>
+      </w:pPr>
+      <w:r>
+        <w:rPr>
+          <w:rFonts w:ascii="Calibri" w:hAnsi="Calibri"/>
+          <w:b/>
+          <w:color w:val="1E3A8A"/>
+          <w:sz w:val="22"/>
+        </w:rPr>
+        <w:t xml:space="preserve">• Similarité Type G : </w:t>
+      </w:r>
+      <w:r>
+        <w:rPr>
+          <w:rFonts w:ascii="Calibri" w:hAnsi="Calibri"/>
+          <w:color w:val="1F2937"/>
+          <w:sz w:val="22"/>
+        </w:rPr>
+        <w:t>Calculée sur l'écart absolu |v1 - v2| ramené sur [0, 1]. Le code 9 (Pas du tout / Jamais) est normalisé à 0.0.</w:t>
+      </w:r>
+    </w:p>
+    <w:p>
+      <w:pPr>
+        <w:pStyle w:val="ListBullet"/>
+        <w:spacing w:before="0" w:after="60" w:line="276" w:lineRule="auto"/>
+      </w:pPr>
+      <w:r>
+        <w:rPr>
+          <w:rFonts w:ascii="Calibri" w:hAnsi="Calibri"/>
+          <w:b/>
+          <w:color w:val="1E3A8A"/>
+          <w:sz w:val="22"/>
+        </w:rPr>
+        <w:t xml:space="preserve">• Axe V (Vécu) : </w:t>
+      </w:r>
+      <w:r>
+        <w:rPr>
+          <w:rFonts w:ascii="Calibri" w:hAnsi="Calibri"/>
+          <w:color w:val="1F2937"/>
+          <w:sz w:val="22"/>
+        </w:rPr>
+        <w:t>Similarité sur l'expérience vécue dans le passé.</w:t>
+      </w:r>
+    </w:p>
+    <w:p>
+      <w:pPr>
+        <w:pStyle w:val="ListBullet"/>
+        <w:spacing w:before="0" w:after="60" w:line="276" w:lineRule="auto"/>
+      </w:pPr>
+      <w:r>
+        <w:rPr>
+          <w:rFonts w:ascii="Calibri" w:hAnsi="Calibri"/>
+          <w:b/>
+          <w:color w:val="1E3A8A"/>
+          <w:sz w:val="22"/>
+        </w:rPr>
+        <w:t xml:space="preserve">• Axe A (Actuel) : </w:t>
+      </w:r>
+      <w:r>
+        <w:rPr>
+          <w:rFonts w:ascii="Calibri" w:hAnsi="Calibri"/>
+          <w:color w:val="1F2937"/>
+          <w:sz w:val="22"/>
+        </w:rPr>
+        <w:t>Similarité sur les habitudes actuelles partagées.</w:t>
+      </w:r>
+    </w:p>
+    <w:p>
+      <w:pPr>
+        <w:pStyle w:val="ListBullet"/>
+        <w:spacing w:before="0" w:after="60" w:line="276" w:lineRule="auto"/>
+      </w:pPr>
+      <w:r>
+        <w:rPr>
+          <w:rFonts w:ascii="Calibri" w:hAnsi="Calibri"/>
+          <w:b/>
+          <w:color w:val="1E3A8A"/>
+          <w:sz w:val="22"/>
+        </w:rPr>
+        <w:t xml:space="preserve">• Synergie Croisée D ⇄ P : </w:t>
+      </w:r>
+      <w:r>
+        <w:rPr>
+          <w:rFonts w:ascii="Calibri" w:hAnsi="Calibri"/>
+          <w:color w:val="1F2937"/>
+          <w:sz w:val="22"/>
+        </w:rPr>
+        <w:t>Croise le désir de découverte de P1 avec l'acceptation de partage de P2 : sim(P1_D, P2_P) et sim(P2_D, P1_P).</w:t>
+      </w:r>
+    </w:p>
+    <w:p>
+      <w:pPr>
+        <w:pStyle w:val="ListBullet"/>
+        <w:spacing w:before="0" w:after="60" w:line="276" w:lineRule="auto"/>
+      </w:pPr>
+      <w:r>
+        <w:rPr>
+          <w:rFonts w:ascii="Calibri" w:hAnsi="Calibri"/>
+          <w:b/>
+          <w:color w:val="1E3A8A"/>
+          <w:sz w:val="22"/>
+        </w:rPr>
+        <w:t xml:space="preserve">• Pondération par Classe : </w:t>
+      </w:r>
+      <w:r>
+        <w:rPr>
+          <w:rFonts w:ascii="Calibri" w:hAnsi="Calibri"/>
+          <w:color w:val="1F2937"/>
+          <w:sz w:val="22"/>
+        </w:rPr>
+        <w:t>Les classes intimes et privées disposent de coefficients de pondération supérieurs (C1: 1.0, C2: 1.2, C3: 1.5, C4: 2.0, C5: 2.5, C8: 1.8, C9: 3.0).</w:t>
+      </w:r>
+    </w:p>
+    <w:p>
+      <w:pPr>
+        <w:pStyle w:val="ListBullet"/>
+        <w:spacing w:before="0" w:after="60" w:line="276" w:lineRule="auto"/>
+      </w:pPr>
+      <w:r>
+        <w:rPr>
+          <w:rFonts w:ascii="Calibri" w:hAnsi="Calibri"/>
+          <w:b/>
+          <w:color w:val="1E3A8A"/>
+          <w:sz w:val="22"/>
+        </w:rPr>
+        <w:t xml:space="preserve">• Détection Heuristique : </w:t>
+      </w:r>
+      <w:r>
+        <w:rPr>
+          <w:rFonts w:ascii="Calibri" w:hAnsi="Calibri"/>
+          <w:color w:val="1F2937"/>
+          <w:sz w:val="22"/>
+        </w:rPr>
+        <w:t>Score &gt;= 85% = Point de Fusion. Score &lt;= 35% = Zone de Vigilance.</w:t>
+      </w:r>
+    </w:p>
+    <w:p>
+      <w:pPr>
+        <w:keepNext/>
+        <w:spacing w:before="360" w:after="120"/>
+      </w:pPr>
+      <w:r>
+        <w:rPr>
+          <w:rFonts w:ascii="Calibri" w:hAnsi="Calibri"/>
+          <w:b/>
+          <w:color w:val="1E3A8A"/>
+          <w:sz w:val="32"/>
+        </w:rPr>
+        <w:t>6. NÉGOCIATION PAR CLASSE (% OU DÉTAIL)</w:t>
+      </w:r>
+    </w:p>
+    <w:p>
+      <w:pPr>
+        <w:spacing w:before="0" w:after="120" w:line="276" w:lineRule="auto"/>
+      </w:pPr>
+      <w:r>
+        <w:rPr>
+          <w:rFonts w:ascii="Calibri" w:hAnsi="Calibri"/>
+          <w:color w:val="1F2937"/>
+          <w:sz w:val="22"/>
+        </w:rPr>
+        <w:t>Le champ restitution_mode de la table match_requests stocke un objet JSON sérialisé sous la forme :</w:t>
       </w:r>
     </w:p>
     <w:tbl>
@@ -51,3590 +1013,465 @@
         <w:tblLook w:firstColumn="1" w:firstRow="1" w:lastColumn="0" w:lastRow="0" w:noHBand="0" w:noVBand="1" w:val="04A0"/>
       </w:tblPr>
       <w:tblGrid>
-        <w:gridCol w:w="3106"/>
-        <w:gridCol w:w="3106"/>
-        <w:gridCol w:w="3106"/>
+        <w:gridCol w:w="9360"/>
       </w:tblGrid>
       <w:tr>
         <w:tc>
           <w:tcPr>
-            <w:tcW w:type="dxa" w:w="3106"/>
-            <w:shd w:val="clear" w:color="auto" w:fill="F1F5F9"/>
-            <w:tcMar>
-              <w:top w:w="100" w:type="dxa"/>
-              <w:bottom w:w="100" w:type="dxa"/>
-              <w:left w:w="140" w:type="dxa"/>
-              <w:right w:w="140" w:type="dxa"/>
-            </w:tcMar>
+            <w:tcW w:type="dxa" w:w="9360"/>
+            <w:shd w:val="clear" w:color="auto" w:fill="F8FAFC"/>
           </w:tcPr>
           <w:p>
             <w:pPr>
-              <w:spacing w:after="40"/>
+              <w:spacing w:before="160" w:after="160"/>
+              <w:ind w:left="216" w:right="216"/>
             </w:pPr>
             <w:r>
               <w:rPr>
-                <w:b/>
-                <w:color w:val="64748B"/>
-                <w:sz w:val="18"/>
-              </w:rPr>
-              <w:t>Auteur &amp; Concepteur</w:t>
-              <w:br/>
-            </w:r>
-            <w:r>
-              <w:rPr>
-                <w:b/>
-                <w:color w:val="0F172A"/>
+                <w:i/>
+                <w:color w:val="0284C7"/>
                 <w:sz w:val="21"/>
               </w:rPr>
-              <w:t>M. André ROGER (Anji, ADM-1)</w:t>
-            </w:r>
-          </w:p>
-        </w:tc>
-        <w:tc>
-          <w:tcPr>
-            <w:tcW w:type="dxa" w:w="3106"/>
-            <w:shd w:val="clear" w:color="auto" w:fill="F1F5F9"/>
-            <w:tcMar>
-              <w:top w:w="100" w:type="dxa"/>
-              <w:bottom w:w="100" w:type="dxa"/>
-              <w:left w:w="140" w:type="dxa"/>
-              <w:right w:w="140" w:type="dxa"/>
-            </w:tcMar>
-          </w:tcPr>
-          <w:p>
-            <w:pPr>
-              <w:spacing w:after="40"/>
-            </w:pPr>
-            <w:r>
-              <w:rPr>
-                <w:b/>
-                <w:color w:val="64748B"/>
-                <w:sz w:val="18"/>
-              </w:rPr>
-              <w:t>Version &amp; Technologie</w:t>
+              <w:t>{</w:t>
               <w:br/>
-            </w:r>
-            <w:r>
-              <w:rPr>
-                <w:b/>
-                <w:color w:val="0F172A"/>
-                <w:sz w:val="21"/>
-              </w:rPr>
-              <w:t>Version 2.2 • Python / SQLite / Vanilla JS</w:t>
-            </w:r>
-          </w:p>
-        </w:tc>
-        <w:tc>
-          <w:tcPr>
-            <w:tcW w:type="dxa" w:w="3106"/>
-            <w:shd w:val="clear" w:color="auto" w:fill="F1F5F9"/>
-            <w:tcMar>
-              <w:top w:w="100" w:type="dxa"/>
-              <w:bottom w:w="100" w:type="dxa"/>
-              <w:left w:w="140" w:type="dxa"/>
-              <w:right w:w="140" w:type="dxa"/>
-            </w:tcMar>
-          </w:tcPr>
-          <w:p>
-            <w:pPr>
-              <w:spacing w:after="40"/>
-            </w:pPr>
-            <w:r>
-              <w:rPr>
-                <w:b/>
-                <w:color w:val="64748B"/>
-                <w:sz w:val="18"/>
-              </w:rPr>
-              <w:t>Date de Référence</w:t>
+              <w:t xml:space="preserve">  "1": "percentage",</w:t>
               <w:br/>
-            </w:r>
-            <w:r>
-              <w:rPr>
-                <w:b/>
-                <w:color w:val="0F172A"/>
-                <w:sz w:val="21"/>
-              </w:rPr>
-              <w:t>Septembre 2026</w:t>
+              <w:t xml:space="preserve">  "2": "detail",</w:t>
+              <w:br/>
+              <w:t xml:space="preserve">  "3": "percentage",</w:t>
+              <w:br/>
+              <w:t xml:space="preserve">  "4": "percentage",</w:t>
+              <w:br/>
+              <w:t xml:space="preserve">  "5": "detail",</w:t>
+              <w:br/>
+              <w:t xml:space="preserve">  "9": "percentage"</w:t>
+              <w:br/>
+              <w:t>}</w:t>
             </w:r>
           </w:p>
         </w:tc>
       </w:tr>
     </w:tbl>
+    <w:p/>
     <w:p>
       <w:pPr>
-        <w:spacing w:after="280"/>
+        <w:spacing w:before="0" w:after="120" w:line="276" w:lineRule="auto"/>
       </w:pPr>
+      <w:r>
+        <w:rPr>
+          <w:rFonts w:ascii="Calibri" w:hAnsi="Calibri"/>
+          <w:color w:val="1F2937"/>
+          <w:sz w:val="22"/>
+        </w:rPr>
+        <w:t>Le moteur n'inclut dans le tableau final questions_details que les questions appartenant aux classes pour lesquelles l'accord réciproque est strictement égal à 'detail'. Pour les autres classes, seuls les pourcentages agrégés par thématique et par sujet sont délivrés.</w:t>
+      </w:r>
     </w:p>
     <w:p>
       <w:pPr>
-        <w:spacing w:after="160"/>
+        <w:keepNext/>
+        <w:spacing w:before="360" w:after="120"/>
       </w:pPr>
       <w:r>
         <w:rPr>
+          <w:rFonts w:ascii="Calibri" w:hAnsi="Calibri"/>
           <w:b/>
-          <w:color w:val="0E7490"/>
-          <w:sz w:val="28"/>
-          <w:lang w:val="fr-FR"/>
+          <w:color w:val="1E3A8A"/>
+          <w:sz w:val="32"/>
         </w:rPr>
-        <w:t>TABLE DES MATIÈRES</w:t>
+        <w:t>7. SUPERVISION &amp; MATCHS DISCRETS ADMINISTRATEUR</w:t>
+      </w:r>
+    </w:p>
+    <w:p>
+      <w:pPr>
+        <w:spacing w:before="0" w:after="120" w:line="276" w:lineRule="auto"/>
+      </w:pPr>
+      <w:r>
+        <w:rPr>
+          <w:rFonts w:ascii="Calibri" w:hAnsi="Calibri"/>
+          <w:color w:val="1F2937"/>
+          <w:sz w:val="22"/>
+        </w:rPr>
+        <w:t>L'administrateur peut ordonner un match discret (is_discreet = 1) entre deux membres quelconques sans qu'aucune notification ne leur soit transmise. Le calcul est opéré immédiatement avec restitution intégrale (% et détail sur l'ensemble des classes communes) et archivé dans la table match_requests avec le drapeau confidentiel, permettant une inspection immédiate depuis l'écran de supervision administrative.</w:t>
+      </w:r>
+    </w:p>
+    <w:p>
+      <w:pPr>
+        <w:keepNext/>
+        <w:spacing w:before="360" w:after="120"/>
+      </w:pPr>
+      <w:r>
+        <w:rPr>
+          <w:rFonts w:ascii="Calibri" w:hAnsi="Calibri"/>
+          <w:b/>
+          <w:color w:val="1E3A8A"/>
+          <w:sz w:val="32"/>
+        </w:rPr>
+        <w:t>8. SPÉCIFICATION COMPLÈTE DES API REST</w:t>
       </w:r>
     </w:p>
     <w:p>
       <w:pPr>
         <w:pStyle w:val="ListBullet"/>
-        <w:spacing w:after="60"/>
+        <w:spacing w:before="0" w:after="60" w:line="276" w:lineRule="auto"/>
       </w:pPr>
       <w:r>
         <w:rPr>
-          <w:color w:val="0F172A"/>
-          <w:sz w:val="21"/>
-          <w:lang w:val="fr-FR"/>
+          <w:rFonts w:ascii="Calibri" w:hAnsi="Calibri"/>
+          <w:b/>
+          <w:color w:val="1E3A8A"/>
+          <w:sz w:val="22"/>
         </w:rPr>
-        <w:t>1. Vue d'Ensemble de l'Architecture &amp; Choix Technologiques</w:t>
+        <w:t xml:space="preserve">GET /api/profiles : </w:t>
+      </w:r>
+      <w:r>
+        <w:rPr>
+          <w:rFonts w:ascii="Calibri" w:hAnsi="Calibri"/>
+          <w:color w:val="1F2937"/>
+          <w:sz w:val="22"/>
+        </w:rPr>
+        <w:t>Liste des profils complétés avec statut et localisation</w:t>
       </w:r>
     </w:p>
     <w:p>
       <w:pPr>
         <w:pStyle w:val="ListBullet"/>
-        <w:spacing w:after="60"/>
+        <w:spacing w:before="0" w:after="60" w:line="276" w:lineRule="auto"/>
       </w:pPr>
       <w:r>
         <w:rPr>
-          <w:color w:val="0F172A"/>
-          <w:sz w:val="21"/>
-          <w:lang w:val="fr-FR"/>
+          <w:rFonts w:ascii="Calibri" w:hAnsi="Calibri"/>
+          <w:b/>
+          <w:color w:val="1E3A8A"/>
+          <w:sz w:val="22"/>
         </w:rPr>
-        <w:t>2. Architecture des Rôles &amp; Sécurité d'Accès (Admin, Abonné, Invité)</w:t>
+        <w:t xml:space="preserve">GET /api/questions : </w:t>
+      </w:r>
+      <w:r>
+        <w:rPr>
+          <w:rFonts w:ascii="Calibri" w:hAnsi="Calibri"/>
+          <w:color w:val="1F2937"/>
+          <w:sz w:val="22"/>
+        </w:rPr>
+        <w:t>Liste des questions validées (avec pack_id et pack_nom)</w:t>
       </w:r>
     </w:p>
     <w:p>
       <w:pPr>
         <w:pStyle w:val="ListBullet"/>
-        <w:spacing w:after="60"/>
+        <w:spacing w:before="0" w:after="60" w:line="276" w:lineRule="auto"/>
       </w:pPr>
       <w:r>
         <w:rPr>
-          <w:color w:val="0F172A"/>
-          <w:sz w:val="21"/>
-          <w:lang w:val="fr-FR"/>
+          <w:rFonts w:ascii="Calibri" w:hAnsi="Calibri"/>
+          <w:b/>
+          <w:color w:val="1E3A8A"/>
+          <w:sz w:val="22"/>
         </w:rPr>
-        <w:t>3. Modèle de Données &amp; Schéma Relationnel SQLite (affinity.db)</w:t>
+        <w:t xml:space="preserve">GET /api/admin/questions/pending : </w:t>
+      </w:r>
+      <w:r>
+        <w:rPr>
+          <w:rFonts w:ascii="Calibri" w:hAnsi="Calibri"/>
+          <w:color w:val="1F2937"/>
+          <w:sz w:val="22"/>
+        </w:rPr>
+        <w:t>Liste des questions en attente de modération</w:t>
       </w:r>
     </w:p>
     <w:p>
       <w:pPr>
         <w:pStyle w:val="ListBullet"/>
-        <w:spacing w:after="60"/>
+        <w:spacing w:before="0" w:after="60" w:line="276" w:lineRule="auto"/>
       </w:pPr>
       <w:r>
         <w:rPr>
-          <w:color w:val="0F172A"/>
-          <w:sz w:val="21"/>
-          <w:lang w:val="fr-FR"/>
+          <w:rFonts w:ascii="Calibri" w:hAnsi="Calibri"/>
+          <w:b/>
+          <w:color w:val="1E3A8A"/>
+          <w:sz w:val="22"/>
         </w:rPr>
-        <w:t>4. Module d'Identité &amp; Caractéristiques (+ sur moi &amp; + sur l'autre - Classe 8)</w:t>
+        <w:t xml:space="preserve">POST /api/admin/questions/{id}/validate : </w:t>
+      </w:r>
+      <w:r>
+        <w:rPr>
+          <w:rFonts w:ascii="Calibri" w:hAnsi="Calibri"/>
+          <w:color w:val="1F2937"/>
+          <w:sz w:val="22"/>
+        </w:rPr>
+        <w:t>Valide et active une question en attente</w:t>
       </w:r>
     </w:p>
     <w:p>
       <w:pPr>
         <w:pStyle w:val="ListBullet"/>
-        <w:spacing w:after="60"/>
+        <w:spacing w:before="0" w:after="60" w:line="276" w:lineRule="auto"/>
       </w:pPr>
       <w:r>
         <w:rPr>
-          <w:color w:val="0F172A"/>
-          <w:sz w:val="21"/>
-          <w:lang w:val="fr-FR"/>
+          <w:rFonts w:ascii="Calibri" w:hAnsi="Calibri"/>
+          <w:b/>
+          <w:color w:val="1E3A8A"/>
+          <w:sz w:val="22"/>
         </w:rPr>
-        <w:t>5. Diagnostic Préalable de Compatibilité Identité (Moi &amp; L'Autre)</w:t>
+        <w:t xml:space="preserve">POST /api/match-requests : </w:t>
+      </w:r>
+      <w:r>
+        <w:rPr>
+          <w:rFonts w:ascii="Calibri" w:hAnsi="Calibri"/>
+          <w:color w:val="1F2937"/>
+          <w:sz w:val="22"/>
+        </w:rPr>
+        <w:t>Émet une demande de match avec paramétrage par classe</w:t>
       </w:r>
     </w:p>
     <w:p>
       <w:pPr>
         <w:pStyle w:val="ListBullet"/>
-        <w:spacing w:after="60"/>
+        <w:spacing w:before="0" w:after="60" w:line="276" w:lineRule="auto"/>
       </w:pPr>
       <w:r>
         <w:rPr>
-          <w:color w:val="0F172A"/>
-          <w:sz w:val="21"/>
-          <w:lang w:val="fr-FR"/>
+          <w:rFonts w:ascii="Calibri" w:hAnsi="Calibri"/>
+          <w:b/>
+          <w:color w:val="1E3A8A"/>
+          <w:sz w:val="22"/>
         </w:rPr>
-        <w:t>6. Moteur de Calcul d'Affinité Élective (Algorithme V-A-D-P)</w:t>
+        <w:t xml:space="preserve">PUT /api/match-requests/{id}/respond : </w:t>
+      </w:r>
+      <w:r>
+        <w:rPr>
+          <w:rFonts w:ascii="Calibri" w:hAnsi="Calibri"/>
+          <w:color w:val="1F2937"/>
+          <w:sz w:val="22"/>
+        </w:rPr>
+        <w:t>Accepte ou refuse une demande avec ajustement du niveau</w:t>
       </w:r>
     </w:p>
     <w:p>
       <w:pPr>
         <w:pStyle w:val="ListBullet"/>
-        <w:spacing w:after="60"/>
+        <w:spacing w:before="0" w:after="60" w:line="276" w:lineRule="auto"/>
       </w:pPr>
       <w:r>
         <w:rPr>
-          <w:color w:val="0F172A"/>
-          <w:sz w:val="21"/>
-          <w:lang w:val="fr-FR"/>
+          <w:rFonts w:ascii="Calibri" w:hAnsi="Calibri"/>
+          <w:b/>
+          <w:color w:val="1E3A8A"/>
+          <w:sz w:val="22"/>
         </w:rPr>
-        <w:t>7. Spécification Complète des API REST (Endpoints HTTP)</w:t>
+        <w:t xml:space="preserve">GET /api/match-requests/history : </w:t>
+      </w:r>
+      <w:r>
+        <w:rPr>
+          <w:rFonts w:ascii="Calibri" w:hAnsi="Calibri"/>
+          <w:color w:val="1F2937"/>
+          <w:sz w:val="22"/>
+        </w:rPr>
+        <w:t>Historique bilatéral des matchs entre deux profils</w:t>
       </w:r>
     </w:p>
     <w:p>
       <w:pPr>
         <w:pStyle w:val="ListBullet"/>
-        <w:spacing w:after="60"/>
+        <w:spacing w:before="0" w:after="60" w:line="276" w:lineRule="auto"/>
       </w:pPr>
       <w:r>
         <w:rPr>
-          <w:color w:val="0F172A"/>
-          <w:sz w:val="21"/>
-          <w:lang w:val="fr-FR"/>
+          <w:rFonts w:ascii="Calibri" w:hAnsi="Calibri"/>
+          <w:b/>
+          <w:color w:val="1E3A8A"/>
+          <w:sz w:val="22"/>
         </w:rPr>
-        <w:t>8. Sauvegarde Locale &amp; Pérennité des Données (Questions, Profils, Réponses)</w:t>
+        <w:t xml:space="preserve">POST /api/match : </w:t>
+      </w:r>
+      <w:r>
+        <w:rPr>
+          <w:rFonts w:ascii="Calibri" w:hAnsi="Calibri"/>
+          <w:color w:val="1F2937"/>
+          <w:sz w:val="22"/>
+        </w:rPr>
+        <w:t>Calcule et restitue le rapport d'affinité selon le niveau convenu</w:t>
       </w:r>
     </w:p>
     <w:p>
       <w:pPr>
         <w:pStyle w:val="ListBullet"/>
-        <w:spacing w:after="60"/>
+        <w:spacing w:before="0" w:after="60" w:line="276" w:lineRule="auto"/>
       </w:pPr>
       <w:r>
         <w:rPr>
-          <w:color w:val="0F172A"/>
-          <w:sz w:val="21"/>
-          <w:lang w:val="fr-FR"/>
+          <w:rFonts w:ascii="Calibri" w:hAnsi="Calibri"/>
+          <w:b/>
+          <w:color w:val="1E3A8A"/>
+          <w:sz w:val="22"/>
         </w:rPr>
-        <w:t>9. Déploiement Continu Cloud (Render) &amp; Gestion de la Résilience</w:t>
+        <w:t xml:space="preserve">PUT /api/access-requests/{id}/respond : </w:t>
+      </w:r>
+      <w:r>
+        <w:rPr>
+          <w:rFonts w:ascii="Calibri" w:hAnsi="Calibri"/>
+          <w:color w:val="1F2937"/>
+          <w:sz w:val="22"/>
+        </w:rPr>
+        <w:t>Approuve ou refuse unitairement une demande d'accès</w:t>
       </w:r>
     </w:p>
     <w:p>
       <w:pPr>
         <w:pStyle w:val="ListBullet"/>
-        <w:spacing w:after="60"/>
+        <w:spacing w:before="0" w:after="60" w:line="276" w:lineRule="auto"/>
       </w:pPr>
       <w:r>
         <w:rPr>
-          <w:color w:val="0F172A"/>
-          <w:sz w:val="21"/>
-          <w:lang w:val="fr-FR"/>
+          <w:rFonts w:ascii="Calibri" w:hAnsi="Calibri"/>
+          <w:b/>
+          <w:color w:val="1E3A8A"/>
+          <w:sz w:val="22"/>
         </w:rPr>
-        <w:t>10. Procédure d'Exploitation &amp; Démarrage Multi-Postes (Windows 10 / 11)</w:t>
+        <w:t xml:space="preserve">PUT /api/admin/access-requests/batch-respond : </w:t>
       </w:r>
-    </w:p>
-    <w:p>
       <w:r>
         <w:rPr>
-          <w:lang w:val="fr-FR"/>
+          <w:rFonts w:ascii="Calibri" w:hAnsi="Calibri"/>
+          <w:color w:val="1F2937"/>
+          <w:sz w:val="22"/>
         </w:rPr>
-        <w:br w:type="page"/>
-      </w:r>
-    </w:p>
-    <w:p>
-      <w:pPr>
-        <w:spacing w:before="240" w:after="120"/>
-      </w:pPr>
-      <w:r>
-        <w:rPr>
-          <w:b/>
-          <w:color w:val="0E7490"/>
-          <w:sz w:val="28"/>
-          <w:lang w:val="fr-FR"/>
-        </w:rPr>
-        <w:t>1. VUE D'ENSEMBLE DE L'ARCHITECTURE &amp; CHOIX TECHNOLOGIQUES</w:t>
-      </w:r>
-    </w:p>
-    <w:p>
-      <w:r>
-        <w:rPr>
-          <w:lang w:val="fr-FR"/>
-        </w:rPr>
-        <w:t>L'application Affinity (référence projet ARP001) a été conçue pour offrir un moteur d'affinités électives hautement performant, fluide et respectueux de la vie privée. L'architecture repose sur des fondations légères sans frameworks lourds ni processus de compilation contraignants :</w:t>
+        <w:t>Approuve ou refuse par lot toutes les demandes d'accès</w:t>
       </w:r>
     </w:p>
     <w:p>
       <w:pPr>
         <w:pStyle w:val="ListBullet"/>
+        <w:spacing w:before="0" w:after="60" w:line="276" w:lineRule="auto"/>
       </w:pPr>
       <w:r>
         <w:rPr>
+          <w:rFonts w:ascii="Calibri" w:hAnsi="Calibri"/>
           <w:b/>
-          <w:lang w:val="fr-FR"/>
+          <w:color w:val="1E3A8A"/>
+          <w:sz w:val="22"/>
         </w:rPr>
-        <w:t xml:space="preserve">Frontend SPA (Single Page Application) : </w:t>
+        <w:t xml:space="preserve">GET /api/admin/backups : </w:t>
       </w:r>
       <w:r>
         <w:rPr>
-          <w:lang w:val="fr-FR"/>
+          <w:rFonts w:ascii="Calibri" w:hAnsi="Calibri"/>
+          <w:color w:val="1F2937"/>
+          <w:sz w:val="22"/>
         </w:rPr>
-        <w:t>Développé en HTML5 sémantique, CSS3 moderne (variables CSS, flexbox, grid, glassmorphism, mode sombre soigné) et Vanilla JavaScript (ES6+). Ce choix garantit un temps de chargement quasi-instantané, une maintenance limpide et l'absence totale de failles de dépendances (zéro Node modules côté exécution client).</w:t>
+        <w:t>Liste des sauvegardes locales horodatées disponibles</w:t>
       </w:r>
     </w:p>
     <w:p>
       <w:pPr>
         <w:pStyle w:val="ListBullet"/>
+        <w:spacing w:before="0" w:after="60" w:line="276" w:lineRule="auto"/>
       </w:pPr>
       <w:r>
         <w:rPr>
+          <w:rFonts w:ascii="Calibri" w:hAnsi="Calibri"/>
           <w:b/>
-          <w:lang w:val="fr-FR"/>
+          <w:color w:val="1E3A8A"/>
+          <w:sz w:val="22"/>
         </w:rPr>
-        <w:t xml:space="preserve">Backend Python Haute Concurrence : </w:t>
+        <w:t xml:space="preserve">POST /api/admin/backups/create : </w:t>
       </w:r>
       <w:r>
         <w:rPr>
-          <w:lang w:val="fr-FR"/>
+          <w:rFonts w:ascii="Calibri" w:hAnsi="Calibri"/>
+          <w:color w:val="1F2937"/>
+          <w:sz w:val="22"/>
         </w:rPr>
-        <w:t>Construit autour du module standard http.server renforcé par socketserver.ThreadingMixIn. Ce serveur multithreadé gère efficacement les requêtes concurrentes, sert les ressources statiques et expose l'ensemble des API REST.</w:t>
+        <w:t>Déclenche une sauvegarde SQLite immédiate dans backups/</w:t>
+      </w:r>
+    </w:p>
+    <w:p>
+      <w:pPr>
+        <w:keepNext/>
+        <w:spacing w:before="360" w:after="120"/>
+      </w:pPr>
+      <w:r>
+        <w:rPr>
+          <w:rFonts w:ascii="Calibri" w:hAnsi="Calibri"/>
+          <w:b/>
+          <w:color w:val="1E3A8A"/>
+          <w:sz w:val="32"/>
+        </w:rPr>
+        <w:t>9. SAUVEGARDES, SÉCURITÉ &amp; DÉPLOIEMENT</w:t>
       </w:r>
     </w:p>
     <w:p>
       <w:pPr>
         <w:pStyle w:val="ListBullet"/>
+        <w:spacing w:before="0" w:after="60" w:line="276" w:lineRule="auto"/>
       </w:pPr>
       <w:r>
         <w:rPr>
+          <w:rFonts w:ascii="Calibri" w:hAnsi="Calibri"/>
           <w:b/>
-          <w:lang w:val="fr-FR"/>
+          <w:color w:val="1E3A8A"/>
+          <w:sz w:val="22"/>
         </w:rPr>
-        <w:t xml:space="preserve">Base Relationnelle SQLite3 Locale : </w:t>
+        <w:t xml:space="preserve">• Sauvegarde Automatique : </w:t>
       </w:r>
       <w:r>
         <w:rPr>
-          <w:lang w:val="fr-FR"/>
+          <w:rFonts w:ascii="Calibri" w:hAnsi="Calibri"/>
+          <w:color w:val="1F2937"/>
+          <w:sz w:val="22"/>
         </w:rPr>
-        <w:t>Fichier autonome 'affinity.db', parfaitement portable, hautement optimisé avec indexes ciblés, intégrité référentielle et politique de migrations douces transparentes (ALTER TABLE dynamique sans perte de données).</w:t>
-      </w:r>
-    </w:p>
-    <w:p>
-      <w:pPr>
-        <w:spacing w:before="280" w:after="120"/>
-      </w:pPr>
-      <w:r>
-        <w:rPr>
-          <w:b/>
-          <w:color w:val="0E7490"/>
-          <w:sz w:val="28"/>
-          <w:lang w:val="fr-FR"/>
-        </w:rPr>
-        <w:t>2. ARCHITECTURE DES RÔLES &amp; SÉCURITÉ D'ACCÈS</w:t>
-      </w:r>
-    </w:p>
-    <w:p>
-      <w:r>
-        <w:rPr>
-          <w:lang w:val="fr-FR"/>
-        </w:rPr>
-        <w:t>Affinity applique une hiérarchie stricte à 3 niveaux de rôles afin de protéger la confidentialité des données intimes et de garantir la souveraineté du gestionnaire de la plateforme :</w:t>
-      </w:r>
-    </w:p>
-    <w:tbl>
-      <w:tblPr>
-        <w:tblW w:type="auto" w:w="0"/>
-        <w:jc w:val="center"/>
-        <w:tblLook w:firstColumn="1" w:firstRow="1" w:lastColumn="0" w:lastRow="0" w:noHBand="0" w:noVBand="1" w:val="04A0"/>
-      </w:tblPr>
-      <w:tblGrid>
-        <w:gridCol w:w="2329"/>
-        <w:gridCol w:w="2329"/>
-        <w:gridCol w:w="2329"/>
-        <w:gridCol w:w="2329"/>
-      </w:tblGrid>
-      <w:tr>
-        <w:tc>
-          <w:tcPr>
-            <w:tcW w:type="dxa" w:w="2329"/>
-            <w:shd w:val="clear" w:color="auto" w:fill="0E7490"/>
-            <w:tcMar>
-              <w:top w:w="120" w:type="dxa"/>
-              <w:bottom w:w="120" w:type="dxa"/>
-              <w:left w:w="140" w:type="dxa"/>
-              <w:right w:w="140" w:type="dxa"/>
-            </w:tcMar>
-          </w:tcPr>
-          <w:p>
-            <w:r>
-              <w:rPr>
-                <w:b/>
-                <w:color w:val="FFFFFF"/>
-                <w:sz w:val="20"/>
-              </w:rPr>
-              <w:t>Rôle</w:t>
-            </w:r>
-          </w:p>
-        </w:tc>
-        <w:tc>
-          <w:tcPr>
-            <w:tcW w:type="dxa" w:w="2329"/>
-            <w:shd w:val="clear" w:color="auto" w:fill="0E7490"/>
-            <w:tcMar>
-              <w:top w:w="120" w:type="dxa"/>
-              <w:bottom w:w="120" w:type="dxa"/>
-              <w:left w:w="140" w:type="dxa"/>
-              <w:right w:w="140" w:type="dxa"/>
-            </w:tcMar>
-          </w:tcPr>
-          <w:p>
-            <w:r>
-              <w:rPr>
-                <w:b/>
-                <w:color w:val="FFFFFF"/>
-                <w:sz w:val="20"/>
-              </w:rPr>
-              <w:t>Identifiant Unique</w:t>
-            </w:r>
-          </w:p>
-        </w:tc>
-        <w:tc>
-          <w:tcPr>
-            <w:tcW w:type="dxa" w:w="2329"/>
-            <w:shd w:val="clear" w:color="auto" w:fill="0E7490"/>
-            <w:tcMar>
-              <w:top w:w="120" w:type="dxa"/>
-              <w:bottom w:w="120" w:type="dxa"/>
-              <w:left w:w="140" w:type="dxa"/>
-              <w:right w:w="140" w:type="dxa"/>
-            </w:tcMar>
-          </w:tcPr>
-          <w:p>
-            <w:r>
-              <w:rPr>
-                <w:b/>
-                <w:color w:val="FFFFFF"/>
-                <w:sz w:val="20"/>
-              </w:rPr>
-              <w:t>Prérogatives</w:t>
-            </w:r>
-          </w:p>
-        </w:tc>
-        <w:tc>
-          <w:tcPr>
-            <w:tcW w:type="dxa" w:w="2329"/>
-            <w:shd w:val="clear" w:color="auto" w:fill="0E7490"/>
-            <w:tcMar>
-              <w:top w:w="120" w:type="dxa"/>
-              <w:bottom w:w="120" w:type="dxa"/>
-              <w:left w:w="140" w:type="dxa"/>
-              <w:right w:w="140" w:type="dxa"/>
-            </w:tcMar>
-          </w:tcPr>
-          <w:p>
-            <w:r>
-              <w:rPr>
-                <w:b/>
-                <w:color w:val="FFFFFF"/>
-                <w:sz w:val="20"/>
-              </w:rPr>
-              <w:t>Restrictions</w:t>
-            </w:r>
-          </w:p>
-        </w:tc>
-      </w:tr>
-      <w:tr>
-        <w:tc>
-          <w:tcPr>
-            <w:tcW w:type="dxa" w:w="2329"/>
-            <w:shd w:val="clear" w:color="auto" w:fill="F8FAFC"/>
-            <w:tcMar>
-              <w:top w:w="100" w:type="dxa"/>
-              <w:bottom w:w="100" w:type="dxa"/>
-              <w:left w:w="120" w:type="dxa"/>
-              <w:right w:w="120" w:type="dxa"/>
-            </w:tcMar>
-          </w:tcPr>
-          <w:p>
-            <w:r>
-              <w:rPr>
-                <w:color w:val="1E293B"/>
-                <w:sz w:val="19"/>
-              </w:rPr>
-              <w:t>Administrateur (admin)</w:t>
-            </w:r>
-          </w:p>
-        </w:tc>
-        <w:tc>
-          <w:tcPr>
-            <w:tcW w:type="dxa" w:w="2329"/>
-            <w:shd w:val="clear" w:color="auto" w:fill="F8FAFC"/>
-            <w:tcMar>
-              <w:top w:w="100" w:type="dxa"/>
-              <w:bottom w:w="100" w:type="dxa"/>
-              <w:left w:w="120" w:type="dxa"/>
-              <w:right w:w="120" w:type="dxa"/>
-            </w:tcMar>
-          </w:tcPr>
-          <w:p>
-            <w:r>
-              <w:rPr>
-                <w:color w:val="1E293B"/>
-                <w:sz w:val="19"/>
-              </w:rPr>
-              <w:t>ADM-1 (Anji)</w:t>
-            </w:r>
-          </w:p>
-        </w:tc>
-        <w:tc>
-          <w:tcPr>
-            <w:tcW w:type="dxa" w:w="2329"/>
-            <w:shd w:val="clear" w:color="auto" w:fill="F8FAFC"/>
-            <w:tcMar>
-              <w:top w:w="100" w:type="dxa"/>
-              <w:bottom w:w="100" w:type="dxa"/>
-              <w:left w:w="120" w:type="dxa"/>
-              <w:right w:w="120" w:type="dxa"/>
-            </w:tcMar>
-          </w:tcPr>
-          <w:p>
-            <w:r>
-              <w:rPr>
-                <w:color w:val="1E293B"/>
-                <w:sz w:val="19"/>
-              </w:rPr>
-              <w:t>Accès absolu : gestion des utilisateurs, banque de questions, arbitrage, arbitrages des accès, sauvegardes locales, simulation de rôles.</w:t>
-            </w:r>
-          </w:p>
-        </w:tc>
-        <w:tc>
-          <w:tcPr>
-            <w:tcW w:type="dxa" w:w="2329"/>
-            <w:shd w:val="clear" w:color="auto" w:fill="F8FAFC"/>
-            <w:tcMar>
-              <w:top w:w="100" w:type="dxa"/>
-              <w:bottom w:w="100" w:type="dxa"/>
-              <w:left w:w="120" w:type="dxa"/>
-              <w:right w:w="120" w:type="dxa"/>
-            </w:tcMar>
-          </w:tcPr>
-          <w:p>
-            <w:r>
-              <w:rPr>
-                <w:color w:val="1E293B"/>
-                <w:sz w:val="19"/>
-              </w:rPr>
-              <w:t>Superviseur strict : ne participe pas aux calculs de match et n'a pas de profil de rencontre.</w:t>
-            </w:r>
-          </w:p>
-        </w:tc>
-      </w:tr>
-      <w:tr>
-        <w:tc>
-          <w:tcPr>
-            <w:tcW w:type="dxa" w:w="2329"/>
-            <w:shd w:val="clear" w:color="auto" w:fill="FFFFFF"/>
-            <w:tcMar>
-              <w:top w:w="100" w:type="dxa"/>
-              <w:bottom w:w="100" w:type="dxa"/>
-              <w:left w:w="120" w:type="dxa"/>
-              <w:right w:w="120" w:type="dxa"/>
-            </w:tcMar>
-          </w:tcPr>
-          <w:p>
-            <w:r>
-              <w:rPr>
-                <w:color w:val="1E293B"/>
-                <w:sz w:val="19"/>
-              </w:rPr>
-              <w:t>Abonné (subscriber)</w:t>
-            </w:r>
-          </w:p>
-        </w:tc>
-        <w:tc>
-          <w:tcPr>
-            <w:tcW w:type="dxa" w:w="2329"/>
-            <w:shd w:val="clear" w:color="auto" w:fill="FFFFFF"/>
-            <w:tcMar>
-              <w:top w:w="100" w:type="dxa"/>
-              <w:bottom w:w="100" w:type="dxa"/>
-              <w:left w:w="120" w:type="dxa"/>
-              <w:right w:w="120" w:type="dxa"/>
-            </w:tcMar>
-          </w:tcPr>
-          <w:p>
-            <w:r>
-              <w:rPr>
-                <w:color w:val="1E293B"/>
-                <w:sz w:val="19"/>
-              </w:rPr>
-              <w:t>AFF-x (ex: AFF-23)</w:t>
-            </w:r>
-          </w:p>
-        </w:tc>
-        <w:tc>
-          <w:tcPr>
-            <w:tcW w:type="dxa" w:w="2329"/>
-            <w:shd w:val="clear" w:color="auto" w:fill="FFFFFF"/>
-            <w:tcMar>
-              <w:top w:w="100" w:type="dxa"/>
-              <w:bottom w:w="100" w:type="dxa"/>
-              <w:left w:w="120" w:type="dxa"/>
-              <w:right w:w="120" w:type="dxa"/>
-            </w:tcMar>
-          </w:tcPr>
-          <w:p>
-            <w:r>
-              <w:rPr>
-                <w:color w:val="1E293B"/>
-                <w:sz w:val="19"/>
-              </w:rPr>
-              <w:t>Accès complet au Calculateur d'Affinité, Radar multidimensionnel, demandes de match bilatérales, questionnaires autorisés.</w:t>
-            </w:r>
-          </w:p>
-        </w:tc>
-        <w:tc>
-          <w:tcPr>
-            <w:tcW w:type="dxa" w:w="2329"/>
-            <w:shd w:val="clear" w:color="auto" w:fill="FFFFFF"/>
-            <w:tcMar>
-              <w:top w:w="100" w:type="dxa"/>
-              <w:bottom w:w="100" w:type="dxa"/>
-              <w:left w:w="120" w:type="dxa"/>
-              <w:right w:w="120" w:type="dxa"/>
-            </w:tcMar>
-          </w:tcPr>
-          <w:p>
-            <w:r>
-              <w:rPr>
-                <w:color w:val="1E293B"/>
-                <w:sz w:val="19"/>
-              </w:rPr>
-              <w:t>Ne peut pas modifier la banque de questions ni administrer les autres membres.</w:t>
-            </w:r>
-          </w:p>
-        </w:tc>
-      </w:tr>
-      <w:tr>
-        <w:tc>
-          <w:tcPr>
-            <w:tcW w:type="dxa" w:w="2329"/>
-            <w:shd w:val="clear" w:color="auto" w:fill="F8FAFC"/>
-            <w:tcMar>
-              <w:top w:w="100" w:type="dxa"/>
-              <w:bottom w:w="100" w:type="dxa"/>
-              <w:left w:w="120" w:type="dxa"/>
-              <w:right w:w="120" w:type="dxa"/>
-            </w:tcMar>
-          </w:tcPr>
-          <w:p>
-            <w:r>
-              <w:rPr>
-                <w:color w:val="1E293B"/>
-                <w:sz w:val="19"/>
-              </w:rPr>
-              <w:t>Invité (guest)</w:t>
-            </w:r>
-          </w:p>
-        </w:tc>
-        <w:tc>
-          <w:tcPr>
-            <w:tcW w:type="dxa" w:w="2329"/>
-            <w:shd w:val="clear" w:color="auto" w:fill="F8FAFC"/>
-            <w:tcMar>
-              <w:top w:w="100" w:type="dxa"/>
-              <w:bottom w:w="100" w:type="dxa"/>
-              <w:left w:w="120" w:type="dxa"/>
-              <w:right w:w="120" w:type="dxa"/>
-            </w:tcMar>
-          </w:tcPr>
-          <w:p>
-            <w:r>
-              <w:rPr>
-                <w:color w:val="1E293B"/>
-                <w:sz w:val="19"/>
-              </w:rPr>
-              <w:t>AFF-x (nouveaux comptes)</w:t>
-            </w:r>
-          </w:p>
-        </w:tc>
-        <w:tc>
-          <w:tcPr>
-            <w:tcW w:type="dxa" w:w="2329"/>
-            <w:shd w:val="clear" w:color="auto" w:fill="F8FAFC"/>
-            <w:tcMar>
-              <w:top w:w="100" w:type="dxa"/>
-              <w:bottom w:w="100" w:type="dxa"/>
-              <w:left w:w="120" w:type="dxa"/>
-              <w:right w:w="120" w:type="dxa"/>
-            </w:tcMar>
-          </w:tcPr>
-          <w:p>
-            <w:r>
-              <w:rPr>
-                <w:color w:val="1E293B"/>
-                <w:sz w:val="19"/>
-              </w:rPr>
-              <w:t>Rôle d'accueil par défaut : saisie de sa fiche d'identité, réponse aux questionnaires standards (classe 1) et module identité.</w:t>
-            </w:r>
-          </w:p>
-        </w:tc>
-        <w:tc>
-          <w:tcPr>
-            <w:tcW w:type="dxa" w:w="2329"/>
-            <w:shd w:val="clear" w:color="auto" w:fill="F8FAFC"/>
-            <w:tcMar>
-              <w:top w:w="100" w:type="dxa"/>
-              <w:bottom w:w="100" w:type="dxa"/>
-              <w:left w:w="120" w:type="dxa"/>
-              <w:right w:w="120" w:type="dxa"/>
-            </w:tcMar>
-          </w:tcPr>
-          <w:p>
-            <w:r>
-              <w:rPr>
-                <w:color w:val="1E293B"/>
-                <w:sz w:val="19"/>
-              </w:rPr>
-              <w:t>Calculateur d'affinité et demandes de match verrouillés. Doit être promu par l'administrateur.</w:t>
-            </w:r>
-          </w:p>
-        </w:tc>
-      </w:tr>
-    </w:tbl>
-    <w:p>
-      <w:pPr>
-        <w:spacing w:after="200"/>
-      </w:pPr>
-    </w:p>
-    <w:p>
-      <w:pPr>
-        <w:spacing w:before="280" w:after="120"/>
-      </w:pPr>
-      <w:r>
-        <w:rPr>
-          <w:b/>
-          <w:color w:val="0E7490"/>
-          <w:sz w:val="28"/>
-          <w:lang w:val="fr-FR"/>
-        </w:rPr>
-        <w:t>3. MODÈLE DE DONNÉES &amp; SCHÉMA RELATIONNEL SQLITE</w:t>
-      </w:r>
-    </w:p>
-    <w:p>
-      <w:r>
-        <w:rPr>
-          <w:lang w:val="fr-FR"/>
-        </w:rPr>
-        <w:t>Le modèle de données 'affinity.db' structure les utilisateurs, leurs fiches détaillées, la banque de questions hiérarchisée, leurs réponses et les critères de matching :</w:t>
+        <w:t>Au démarrage de server.py, une copie horodatée affinity_auto_YYYYMMDD_HHMMSS.db est générée dans backups/.</w:t>
       </w:r>
     </w:p>
     <w:p>
       <w:pPr>
         <w:pStyle w:val="ListBullet"/>
+        <w:spacing w:before="0" w:after="60" w:line="276" w:lineRule="auto"/>
       </w:pPr>
       <w:r>
         <w:rPr>
+          <w:rFonts w:ascii="Calibri" w:hAnsi="Calibri"/>
           <w:b/>
-          <w:lang w:val="fr-FR"/>
+          <w:color w:val="1E3A8A"/>
+          <w:sz w:val="22"/>
         </w:rPr>
-        <w:t xml:space="preserve">profiles : </w:t>
+        <w:t xml:space="preserve">• Exploitation Windows Locale : </w:t>
       </w:r>
       <w:r>
         <w:rPr>
-          <w:lang w:val="fr-FR"/>
+          <w:rFonts w:ascii="Calibri" w:hAnsi="Calibri"/>
+          <w:color w:val="1F2937"/>
+          <w:sz w:val="22"/>
         </w:rPr>
-        <w:t>id (PK), pseudo (unique), role ('admin', 'subscriber', 'guest'), code_profil ('ADM-1', 'AFF-x'), password_hash, salt, email, created_at.</w:t>
+        <w:t>Double-clic sur Affinity.bat (lance le serveur en arrière-plan et ouvre l'interface sur http://localhost:8765).</w:t>
       </w:r>
     </w:p>
     <w:p>
       <w:pPr>
         <w:pStyle w:val="ListBullet"/>
+        <w:spacing w:before="0" w:after="60" w:line="276" w:lineRule="auto"/>
       </w:pPr>
       <w:r>
         <w:rPr>
+          <w:rFonts w:ascii="Calibri" w:hAnsi="Calibri"/>
           <w:b/>
-          <w:lang w:val="fr-FR"/>
+          <w:color w:val="1E3A8A"/>
+          <w:sz w:val="22"/>
         </w:rPr>
-        <w:t xml:space="preserve">identity_cards : </w:t>
+        <w:t xml:space="preserve">• Déploiement Cloud : </w:t>
       </w:r>
       <w:r>
         <w:rPr>
-          <w:lang w:val="fr-FR"/>
+          <w:rFonts w:ascii="Calibri" w:hAnsi="Calibri"/>
+          <w:color w:val="1F2937"/>
+          <w:sz w:val="22"/>
         </w:rPr>
-        <w:t>profile_id (PK, FK), date_naissance, sexe (1: Homme, 2: Femme), habite_commune, habite_region_dept, habite_pays, travail_commune, statut, situation_famille, recherche_de, bio, aime_chez_moi, aime_pas_chez_moi, updated_at.</w:t>
-      </w:r>
-    </w:p>
-    <w:p>
-      <w:pPr>
-        <w:pStyle w:val="ListBullet"/>
-      </w:pPr>
-      <w:r>
-        <w:rPr>
-          <w:b/>
-          <w:lang w:val="fr-FR"/>
-        </w:rPr>
-        <w:t xml:space="preserve">questions : </w:t>
-      </w:r>
-      <w:r>
-        <w:rPr>
-          <w:lang w:val="fr-FR"/>
-        </w:rPr>
-        <w:t>id (PK), pack_id (FK), cible (0: Tous, 1: Homme, 2: Femme), classe (0 à 9), thematique, sujet, type ('G', 'M', 'P', 'T'), texte, config_reponses (JSON), n_quest_lie (clé de liaison parent/enfant ou P &lt;-&gt; T), actif (0/1).</w:t>
-      </w:r>
-    </w:p>
-    <w:p>
-      <w:pPr>
-        <w:pStyle w:val="ListBullet"/>
-      </w:pPr>
-      <w:r>
-        <w:rPr>
-          <w:b/>
-          <w:lang w:val="fr-FR"/>
-        </w:rPr>
-        <w:t xml:space="preserve">answers : </w:t>
-      </w:r>
-      <w:r>
-        <w:rPr>
-          <w:lang w:val="fr-FR"/>
-        </w:rPr>
-        <w:t>profile_id, question_id, axis ('G', 'V', 'A', 'D', 'P'), value (échelle 1 à 5, ou 9 pour jamais/impossible), updated_at.</w:t>
-      </w:r>
-    </w:p>
-    <w:p>
-      <w:pPr>
-        <w:pStyle w:val="ListBullet"/>
-      </w:pPr>
-      <w:r>
-        <w:rPr>
-          <w:b/>
-          <w:lang w:val="fr-FR"/>
-        </w:rPr>
-        <w:t xml:space="preserve">identity_answers_self (+ sur moi) : </w:t>
-      </w:r>
-      <w:r>
-        <w:rPr>
-          <w:lang w:val="fr-FR"/>
-        </w:rPr>
-        <w:t>profile_id, question_id, valeur_num (stature, poids, tours), valeur_text (silhouette, yeux, cheveux, style), updated_at.</w:t>
-      </w:r>
-    </w:p>
-    <w:p>
-      <w:pPr>
-        <w:pStyle w:val="ListBullet"/>
-      </w:pPr>
-      <w:r>
-        <w:rPr>
-          <w:b/>
-          <w:lang w:val="fr-FR"/>
-        </w:rPr>
-        <w:t xml:space="preserve">identity_answers_partner (+ sur l'autre) : </w:t>
-      </w:r>
-      <w:r>
-        <w:rPr>
-          <w:lang w:val="fr-FR"/>
-        </w:rPr>
-        <w:t>profile_id, question_id, min_val, max_val, options_json (liste options acceptées), indifferent (1 si aucune exigence), updated_at.</w:t>
-      </w:r>
-    </w:p>
-    <w:p>
-      <w:pPr>
-        <w:pStyle w:val="ListBullet"/>
-      </w:pPr>
-      <w:r>
-        <w:rPr>
-          <w:b/>
-          <w:lang w:val="fr-FR"/>
-        </w:rPr>
-        <w:t xml:space="preserve">match_requests : </w:t>
-      </w:r>
-      <w:r>
-        <w:rPr>
-          <w:lang w:val="fr-FR"/>
-        </w:rPr>
-        <w:t>id (PK), sender_id (FK), receiver_id (FK), status ('pending', 'accepted', 'rejected'), proposed_classes, validated_classes, created_at, updated_at.</w:t>
-      </w:r>
-    </w:p>
-    <w:p>
-      <w:pPr>
-        <w:spacing w:before="280" w:after="120"/>
-      </w:pPr>
-      <w:r>
-        <w:rPr>
-          <w:b/>
-          <w:color w:val="0E7490"/>
-          <w:sz w:val="28"/>
-          <w:lang w:val="fr-FR"/>
-        </w:rPr>
-        <w:t>4. MODULE D'IDENTITÉ &amp; CARACTÉRISTIQUES (CLASSE 8)</w:t>
-      </w:r>
-    </w:p>
-    <w:p>
-      <w:r>
-        <w:rPr>
-          <w:lang w:val="fr-FR"/>
-        </w:rPr>
-        <w:t>Le module d'identité classe 8 matérialise une innovation majeure issue d'Affinity.docx : dissocier ce que la personne EST (+ sur moi) de ce qu'elle ATTEND chez son/sa partenaire (+ sur l'autre).</w:t>
-      </w:r>
-    </w:p>
-    <w:p>
-      <w:r>
-        <w:rPr>
-          <w:lang w:val="fr-FR"/>
-        </w:rPr>
-        <w:t>Chaque dimension physique, morphologique ou de mode de vie est structurée en un couple indissociable via le champ 'n_quest_lie' :</w:t>
-      </w:r>
-    </w:p>
-    <w:tbl>
-      <w:tblPr>
-        <w:tblW w:type="auto" w:w="0"/>
-        <w:jc w:val="center"/>
-        <w:tblLook w:firstColumn="1" w:firstRow="1" w:lastColumn="0" w:lastRow="0" w:noHBand="0" w:noVBand="1" w:val="04A0"/>
-      </w:tblPr>
-      <w:tblGrid>
-        <w:gridCol w:w="2329"/>
-        <w:gridCol w:w="2329"/>
-        <w:gridCol w:w="2329"/>
-        <w:gridCol w:w="2329"/>
-      </w:tblGrid>
-      <w:tr>
-        <w:tc>
-          <w:tcPr>
-            <w:tcW w:type="dxa" w:w="2329"/>
-            <w:shd w:val="clear" w:color="auto" w:fill="0284C7"/>
-            <w:tcMar>
-              <w:top w:w="100" w:type="dxa"/>
-              <w:bottom w:w="100" w:type="dxa"/>
-              <w:left w:w="120" w:type="dxa"/>
-              <w:right w:w="120" w:type="dxa"/>
-            </w:tcMar>
-          </w:tcPr>
-          <w:p>
-            <w:r>
-              <w:rPr>
-                <w:b/>
-                <w:color w:val="FFFFFF"/>
-                <w:sz w:val="19"/>
-              </w:rPr>
-              <w:t>Dimension</w:t>
-            </w:r>
-          </w:p>
-        </w:tc>
-        <w:tc>
-          <w:tcPr>
-            <w:tcW w:type="dxa" w:w="2329"/>
-            <w:shd w:val="clear" w:color="auto" w:fill="0284C7"/>
-            <w:tcMar>
-              <w:top w:w="100" w:type="dxa"/>
-              <w:bottom w:w="100" w:type="dxa"/>
-              <w:left w:w="120" w:type="dxa"/>
-              <w:right w:w="120" w:type="dxa"/>
-            </w:tcMar>
-          </w:tcPr>
-          <w:p>
-            <w:r>
-              <w:rPr>
-                <w:b/>
-                <w:color w:val="FFFFFF"/>
-                <w:sz w:val="19"/>
-              </w:rPr>
-              <w:t>Type P (+ sur moi)</w:t>
-            </w:r>
-          </w:p>
-        </w:tc>
-        <w:tc>
-          <w:tcPr>
-            <w:tcW w:type="dxa" w:w="2329"/>
-            <w:shd w:val="clear" w:color="auto" w:fill="0284C7"/>
-            <w:tcMar>
-              <w:top w:w="100" w:type="dxa"/>
-              <w:bottom w:w="100" w:type="dxa"/>
-              <w:left w:w="120" w:type="dxa"/>
-              <w:right w:w="120" w:type="dxa"/>
-            </w:tcMar>
-          </w:tcPr>
-          <w:p>
-            <w:r>
-              <w:rPr>
-                <w:b/>
-                <w:color w:val="FFFFFF"/>
-                <w:sz w:val="19"/>
-              </w:rPr>
-              <w:t>Type T (+ sur l'autre)</w:t>
-            </w:r>
-          </w:p>
-        </w:tc>
-        <w:tc>
-          <w:tcPr>
-            <w:tcW w:type="dxa" w:w="2329"/>
-            <w:shd w:val="clear" w:color="auto" w:fill="0284C7"/>
-            <w:tcMar>
-              <w:top w:w="100" w:type="dxa"/>
-              <w:bottom w:w="100" w:type="dxa"/>
-              <w:left w:w="120" w:type="dxa"/>
-              <w:right w:w="120" w:type="dxa"/>
-            </w:tcMar>
-          </w:tcPr>
-          <w:p>
-            <w:r>
-              <w:rPr>
-                <w:b/>
-                <w:color w:val="FFFFFF"/>
-                <w:sz w:val="19"/>
-              </w:rPr>
-              <w:t>Mode &amp; Paramètres</w:t>
-            </w:r>
-          </w:p>
-        </w:tc>
-      </w:tr>
-      <w:tr>
-        <w:tc>
-          <w:tcPr>
-            <w:tcW w:type="dxa" w:w="2329"/>
-            <w:shd w:val="clear" w:color="auto" w:fill="F8FAFC"/>
-            <w:tcMar>
-              <w:top w:w="80" w:type="dxa"/>
-              <w:bottom w:w="80" w:type="dxa"/>
-              <w:left w:w="100" w:type="dxa"/>
-              <w:right w:w="100" w:type="dxa"/>
-            </w:tcMar>
-          </w:tcPr>
-          <w:p>
-            <w:r>
-              <w:rPr>
-                <w:color w:val="1E293B"/>
-                <w:sz w:val="18"/>
-              </w:rPr>
-              <w:t>Stature &amp; Taille</w:t>
-            </w:r>
-          </w:p>
-        </w:tc>
-        <w:tc>
-          <w:tcPr>
-            <w:tcW w:type="dxa" w:w="2329"/>
-            <w:shd w:val="clear" w:color="auto" w:fill="F8FAFC"/>
-            <w:tcMar>
-              <w:top w:w="80" w:type="dxa"/>
-              <w:bottom w:w="80" w:type="dxa"/>
-              <w:left w:w="100" w:type="dxa"/>
-              <w:right w:w="100" w:type="dxa"/>
-            </w:tcMar>
-          </w:tcPr>
-          <w:p>
-            <w:r>
-              <w:rPr>
-                <w:color w:val="1E293B"/>
-                <w:sz w:val="18"/>
-              </w:rPr>
-              <w:t>Q 80001 (cm exacts)</w:t>
-            </w:r>
-          </w:p>
-        </w:tc>
-        <w:tc>
-          <w:tcPr>
-            <w:tcW w:type="dxa" w:w="2329"/>
-            <w:shd w:val="clear" w:color="auto" w:fill="F8FAFC"/>
-            <w:tcMar>
-              <w:top w:w="80" w:type="dxa"/>
-              <w:bottom w:w="80" w:type="dxa"/>
-              <w:left w:w="100" w:type="dxa"/>
-              <w:right w:w="100" w:type="dxa"/>
-            </w:tcMar>
-          </w:tcPr>
-          <w:p>
-            <w:r>
-              <w:rPr>
-                <w:color w:val="1E293B"/>
-                <w:sz w:val="18"/>
-              </w:rPr>
-              <w:t>Q 85001 (tolérance)</w:t>
-            </w:r>
-          </w:p>
-        </w:tc>
-        <w:tc>
-          <w:tcPr>
-            <w:tcW w:type="dxa" w:w="2329"/>
-            <w:shd w:val="clear" w:color="auto" w:fill="F8FAFC"/>
-            <w:tcMar>
-              <w:top w:w="80" w:type="dxa"/>
-              <w:bottom w:w="80" w:type="dxa"/>
-              <w:left w:w="100" w:type="dxa"/>
-              <w:right w:w="100" w:type="dxa"/>
-            </w:tcMar>
-          </w:tcPr>
-          <w:p>
-            <w:r>
-              <w:rPr>
-                <w:color w:val="1E293B"/>
-                <w:sz w:val="18"/>
-              </w:rPr>
-              <w:t>Numérique : Plage Min/Max en cm [100 - 230]</w:t>
-            </w:r>
-          </w:p>
-        </w:tc>
-      </w:tr>
-      <w:tr>
-        <w:tc>
-          <w:tcPr>
-            <w:tcW w:type="dxa" w:w="2329"/>
-            <w:shd w:val="clear" w:color="auto" w:fill="FFFFFF"/>
-            <w:tcMar>
-              <w:top w:w="80" w:type="dxa"/>
-              <w:bottom w:w="80" w:type="dxa"/>
-              <w:left w:w="100" w:type="dxa"/>
-              <w:right w:w="100" w:type="dxa"/>
-            </w:tcMar>
-          </w:tcPr>
-          <w:p>
-            <w:r>
-              <w:rPr>
-                <w:color w:val="1E293B"/>
-                <w:sz w:val="18"/>
-              </w:rPr>
-              <w:t>Corpulence &amp; Poids</w:t>
-            </w:r>
-          </w:p>
-        </w:tc>
-        <w:tc>
-          <w:tcPr>
-            <w:tcW w:type="dxa" w:w="2329"/>
-            <w:shd w:val="clear" w:color="auto" w:fill="FFFFFF"/>
-            <w:tcMar>
-              <w:top w:w="80" w:type="dxa"/>
-              <w:bottom w:w="80" w:type="dxa"/>
-              <w:left w:w="100" w:type="dxa"/>
-              <w:right w:w="100" w:type="dxa"/>
-            </w:tcMar>
-          </w:tcPr>
-          <w:p>
-            <w:r>
-              <w:rPr>
-                <w:color w:val="1E293B"/>
-                <w:sz w:val="18"/>
-              </w:rPr>
-              <w:t>Q 80002 (kg exacts)</w:t>
-            </w:r>
-          </w:p>
-        </w:tc>
-        <w:tc>
-          <w:tcPr>
-            <w:tcW w:type="dxa" w:w="2329"/>
-            <w:shd w:val="clear" w:color="auto" w:fill="FFFFFF"/>
-            <w:tcMar>
-              <w:top w:w="80" w:type="dxa"/>
-              <w:bottom w:w="80" w:type="dxa"/>
-              <w:left w:w="100" w:type="dxa"/>
-              <w:right w:w="100" w:type="dxa"/>
-            </w:tcMar>
-          </w:tcPr>
-          <w:p>
-            <w:r>
-              <w:rPr>
-                <w:color w:val="1E293B"/>
-                <w:sz w:val="18"/>
-              </w:rPr>
-              <w:t>Q 85002 (tolérance)</w:t>
-            </w:r>
-          </w:p>
-        </w:tc>
-        <w:tc>
-          <w:tcPr>
-            <w:tcW w:type="dxa" w:w="2329"/>
-            <w:shd w:val="clear" w:color="auto" w:fill="FFFFFF"/>
-            <w:tcMar>
-              <w:top w:w="80" w:type="dxa"/>
-              <w:bottom w:w="80" w:type="dxa"/>
-              <w:left w:w="100" w:type="dxa"/>
-              <w:right w:w="100" w:type="dxa"/>
-            </w:tcMar>
-          </w:tcPr>
-          <w:p>
-            <w:r>
-              <w:rPr>
-                <w:color w:val="1E293B"/>
-                <w:sz w:val="18"/>
-              </w:rPr>
-              <w:t>Numérique : Plage Min/Max en kg [35 - 200]</w:t>
-            </w:r>
-          </w:p>
-        </w:tc>
-      </w:tr>
-      <w:tr>
-        <w:tc>
-          <w:tcPr>
-            <w:tcW w:type="dxa" w:w="2329"/>
-            <w:shd w:val="clear" w:color="auto" w:fill="F8FAFC"/>
-            <w:tcMar>
-              <w:top w:w="80" w:type="dxa"/>
-              <w:bottom w:w="80" w:type="dxa"/>
-              <w:left w:w="100" w:type="dxa"/>
-              <w:right w:w="100" w:type="dxa"/>
-            </w:tcMar>
-          </w:tcPr>
-          <w:p>
-            <w:r>
-              <w:rPr>
-                <w:color w:val="1E293B"/>
-                <w:sz w:val="18"/>
-              </w:rPr>
-              <w:t>Morphologie &amp; Silhouette</w:t>
-            </w:r>
-          </w:p>
-        </w:tc>
-        <w:tc>
-          <w:tcPr>
-            <w:tcW w:type="dxa" w:w="2329"/>
-            <w:shd w:val="clear" w:color="auto" w:fill="F8FAFC"/>
-            <w:tcMar>
-              <w:top w:w="80" w:type="dxa"/>
-              <w:bottom w:w="80" w:type="dxa"/>
-              <w:left w:w="100" w:type="dxa"/>
-              <w:right w:w="100" w:type="dxa"/>
-            </w:tcMar>
-          </w:tcPr>
-          <w:p>
-            <w:r>
-              <w:rPr>
-                <w:color w:val="1E293B"/>
-                <w:sz w:val="18"/>
-              </w:rPr>
-              <w:t>Q 80003 (select)</w:t>
-            </w:r>
-          </w:p>
-        </w:tc>
-        <w:tc>
-          <w:tcPr>
-            <w:tcW w:type="dxa" w:w="2329"/>
-            <w:shd w:val="clear" w:color="auto" w:fill="F8FAFC"/>
-            <w:tcMar>
-              <w:top w:w="80" w:type="dxa"/>
-              <w:bottom w:w="80" w:type="dxa"/>
-              <w:left w:w="100" w:type="dxa"/>
-              <w:right w:w="100" w:type="dxa"/>
-            </w:tcMar>
-          </w:tcPr>
-          <w:p>
-            <w:r>
-              <w:rPr>
-                <w:color w:val="1E293B"/>
-                <w:sz w:val="18"/>
-              </w:rPr>
-              <w:t>Q 85003 (options)</w:t>
-            </w:r>
-          </w:p>
-        </w:tc>
-        <w:tc>
-          <w:tcPr>
-            <w:tcW w:type="dxa" w:w="2329"/>
-            <w:shd w:val="clear" w:color="auto" w:fill="F8FAFC"/>
-            <w:tcMar>
-              <w:top w:w="80" w:type="dxa"/>
-              <w:bottom w:w="80" w:type="dxa"/>
-              <w:left w:w="100" w:type="dxa"/>
-              <w:right w:w="100" w:type="dxa"/>
-            </w:tcMar>
-          </w:tcPr>
-          <w:p>
-            <w:r>
-              <w:rPr>
-                <w:color w:val="1E293B"/>
-                <w:sz w:val="18"/>
-              </w:rPr>
-              <w:t>Liste : Mince, Sportive, Élancée, Normale, Ronde, Musclée...</w:t>
-            </w:r>
-          </w:p>
-        </w:tc>
-      </w:tr>
-      <w:tr>
-        <w:tc>
-          <w:tcPr>
-            <w:tcW w:type="dxa" w:w="2329"/>
-            <w:shd w:val="clear" w:color="auto" w:fill="FFFFFF"/>
-            <w:tcMar>
-              <w:top w:w="80" w:type="dxa"/>
-              <w:bottom w:w="80" w:type="dxa"/>
-              <w:left w:w="100" w:type="dxa"/>
-              <w:right w:w="100" w:type="dxa"/>
-            </w:tcMar>
-          </w:tcPr>
-          <w:p>
-            <w:r>
-              <w:rPr>
-                <w:color w:val="1E293B"/>
-                <w:sz w:val="18"/>
-              </w:rPr>
-              <w:t>Tour de poitrine (F)</w:t>
-            </w:r>
-          </w:p>
-        </w:tc>
-        <w:tc>
-          <w:tcPr>
-            <w:tcW w:type="dxa" w:w="2329"/>
-            <w:shd w:val="clear" w:color="auto" w:fill="FFFFFF"/>
-            <w:tcMar>
-              <w:top w:w="80" w:type="dxa"/>
-              <w:bottom w:w="80" w:type="dxa"/>
-              <w:left w:w="100" w:type="dxa"/>
-              <w:right w:w="100" w:type="dxa"/>
-            </w:tcMar>
-          </w:tcPr>
-          <w:p>
-            <w:r>
-              <w:rPr>
-                <w:color w:val="1E293B"/>
-                <w:sz w:val="18"/>
-              </w:rPr>
-              <w:t>Q 80004 (cm exacts)</w:t>
-            </w:r>
-          </w:p>
-        </w:tc>
-        <w:tc>
-          <w:tcPr>
-            <w:tcW w:type="dxa" w:w="2329"/>
-            <w:shd w:val="clear" w:color="auto" w:fill="FFFFFF"/>
-            <w:tcMar>
-              <w:top w:w="80" w:type="dxa"/>
-              <w:bottom w:w="80" w:type="dxa"/>
-              <w:left w:w="100" w:type="dxa"/>
-              <w:right w:w="100" w:type="dxa"/>
-            </w:tcMar>
-          </w:tcPr>
-          <w:p>
-            <w:r>
-              <w:rPr>
-                <w:color w:val="1E293B"/>
-                <w:sz w:val="18"/>
-              </w:rPr>
-              <w:t>Q 85004 (tolérance H)</w:t>
-            </w:r>
-          </w:p>
-        </w:tc>
-        <w:tc>
-          <w:tcPr>
-            <w:tcW w:type="dxa" w:w="2329"/>
-            <w:shd w:val="clear" w:color="auto" w:fill="FFFFFF"/>
-            <w:tcMar>
-              <w:top w:w="80" w:type="dxa"/>
-              <w:bottom w:w="80" w:type="dxa"/>
-              <w:left w:w="100" w:type="dxa"/>
-              <w:right w:w="100" w:type="dxa"/>
-            </w:tcMar>
-          </w:tcPr>
-          <w:p>
-            <w:r>
-              <w:rPr>
-                <w:color w:val="1E293B"/>
-                <w:sz w:val="18"/>
-              </w:rPr>
-              <w:t>Numérique : Plage Min/Max en cm [50 - 160]</w:t>
-            </w:r>
-          </w:p>
-        </w:tc>
-      </w:tr>
-      <w:tr>
-        <w:tc>
-          <w:tcPr>
-            <w:tcW w:type="dxa" w:w="2329"/>
-            <w:shd w:val="clear" w:color="auto" w:fill="F8FAFC"/>
-            <w:tcMar>
-              <w:top w:w="80" w:type="dxa"/>
-              <w:bottom w:w="80" w:type="dxa"/>
-              <w:left w:w="100" w:type="dxa"/>
-              <w:right w:w="100" w:type="dxa"/>
-            </w:tcMar>
-          </w:tcPr>
-          <w:p>
-            <w:r>
-              <w:rPr>
-                <w:color w:val="1E293B"/>
-                <w:sz w:val="18"/>
-              </w:rPr>
-              <w:t>Bonnet de poitrine (F)</w:t>
-            </w:r>
-          </w:p>
-        </w:tc>
-        <w:tc>
-          <w:tcPr>
-            <w:tcW w:type="dxa" w:w="2329"/>
-            <w:shd w:val="clear" w:color="auto" w:fill="F8FAFC"/>
-            <w:tcMar>
-              <w:top w:w="80" w:type="dxa"/>
-              <w:bottom w:w="80" w:type="dxa"/>
-              <w:left w:w="100" w:type="dxa"/>
-              <w:right w:w="100" w:type="dxa"/>
-            </w:tcMar>
-          </w:tcPr>
-          <w:p>
-            <w:r>
-              <w:rPr>
-                <w:color w:val="1E293B"/>
-                <w:sz w:val="18"/>
-              </w:rPr>
-              <w:t>Q 80005 (select)</w:t>
-            </w:r>
-          </w:p>
-        </w:tc>
-        <w:tc>
-          <w:tcPr>
-            <w:tcW w:type="dxa" w:w="2329"/>
-            <w:shd w:val="clear" w:color="auto" w:fill="F8FAFC"/>
-            <w:tcMar>
-              <w:top w:w="80" w:type="dxa"/>
-              <w:bottom w:w="80" w:type="dxa"/>
-              <w:left w:w="100" w:type="dxa"/>
-              <w:right w:w="100" w:type="dxa"/>
-            </w:tcMar>
-          </w:tcPr>
-          <w:p>
-            <w:r>
-              <w:rPr>
-                <w:color w:val="1E293B"/>
-                <w:sz w:val="18"/>
-              </w:rPr>
-              <w:t>Q 85005 (options H)</w:t>
-            </w:r>
-          </w:p>
-        </w:tc>
-        <w:tc>
-          <w:tcPr>
-            <w:tcW w:type="dxa" w:w="2329"/>
-            <w:shd w:val="clear" w:color="auto" w:fill="F8FAFC"/>
-            <w:tcMar>
-              <w:top w:w="80" w:type="dxa"/>
-              <w:bottom w:w="80" w:type="dxa"/>
-              <w:left w:w="100" w:type="dxa"/>
-              <w:right w:w="100" w:type="dxa"/>
-            </w:tcMar>
-          </w:tcPr>
-          <w:p>
-            <w:r>
-              <w:rPr>
-                <w:color w:val="1E293B"/>
-                <w:sz w:val="18"/>
-              </w:rPr>
-              <w:t>Liste : A, B, C, D, E, F+</w:t>
-            </w:r>
-          </w:p>
-        </w:tc>
-      </w:tr>
-      <w:tr>
-        <w:tc>
-          <w:tcPr>
-            <w:tcW w:type="dxa" w:w="2329"/>
-            <w:shd w:val="clear" w:color="auto" w:fill="FFFFFF"/>
-            <w:tcMar>
-              <w:top w:w="80" w:type="dxa"/>
-              <w:bottom w:w="80" w:type="dxa"/>
-              <w:left w:w="100" w:type="dxa"/>
-              <w:right w:w="100" w:type="dxa"/>
-            </w:tcMar>
-          </w:tcPr>
-          <w:p>
-            <w:r>
-              <w:rPr>
-                <w:color w:val="1E293B"/>
-                <w:sz w:val="18"/>
-              </w:rPr>
-              <w:t>Pointure de chaussures</w:t>
-            </w:r>
-          </w:p>
-        </w:tc>
-        <w:tc>
-          <w:tcPr>
-            <w:tcW w:type="dxa" w:w="2329"/>
-            <w:shd w:val="clear" w:color="auto" w:fill="FFFFFF"/>
-            <w:tcMar>
-              <w:top w:w="80" w:type="dxa"/>
-              <w:bottom w:w="80" w:type="dxa"/>
-              <w:left w:w="100" w:type="dxa"/>
-              <w:right w:w="100" w:type="dxa"/>
-            </w:tcMar>
-          </w:tcPr>
-          <w:p>
-            <w:r>
-              <w:rPr>
-                <w:color w:val="1E293B"/>
-                <w:sz w:val="18"/>
-              </w:rPr>
-              <w:t>Q 80008 (taille)</w:t>
-            </w:r>
-          </w:p>
-        </w:tc>
-        <w:tc>
-          <w:tcPr>
-            <w:tcW w:type="dxa" w:w="2329"/>
-            <w:shd w:val="clear" w:color="auto" w:fill="FFFFFF"/>
-            <w:tcMar>
-              <w:top w:w="80" w:type="dxa"/>
-              <w:bottom w:w="80" w:type="dxa"/>
-              <w:left w:w="100" w:type="dxa"/>
-              <w:right w:w="100" w:type="dxa"/>
-            </w:tcMar>
-          </w:tcPr>
-          <w:p>
-            <w:r>
-              <w:rPr>
-                <w:color w:val="1E293B"/>
-                <w:sz w:val="18"/>
-              </w:rPr>
-              <w:t>Q 85008 (tolérance)</w:t>
-            </w:r>
-          </w:p>
-        </w:tc>
-        <w:tc>
-          <w:tcPr>
-            <w:tcW w:type="dxa" w:w="2329"/>
-            <w:shd w:val="clear" w:color="auto" w:fill="FFFFFF"/>
-            <w:tcMar>
-              <w:top w:w="80" w:type="dxa"/>
-              <w:bottom w:w="80" w:type="dxa"/>
-              <w:left w:w="100" w:type="dxa"/>
-              <w:right w:w="100" w:type="dxa"/>
-            </w:tcMar>
-          </w:tcPr>
-          <w:p>
-            <w:r>
-              <w:rPr>
-                <w:color w:val="1E293B"/>
-                <w:sz w:val="18"/>
-              </w:rPr>
-              <w:t>Numérique : Plage [32 - 50]</w:t>
-            </w:r>
-          </w:p>
-        </w:tc>
-      </w:tr>
-      <w:tr>
-        <w:tc>
-          <w:tcPr>
-            <w:tcW w:type="dxa" w:w="2329"/>
-            <w:shd w:val="clear" w:color="auto" w:fill="F8FAFC"/>
-            <w:tcMar>
-              <w:top w:w="80" w:type="dxa"/>
-              <w:bottom w:w="80" w:type="dxa"/>
-              <w:left w:w="100" w:type="dxa"/>
-              <w:right w:w="100" w:type="dxa"/>
-            </w:tcMar>
-          </w:tcPr>
-          <w:p>
-            <w:r>
-              <w:rPr>
-                <w:color w:val="1E293B"/>
-                <w:sz w:val="18"/>
-              </w:rPr>
-              <w:t>Couleur des yeux</w:t>
-            </w:r>
-          </w:p>
-        </w:tc>
-        <w:tc>
-          <w:tcPr>
-            <w:tcW w:type="dxa" w:w="2329"/>
-            <w:shd w:val="clear" w:color="auto" w:fill="F8FAFC"/>
-            <w:tcMar>
-              <w:top w:w="80" w:type="dxa"/>
-              <w:bottom w:w="80" w:type="dxa"/>
-              <w:left w:w="100" w:type="dxa"/>
-              <w:right w:w="100" w:type="dxa"/>
-            </w:tcMar>
-          </w:tcPr>
-          <w:p>
-            <w:r>
-              <w:rPr>
-                <w:color w:val="1E293B"/>
-                <w:sz w:val="18"/>
-              </w:rPr>
-              <w:t>Q 80009 (select)</w:t>
-            </w:r>
-          </w:p>
-        </w:tc>
-        <w:tc>
-          <w:tcPr>
-            <w:tcW w:type="dxa" w:w="2329"/>
-            <w:shd w:val="clear" w:color="auto" w:fill="F8FAFC"/>
-            <w:tcMar>
-              <w:top w:w="80" w:type="dxa"/>
-              <w:bottom w:w="80" w:type="dxa"/>
-              <w:left w:w="100" w:type="dxa"/>
-              <w:right w:w="100" w:type="dxa"/>
-            </w:tcMar>
-          </w:tcPr>
-          <w:p>
-            <w:r>
-              <w:rPr>
-                <w:color w:val="1E293B"/>
-                <w:sz w:val="18"/>
-              </w:rPr>
-              <w:t>Q 85009 (options)</w:t>
-            </w:r>
-          </w:p>
-        </w:tc>
-        <w:tc>
-          <w:tcPr>
-            <w:tcW w:type="dxa" w:w="2329"/>
-            <w:shd w:val="clear" w:color="auto" w:fill="F8FAFC"/>
-            <w:tcMar>
-              <w:top w:w="80" w:type="dxa"/>
-              <w:bottom w:w="80" w:type="dxa"/>
-              <w:left w:w="100" w:type="dxa"/>
-              <w:right w:w="100" w:type="dxa"/>
-            </w:tcMar>
-          </w:tcPr>
-          <w:p>
-            <w:r>
-              <w:rPr>
-                <w:color w:val="1E293B"/>
-                <w:sz w:val="18"/>
-              </w:rPr>
-              <w:t>Liste : Bleus, Verts, Marrons, Noirs, Noisette, Gris, Vairons</w:t>
-            </w:r>
-          </w:p>
-        </w:tc>
-      </w:tr>
-      <w:tr>
-        <w:tc>
-          <w:tcPr>
-            <w:tcW w:type="dxa" w:w="2329"/>
-            <w:shd w:val="clear" w:color="auto" w:fill="FFFFFF"/>
-            <w:tcMar>
-              <w:top w:w="80" w:type="dxa"/>
-              <w:bottom w:w="80" w:type="dxa"/>
-              <w:left w:w="100" w:type="dxa"/>
-              <w:right w:w="100" w:type="dxa"/>
-            </w:tcMar>
-          </w:tcPr>
-          <w:p>
-            <w:r>
-              <w:rPr>
-                <w:color w:val="1E293B"/>
-                <w:sz w:val="18"/>
-              </w:rPr>
-              <w:t>Couleur des cheveux</w:t>
-            </w:r>
-          </w:p>
-        </w:tc>
-        <w:tc>
-          <w:tcPr>
-            <w:tcW w:type="dxa" w:w="2329"/>
-            <w:shd w:val="clear" w:color="auto" w:fill="FFFFFF"/>
-            <w:tcMar>
-              <w:top w:w="80" w:type="dxa"/>
-              <w:bottom w:w="80" w:type="dxa"/>
-              <w:left w:w="100" w:type="dxa"/>
-              <w:right w:w="100" w:type="dxa"/>
-            </w:tcMar>
-          </w:tcPr>
-          <w:p>
-            <w:r>
-              <w:rPr>
-                <w:color w:val="1E293B"/>
-                <w:sz w:val="18"/>
-              </w:rPr>
-              <w:t>Q 80010 (select)</w:t>
-            </w:r>
-          </w:p>
-        </w:tc>
-        <w:tc>
-          <w:tcPr>
-            <w:tcW w:type="dxa" w:w="2329"/>
-            <w:shd w:val="clear" w:color="auto" w:fill="FFFFFF"/>
-            <w:tcMar>
-              <w:top w:w="80" w:type="dxa"/>
-              <w:bottom w:w="80" w:type="dxa"/>
-              <w:left w:w="100" w:type="dxa"/>
-              <w:right w:w="100" w:type="dxa"/>
-            </w:tcMar>
-          </w:tcPr>
-          <w:p>
-            <w:r>
-              <w:rPr>
-                <w:color w:val="1E293B"/>
-                <w:sz w:val="18"/>
-              </w:rPr>
-              <w:t>Q 85010 (options)</w:t>
-            </w:r>
-          </w:p>
-        </w:tc>
-        <w:tc>
-          <w:tcPr>
-            <w:tcW w:type="dxa" w:w="2329"/>
-            <w:shd w:val="clear" w:color="auto" w:fill="FFFFFF"/>
-            <w:tcMar>
-              <w:top w:w="80" w:type="dxa"/>
-              <w:bottom w:w="80" w:type="dxa"/>
-              <w:left w:w="100" w:type="dxa"/>
-              <w:right w:w="100" w:type="dxa"/>
-            </w:tcMar>
-          </w:tcPr>
-          <w:p>
-            <w:r>
-              <w:rPr>
-                <w:color w:val="1E293B"/>
-                <w:sz w:val="18"/>
-              </w:rPr>
-              <w:t>Liste : Bruns, Noirs, Châtains, Blonds, Roux, Gris, Chauve...</w:t>
-            </w:r>
-          </w:p>
-        </w:tc>
-      </w:tr>
-      <w:tr>
-        <w:tc>
-          <w:tcPr>
-            <w:tcW w:type="dxa" w:w="2329"/>
-            <w:shd w:val="clear" w:color="auto" w:fill="F8FAFC"/>
-            <w:tcMar>
-              <w:top w:w="80" w:type="dxa"/>
-              <w:bottom w:w="80" w:type="dxa"/>
-              <w:left w:w="100" w:type="dxa"/>
-              <w:right w:w="100" w:type="dxa"/>
-            </w:tcMar>
-          </w:tcPr>
-          <w:p>
-            <w:r>
-              <w:rPr>
-                <w:color w:val="1E293B"/>
-                <w:sz w:val="18"/>
-              </w:rPr>
-              <w:t>Longueur des cheveux</w:t>
-            </w:r>
-          </w:p>
-        </w:tc>
-        <w:tc>
-          <w:tcPr>
-            <w:tcW w:type="dxa" w:w="2329"/>
-            <w:shd w:val="clear" w:color="auto" w:fill="F8FAFC"/>
-            <w:tcMar>
-              <w:top w:w="80" w:type="dxa"/>
-              <w:bottom w:w="80" w:type="dxa"/>
-              <w:left w:w="100" w:type="dxa"/>
-              <w:right w:w="100" w:type="dxa"/>
-            </w:tcMar>
-          </w:tcPr>
-          <w:p>
-            <w:r>
-              <w:rPr>
-                <w:color w:val="1E293B"/>
-                <w:sz w:val="18"/>
-              </w:rPr>
-              <w:t>Q 80011 (select)</w:t>
-            </w:r>
-          </w:p>
-        </w:tc>
-        <w:tc>
-          <w:tcPr>
-            <w:tcW w:type="dxa" w:w="2329"/>
-            <w:shd w:val="clear" w:color="auto" w:fill="F8FAFC"/>
-            <w:tcMar>
-              <w:top w:w="80" w:type="dxa"/>
-              <w:bottom w:w="80" w:type="dxa"/>
-              <w:left w:w="100" w:type="dxa"/>
-              <w:right w:w="100" w:type="dxa"/>
-            </w:tcMar>
-          </w:tcPr>
-          <w:p>
-            <w:r>
-              <w:rPr>
-                <w:color w:val="1E293B"/>
-                <w:sz w:val="18"/>
-              </w:rPr>
-              <w:t>Q 85011 (options)</w:t>
-            </w:r>
-          </w:p>
-        </w:tc>
-        <w:tc>
-          <w:tcPr>
-            <w:tcW w:type="dxa" w:w="2329"/>
-            <w:shd w:val="clear" w:color="auto" w:fill="F8FAFC"/>
-            <w:tcMar>
-              <w:top w:w="80" w:type="dxa"/>
-              <w:bottom w:w="80" w:type="dxa"/>
-              <w:left w:w="100" w:type="dxa"/>
-              <w:right w:w="100" w:type="dxa"/>
-            </w:tcMar>
-          </w:tcPr>
-          <w:p>
-            <w:r>
-              <w:rPr>
-                <w:color w:val="1E293B"/>
-                <w:sz w:val="18"/>
-              </w:rPr>
-              <w:t>Liste : Très courts, Courts, Mi-longs, Longs, Très longs</w:t>
-            </w:r>
-          </w:p>
-        </w:tc>
-      </w:tr>
-      <w:tr>
-        <w:tc>
-          <w:tcPr>
-            <w:tcW w:type="dxa" w:w="2329"/>
-            <w:shd w:val="clear" w:color="auto" w:fill="FFFFFF"/>
-            <w:tcMar>
-              <w:top w:w="80" w:type="dxa"/>
-              <w:bottom w:w="80" w:type="dxa"/>
-              <w:left w:w="100" w:type="dxa"/>
-              <w:right w:w="100" w:type="dxa"/>
-            </w:tcMar>
-          </w:tcPr>
-          <w:p>
-            <w:r>
-              <w:rPr>
-                <w:color w:val="1E293B"/>
-                <w:sz w:val="18"/>
-              </w:rPr>
-              <w:t>Pilosité faciale (H)</w:t>
-            </w:r>
-          </w:p>
-        </w:tc>
-        <w:tc>
-          <w:tcPr>
-            <w:tcW w:type="dxa" w:w="2329"/>
-            <w:shd w:val="clear" w:color="auto" w:fill="FFFFFF"/>
-            <w:tcMar>
-              <w:top w:w="80" w:type="dxa"/>
-              <w:bottom w:w="80" w:type="dxa"/>
-              <w:left w:w="100" w:type="dxa"/>
-              <w:right w:w="100" w:type="dxa"/>
-            </w:tcMar>
-          </w:tcPr>
-          <w:p>
-            <w:r>
-              <w:rPr>
-                <w:color w:val="1E293B"/>
-                <w:sz w:val="18"/>
-              </w:rPr>
-              <w:t>Q 80012 (select)</w:t>
-            </w:r>
-          </w:p>
-        </w:tc>
-        <w:tc>
-          <w:tcPr>
-            <w:tcW w:type="dxa" w:w="2329"/>
-            <w:shd w:val="clear" w:color="auto" w:fill="FFFFFF"/>
-            <w:tcMar>
-              <w:top w:w="80" w:type="dxa"/>
-              <w:bottom w:w="80" w:type="dxa"/>
-              <w:left w:w="100" w:type="dxa"/>
-              <w:right w:w="100" w:type="dxa"/>
-            </w:tcMar>
-          </w:tcPr>
-          <w:p>
-            <w:r>
-              <w:rPr>
-                <w:color w:val="1E293B"/>
-                <w:sz w:val="18"/>
-              </w:rPr>
-              <w:t>Q 85012 (options F)</w:t>
-            </w:r>
-          </w:p>
-        </w:tc>
-        <w:tc>
-          <w:tcPr>
-            <w:tcW w:type="dxa" w:w="2329"/>
-            <w:shd w:val="clear" w:color="auto" w:fill="FFFFFF"/>
-            <w:tcMar>
-              <w:top w:w="80" w:type="dxa"/>
-              <w:bottom w:w="80" w:type="dxa"/>
-              <w:left w:w="100" w:type="dxa"/>
-              <w:right w:w="100" w:type="dxa"/>
-            </w:tcMar>
-          </w:tcPr>
-          <w:p>
-            <w:r>
-              <w:rPr>
-                <w:color w:val="1E293B"/>
-                <w:sz w:val="18"/>
-              </w:rPr>
-              <w:t>Liste : Rasé de près, Barbe courte, Barbe fournie, Moustache...</w:t>
-            </w:r>
-          </w:p>
-        </w:tc>
-      </w:tr>
-      <w:tr>
-        <w:tc>
-          <w:tcPr>
-            <w:tcW w:type="dxa" w:w="2329"/>
-            <w:shd w:val="clear" w:color="auto" w:fill="F8FAFC"/>
-            <w:tcMar>
-              <w:top w:w="80" w:type="dxa"/>
-              <w:bottom w:w="80" w:type="dxa"/>
-              <w:left w:w="100" w:type="dxa"/>
-              <w:right w:w="100" w:type="dxa"/>
-            </w:tcMar>
-          </w:tcPr>
-          <w:p>
-            <w:r>
-              <w:rPr>
-                <w:color w:val="1E293B"/>
-                <w:sz w:val="18"/>
-              </w:rPr>
-              <w:t>Style vestimentaire</w:t>
-            </w:r>
-          </w:p>
-        </w:tc>
-        <w:tc>
-          <w:tcPr>
-            <w:tcW w:type="dxa" w:w="2329"/>
-            <w:shd w:val="clear" w:color="auto" w:fill="F8FAFC"/>
-            <w:tcMar>
-              <w:top w:w="80" w:type="dxa"/>
-              <w:bottom w:w="80" w:type="dxa"/>
-              <w:left w:w="100" w:type="dxa"/>
-              <w:right w:w="100" w:type="dxa"/>
-            </w:tcMar>
-          </w:tcPr>
-          <w:p>
-            <w:r>
-              <w:rPr>
-                <w:color w:val="1E293B"/>
-                <w:sz w:val="18"/>
-              </w:rPr>
-              <w:t>Q 80013 (select)</w:t>
-            </w:r>
-          </w:p>
-        </w:tc>
-        <w:tc>
-          <w:tcPr>
-            <w:tcW w:type="dxa" w:w="2329"/>
-            <w:shd w:val="clear" w:color="auto" w:fill="F8FAFC"/>
-            <w:tcMar>
-              <w:top w:w="80" w:type="dxa"/>
-              <w:bottom w:w="80" w:type="dxa"/>
-              <w:left w:w="100" w:type="dxa"/>
-              <w:right w:w="100" w:type="dxa"/>
-            </w:tcMar>
-          </w:tcPr>
-          <w:p>
-            <w:r>
-              <w:rPr>
-                <w:color w:val="1E293B"/>
-                <w:sz w:val="18"/>
-              </w:rPr>
-              <w:t>Q 85013 (options)</w:t>
-            </w:r>
-          </w:p>
-        </w:tc>
-        <w:tc>
-          <w:tcPr>
-            <w:tcW w:type="dxa" w:w="2329"/>
-            <w:shd w:val="clear" w:color="auto" w:fill="F8FAFC"/>
-            <w:tcMar>
-              <w:top w:w="80" w:type="dxa"/>
-              <w:bottom w:w="80" w:type="dxa"/>
-              <w:left w:w="100" w:type="dxa"/>
-              <w:right w:w="100" w:type="dxa"/>
-            </w:tcMar>
-          </w:tcPr>
-          <w:p>
-            <w:r>
-              <w:rPr>
-                <w:color w:val="1E293B"/>
-                <w:sz w:val="18"/>
-              </w:rPr>
-              <w:t>Liste : Décontracté, Élégant, Chic, Sportswear, Streetwear, Rock...</w:t>
-            </w:r>
-          </w:p>
-        </w:tc>
-      </w:tr>
-      <w:tr>
-        <w:tc>
-          <w:tcPr>
-            <w:tcW w:type="dxa" w:w="2329"/>
-            <w:shd w:val="clear" w:color="auto" w:fill="FFFFFF"/>
-            <w:tcMar>
-              <w:top w:w="80" w:type="dxa"/>
-              <w:bottom w:w="80" w:type="dxa"/>
-              <w:left w:w="100" w:type="dxa"/>
-              <w:right w:w="100" w:type="dxa"/>
-            </w:tcMar>
-          </w:tcPr>
-          <w:p>
-            <w:r>
-              <w:rPr>
-                <w:color w:val="1E293B"/>
-                <w:sz w:val="18"/>
-              </w:rPr>
-              <w:t>Origines culturelles</w:t>
-            </w:r>
-          </w:p>
-        </w:tc>
-        <w:tc>
-          <w:tcPr>
-            <w:tcW w:type="dxa" w:w="2329"/>
-            <w:shd w:val="clear" w:color="auto" w:fill="FFFFFF"/>
-            <w:tcMar>
-              <w:top w:w="80" w:type="dxa"/>
-              <w:bottom w:w="80" w:type="dxa"/>
-              <w:left w:w="100" w:type="dxa"/>
-              <w:right w:w="100" w:type="dxa"/>
-            </w:tcMar>
-          </w:tcPr>
-          <w:p>
-            <w:r>
-              <w:rPr>
-                <w:color w:val="1E293B"/>
-                <w:sz w:val="18"/>
-              </w:rPr>
-              <w:t>Q 80014 (select)</w:t>
-            </w:r>
-          </w:p>
-        </w:tc>
-        <w:tc>
-          <w:tcPr>
-            <w:tcW w:type="dxa" w:w="2329"/>
-            <w:shd w:val="clear" w:color="auto" w:fill="FFFFFF"/>
-            <w:tcMar>
-              <w:top w:w="80" w:type="dxa"/>
-              <w:bottom w:w="80" w:type="dxa"/>
-              <w:left w:w="100" w:type="dxa"/>
-              <w:right w:w="100" w:type="dxa"/>
-            </w:tcMar>
-          </w:tcPr>
-          <w:p>
-            <w:r>
-              <w:rPr>
-                <w:color w:val="1E293B"/>
-                <w:sz w:val="18"/>
-              </w:rPr>
-              <w:t>Q 85014 (options)</w:t>
-            </w:r>
-          </w:p>
-        </w:tc>
-        <w:tc>
-          <w:tcPr>
-            <w:tcW w:type="dxa" w:w="2329"/>
-            <w:shd w:val="clear" w:color="auto" w:fill="FFFFFF"/>
-            <w:tcMar>
-              <w:top w:w="80" w:type="dxa"/>
-              <w:bottom w:w="80" w:type="dxa"/>
-              <w:left w:w="100" w:type="dxa"/>
-              <w:right w:w="100" w:type="dxa"/>
-            </w:tcMar>
-          </w:tcPr>
-          <w:p>
-            <w:r>
-              <w:rPr>
-                <w:color w:val="1E293B"/>
-                <w:sz w:val="18"/>
-              </w:rPr>
-              <w:t>Liste : Caucasien, Méditerranéen, Maghrébin, Africain, Asiatique...</w:t>
-            </w:r>
-          </w:p>
-        </w:tc>
-      </w:tr>
-      <w:tr>
-        <w:tc>
-          <w:tcPr>
-            <w:tcW w:type="dxa" w:w="2329"/>
-            <w:shd w:val="clear" w:color="auto" w:fill="F8FAFC"/>
-            <w:tcMar>
-              <w:top w:w="80" w:type="dxa"/>
-              <w:bottom w:w="80" w:type="dxa"/>
-              <w:left w:w="100" w:type="dxa"/>
-              <w:right w:w="100" w:type="dxa"/>
-            </w:tcMar>
-          </w:tcPr>
-          <w:p>
-            <w:r>
-              <w:rPr>
-                <w:color w:val="1E293B"/>
-                <w:sz w:val="18"/>
-              </w:rPr>
-              <w:t>Rythme de vie</w:t>
-            </w:r>
-          </w:p>
-        </w:tc>
-        <w:tc>
-          <w:tcPr>
-            <w:tcW w:type="dxa" w:w="2329"/>
-            <w:shd w:val="clear" w:color="auto" w:fill="F8FAFC"/>
-            <w:tcMar>
-              <w:top w:w="80" w:type="dxa"/>
-              <w:bottom w:w="80" w:type="dxa"/>
-              <w:left w:w="100" w:type="dxa"/>
-              <w:right w:w="100" w:type="dxa"/>
-            </w:tcMar>
-          </w:tcPr>
-          <w:p>
-            <w:r>
-              <w:rPr>
-                <w:color w:val="1E293B"/>
-                <w:sz w:val="18"/>
-              </w:rPr>
-              <w:t>Q 80015 (select)</w:t>
-            </w:r>
-          </w:p>
-        </w:tc>
-        <w:tc>
-          <w:tcPr>
-            <w:tcW w:type="dxa" w:w="2329"/>
-            <w:shd w:val="clear" w:color="auto" w:fill="F8FAFC"/>
-            <w:tcMar>
-              <w:top w:w="80" w:type="dxa"/>
-              <w:bottom w:w="80" w:type="dxa"/>
-              <w:left w:w="100" w:type="dxa"/>
-              <w:right w:w="100" w:type="dxa"/>
-            </w:tcMar>
-          </w:tcPr>
-          <w:p>
-            <w:r>
-              <w:rPr>
-                <w:color w:val="1E293B"/>
-                <w:sz w:val="18"/>
-              </w:rPr>
-              <w:t>Q 85015 (options)</w:t>
-            </w:r>
-          </w:p>
-        </w:tc>
-        <w:tc>
-          <w:tcPr>
-            <w:tcW w:type="dxa" w:w="2329"/>
-            <w:shd w:val="clear" w:color="auto" w:fill="F8FAFC"/>
-            <w:tcMar>
-              <w:top w:w="80" w:type="dxa"/>
-              <w:bottom w:w="80" w:type="dxa"/>
-              <w:left w:w="100" w:type="dxa"/>
-              <w:right w:w="100" w:type="dxa"/>
-            </w:tcMar>
-          </w:tcPr>
-          <w:p>
-            <w:r>
-              <w:rPr>
-                <w:color w:val="1E293B"/>
-                <w:sz w:val="18"/>
-              </w:rPr>
-              <w:t>Liste : Diurne/Matinal, Noctambule, Variable/Flexible...</w:t>
-            </w:r>
-          </w:p>
-        </w:tc>
-      </w:tr>
-      <w:tr>
-        <w:tc>
-          <w:tcPr>
-            <w:tcW w:type="dxa" w:w="2329"/>
-            <w:shd w:val="clear" w:color="auto" w:fill="FFFFFF"/>
-            <w:tcMar>
-              <w:top w:w="80" w:type="dxa"/>
-              <w:bottom w:w="80" w:type="dxa"/>
-              <w:left w:w="100" w:type="dxa"/>
-              <w:right w:w="100" w:type="dxa"/>
-            </w:tcMar>
-          </w:tcPr>
-          <w:p>
-            <w:r>
-              <w:rPr>
-                <w:color w:val="1E293B"/>
-                <w:sz w:val="18"/>
-              </w:rPr>
-              <w:t>Cadre de vie privilégié</w:t>
-            </w:r>
-          </w:p>
-        </w:tc>
-        <w:tc>
-          <w:tcPr>
-            <w:tcW w:type="dxa" w:w="2329"/>
-            <w:shd w:val="clear" w:color="auto" w:fill="FFFFFF"/>
-            <w:tcMar>
-              <w:top w:w="80" w:type="dxa"/>
-              <w:bottom w:w="80" w:type="dxa"/>
-              <w:left w:w="100" w:type="dxa"/>
-              <w:right w:w="100" w:type="dxa"/>
-            </w:tcMar>
-          </w:tcPr>
-          <w:p>
-            <w:r>
-              <w:rPr>
-                <w:color w:val="1E293B"/>
-                <w:sz w:val="18"/>
-              </w:rPr>
-              <w:t>Q 80016 (select)</w:t>
-            </w:r>
-          </w:p>
-        </w:tc>
-        <w:tc>
-          <w:tcPr>
-            <w:tcW w:type="dxa" w:w="2329"/>
-            <w:shd w:val="clear" w:color="auto" w:fill="FFFFFF"/>
-            <w:tcMar>
-              <w:top w:w="80" w:type="dxa"/>
-              <w:bottom w:w="80" w:type="dxa"/>
-              <w:left w:w="100" w:type="dxa"/>
-              <w:right w:w="100" w:type="dxa"/>
-            </w:tcMar>
-          </w:tcPr>
-          <w:p>
-            <w:r>
-              <w:rPr>
-                <w:color w:val="1E293B"/>
-                <w:sz w:val="18"/>
-              </w:rPr>
-              <w:t>Q 85016 (options)</w:t>
-            </w:r>
-          </w:p>
-        </w:tc>
-        <w:tc>
-          <w:tcPr>
-            <w:tcW w:type="dxa" w:w="2329"/>
-            <w:shd w:val="clear" w:color="auto" w:fill="FFFFFF"/>
-            <w:tcMar>
-              <w:top w:w="80" w:type="dxa"/>
-              <w:bottom w:w="80" w:type="dxa"/>
-              <w:left w:w="100" w:type="dxa"/>
-              <w:right w:w="100" w:type="dxa"/>
-            </w:tcMar>
-          </w:tcPr>
-          <w:p>
-            <w:r>
-              <w:rPr>
-                <w:color w:val="1E293B"/>
-                <w:sz w:val="18"/>
-              </w:rPr>
-              <w:t>Liste : Grande métropole, Ville moyenne, Village, Pleine nature...</w:t>
-            </w:r>
-          </w:p>
-        </w:tc>
-      </w:tr>
-    </w:tbl>
-    <w:p>
-      <w:r>
-        <w:rPr>
-          <w:lang w:val="fr-FR"/>
-        </w:rPr>
-        <w:br w:type="page"/>
-      </w:r>
-    </w:p>
-    <w:p>
-      <w:pPr>
-        <w:spacing w:before="240" w:after="120"/>
-      </w:pPr>
-      <w:r>
-        <w:rPr>
-          <w:b/>
-          <w:color w:val="0E7490"/>
-          <w:sz w:val="28"/>
-          <w:lang w:val="fr-FR"/>
-        </w:rPr>
-        <w:t>5. DIAGNOSTIC PRÉALABLE DE COMPATIBILITÉ IDENTITÉ (MOI &amp; L'AUTRE)</w:t>
-      </w:r>
-    </w:p>
-    <w:p>
-      <w:r>
-        <w:rPr>
-          <w:lang w:val="fr-FR"/>
-        </w:rPr>
-        <w:t>Conformément aux directives de conception, un diagnostic de compatibilité d'identité est exécuté EN PRÉALABLE à tout calcul de match. Il permet de détecter immédiatement si deux profils correspondent physiquement et stylistiquement à leurs souhaits respectifs.</w:t>
-      </w:r>
-    </w:p>
-    <w:p>
-      <w:r>
-        <w:rPr>
-          <w:lang w:val="fr-FR"/>
-        </w:rPr>
-        <w:t>L'algorithme 'evaluate_identity_compatibility(profile1_id, profile2_id)' réalise un contrôle croisé complet :</w:t>
-      </w:r>
-    </w:p>
-    <w:p>
-      <w:pPr>
-        <w:pStyle w:val="ListBullet"/>
-      </w:pPr>
-      <w:r>
-        <w:rPr>
-          <w:b/>
-          <w:lang w:val="fr-FR"/>
-        </w:rPr>
-        <w:t xml:space="preserve">Sens 1 (Attentes de P1 envers P2) : </w:t>
-      </w:r>
-      <w:r>
-        <w:rPr>
-          <w:lang w:val="fr-FR"/>
-        </w:rPr>
-        <w:t>Les critères tolérés de P1 (+ sur l'autre) sont confrontés aux valeurs déclarées de P2 (+ sur moi, avec repli sur la fiche d'identité).</w:t>
-      </w:r>
-    </w:p>
-    <w:p>
-      <w:pPr>
-        <w:pStyle w:val="ListBullet"/>
-      </w:pPr>
-      <w:r>
-        <w:rPr>
-          <w:b/>
-          <w:lang w:val="fr-FR"/>
-        </w:rPr>
-        <w:t xml:space="preserve">Sens 2 (Attentes de P2 envers P1) : </w:t>
-      </w:r>
-      <w:r>
-        <w:rPr>
-          <w:lang w:val="fr-FR"/>
-        </w:rPr>
-        <w:t>De façon symétrique, les critères tolérés de P2 sont confrontés aux valeurs déclarées de P1.</w:t>
-      </w:r>
-    </w:p>
-    <w:p>
-      <w:pPr>
-        <w:pStyle w:val="ListBullet"/>
-      </w:pPr>
-      <w:r>
-        <w:rPr>
-          <w:b/>
-          <w:lang w:val="fr-FR"/>
-        </w:rPr>
-        <w:t xml:space="preserve">Règle de l'Indifférence : </w:t>
-      </w:r>
-      <w:r>
-        <w:rPr>
-          <w:lang w:val="fr-FR"/>
-        </w:rPr>
-        <w:t>Si un profil a coché 'Indifférent' sur une dimension, le critère est systématiquement validé comme COMPATIBLE sans restriction.</w:t>
-      </w:r>
-    </w:p>
-    <w:p>
-      <w:pPr>
-        <w:pStyle w:val="ListBullet"/>
-      </w:pPr>
-      <w:r>
-        <w:rPr>
-          <w:b/>
-          <w:lang w:val="fr-FR"/>
-        </w:rPr>
-        <w:t xml:space="preserve">Contrôle Numérique &amp; Liste : </w:t>
-      </w:r>
-      <w:r>
-        <w:rPr>
-          <w:lang w:val="fr-FR"/>
-        </w:rPr>
-        <w:t>Pour les dimensions numériques (stature, corpulence, mensurations), la valeur doit être comprise dans l'intervalle [min_val, max_val]. Pour les sélections, la valeur textuelle doit être présente dans les options tolérées.</w:t>
-      </w:r>
-    </w:p>
-    <w:p>
-      <w:pPr>
-        <w:pStyle w:val="ListBullet"/>
-      </w:pPr>
-      <w:r>
-        <w:rPr>
-          <w:b/>
-          <w:lang w:val="fr-FR"/>
-        </w:rPr>
-        <w:t xml:space="preserve">Verdicts &amp; Restitution : </w:t>
-      </w:r>
-      <w:r>
-        <w:rPr>
-          <w:lang w:val="fr-FR"/>
-        </w:rPr>
-        <w:t>L'algorithme renvoie un niveau synthétique : 'COMPATIBLE' (0 divergence), 'PARTIEL' (divergences mineures), 'INCOMPATIBLE' (divergences majeures) ou 'NON_EVALUE' (aucun critère restrictif défini). Ce diagnostic est affiché à la fois en temps réel dans l'aperçu préalable du profil cible et en première section des résultats de match.</w:t>
-      </w:r>
-    </w:p>
-    <w:p>
-      <w:pPr>
-        <w:spacing w:before="280" w:after="120"/>
-      </w:pPr>
-      <w:r>
-        <w:rPr>
-          <w:b/>
-          <w:color w:val="0E7490"/>
-          <w:sz w:val="28"/>
-          <w:lang w:val="fr-FR"/>
-        </w:rPr>
-        <w:t>6. MOTEUR DE CALCUL D'AFFINITÉ ÉLECTIVE (ALGORITHME V-A-D-P)</w:t>
-      </w:r>
-    </w:p>
-    <w:p>
-      <w:r>
-        <w:rPr>
-          <w:lang w:val="fr-FR"/>
-        </w:rPr>
-        <w:t>L'algorithme Affinity calcule un score d'affinité global pondéré (0% à 100%) basé sur la concordance psychologique et comportementale :</w:t>
-      </w:r>
-    </w:p>
-    <w:p>
-      <w:pPr>
-        <w:pStyle w:val="ListBullet"/>
-      </w:pPr>
-      <w:r>
-        <w:rPr>
-          <w:b/>
-          <w:lang w:val="fr-FR"/>
-        </w:rPr>
-        <w:t xml:space="preserve">1. Règle d'or de complétion du profil : </w:t>
-      </w:r>
-      <w:r>
-        <w:rPr>
-          <w:lang w:val="fr-FR"/>
-        </w:rPr>
-        <w:t>Le calcul d'affinité est rigoureusement bloqué tant que les deux profils n'ont pas complété leur fiche d'identité (sexe, date de naissance, ville).</w:t>
-      </w:r>
-    </w:p>
-    <w:p>
-      <w:pPr>
-        <w:pStyle w:val="ListBullet"/>
-      </w:pPr>
-      <w:r>
-        <w:rPr>
-          <w:b/>
-          <w:lang w:val="fr-FR"/>
-        </w:rPr>
-        <w:t xml:space="preserve">2. Questions de Type G (Goûts Partagés) : </w:t>
-      </w:r>
-      <w:r>
-        <w:rPr>
-          <w:lang w:val="fr-FR"/>
-        </w:rPr>
-        <w:t>Mesure de la proximité simple sur l'échelle : Proximité = max(0, 1 - |v1 - v2| / 5).</w:t>
-      </w:r>
-    </w:p>
-    <w:p>
-      <w:pPr>
-        <w:pStyle w:val="ListBullet"/>
-      </w:pPr>
-      <w:r>
-        <w:rPr>
-          <w:b/>
-          <w:lang w:val="fr-FR"/>
-        </w:rPr>
-        <w:t xml:space="preserve">3. Questions de Type M (Multi-Axes V-A-D-P) : </w:t>
-      </w:r>
-      <w:r>
-        <w:rPr>
-          <w:lang w:val="fr-FR"/>
-        </w:rPr>
-        <w:t>• Vécu passé (V, coef 0.7) : proximité des expériences antérieures.</w:t>
-        <w:br/>
-        <w:t>• Habitudes actuelles (A, coef 1.0) : concordance du mode de vie présent.</w:t>
-        <w:br/>
-        <w:t>• Synergie croisée Découverte &amp; Partage (D x P, coef 1.2, Cœur de l'algorithme) : croise le désir de découverte de P1 (D1) avec la volonté de partage de P2 (P2), et réciproquement (D2 x P1). Harmonie maximale si les deux sont positifs (&gt;= 3), tension forte si l'un refuse (1 ou 9) et l'autre exige (5).</w:t>
-      </w:r>
-    </w:p>
-    <w:p>
-      <w:pPr>
-        <w:pStyle w:val="ListBullet"/>
-      </w:pPr>
-      <w:r>
-        <w:rPr>
-          <w:b/>
-          <w:lang w:val="fr-FR"/>
-        </w:rPr>
-        <w:t xml:space="preserve">4. Résilience &amp; Absence de questions communes : </w:t>
-      </w:r>
-      <w:r>
-        <w:rPr>
-          <w:lang w:val="fr-FR"/>
-        </w:rPr>
-        <w:t>Si deux profils n'ont répondu à aucune question commune, le moteur renvoie une structure saine et complète (profile1, profile2, axes à zéro, diagnostic d'identité et message informatif explicite), éliminant tout crash d'indéfinition de propriétés.</w:t>
-      </w:r>
-    </w:p>
-    <w:p>
-      <w:pPr>
-        <w:pStyle w:val="ListBullet"/>
-      </w:pPr>
-      <w:r>
-        <w:rPr>
-          <w:b/>
-          <w:lang w:val="fr-FR"/>
-        </w:rPr>
-        <w:t xml:space="preserve">5. Distance kilométrique : </w:t>
-      </w:r>
-      <w:r>
-        <w:rPr>
-          <w:lang w:val="fr-FR"/>
-        </w:rPr>
-        <w:t>Calculée selon la formule de Haversine à partir des coordonnées géographiques des communes. Conformément à la volonté de l'auteur, la distance est strictement indicative et n'altère pas le score d'affinité psychologique.</w:t>
-      </w:r>
-    </w:p>
-    <w:p>
-      <w:pPr>
-        <w:spacing w:before="280" w:after="120"/>
-      </w:pPr>
-      <w:r>
-        <w:rPr>
-          <w:b/>
-          <w:color w:val="0E7490"/>
-          <w:sz w:val="28"/>
-          <w:lang w:val="fr-FR"/>
-        </w:rPr>
-        <w:t>7. SPÉCIFICATION DES API REST (ENDPOINTS)</w:t>
-      </w:r>
-    </w:p>
-    <w:p>
-      <w:r>
-        <w:rPr>
-          <w:lang w:val="fr-FR"/>
-        </w:rPr>
-        <w:t>Le serveur Python expose une architecture d'API REST robuste et modulaire :</w:t>
-      </w:r>
-    </w:p>
-    <w:tbl>
-      <w:tblPr>
-        <w:tblW w:type="auto" w:w="0"/>
-        <w:jc w:val="center"/>
-        <w:tblLook w:firstColumn="1" w:firstRow="1" w:lastColumn="0" w:lastRow="0" w:noHBand="0" w:noVBand="1" w:val="04A0"/>
-      </w:tblPr>
-      <w:tblGrid>
-        <w:gridCol w:w="3106"/>
-        <w:gridCol w:w="3106"/>
-        <w:gridCol w:w="3106"/>
-      </w:tblGrid>
-      <w:tr>
-        <w:tc>
-          <w:tcPr>
-            <w:tcW w:type="dxa" w:w="3106"/>
-            <w:shd w:val="clear" w:color="auto" w:fill="0F172A"/>
-            <w:tcMar>
-              <w:top w:w="100" w:type="dxa"/>
-              <w:bottom w:w="100" w:type="dxa"/>
-              <w:left w:w="120" w:type="dxa"/>
-              <w:right w:w="120" w:type="dxa"/>
-            </w:tcMar>
-          </w:tcPr>
-          <w:p>
-            <w:r>
-              <w:rPr>
-                <w:b/>
-                <w:color w:val="FFFFFF"/>
-                <w:sz w:val="19"/>
-              </w:rPr>
-              <w:t>Méthode &amp; Route</w:t>
-            </w:r>
-          </w:p>
-        </w:tc>
-        <w:tc>
-          <w:tcPr>
-            <w:tcW w:type="dxa" w:w="3106"/>
-            <w:shd w:val="clear" w:color="auto" w:fill="0F172A"/>
-            <w:tcMar>
-              <w:top w:w="100" w:type="dxa"/>
-              <w:bottom w:w="100" w:type="dxa"/>
-              <w:left w:w="120" w:type="dxa"/>
-              <w:right w:w="120" w:type="dxa"/>
-            </w:tcMar>
-          </w:tcPr>
-          <w:p>
-            <w:r>
-              <w:rPr>
-                <w:b/>
-                <w:color w:val="FFFFFF"/>
-                <w:sz w:val="19"/>
-              </w:rPr>
-              <w:t>Rôle Requis</w:t>
-            </w:r>
-          </w:p>
-        </w:tc>
-        <w:tc>
-          <w:tcPr>
-            <w:tcW w:type="dxa" w:w="3106"/>
-            <w:shd w:val="clear" w:color="auto" w:fill="0F172A"/>
-            <w:tcMar>
-              <w:top w:w="100" w:type="dxa"/>
-              <w:bottom w:w="100" w:type="dxa"/>
-              <w:left w:w="120" w:type="dxa"/>
-              <w:right w:w="120" w:type="dxa"/>
-            </w:tcMar>
-          </w:tcPr>
-          <w:p>
-            <w:r>
-              <w:rPr>
-                <w:b/>
-                <w:color w:val="FFFFFF"/>
-                <w:sz w:val="19"/>
-              </w:rPr>
-              <w:t>Description &amp; Payload</w:t>
-            </w:r>
-          </w:p>
-        </w:tc>
-      </w:tr>
-      <w:tr>
-        <w:tc>
-          <w:tcPr>
-            <w:tcW w:type="dxa" w:w="3106"/>
-            <w:shd w:val="clear" w:color="auto" w:fill="F8FAFC"/>
-            <w:tcMar>
-              <w:top w:w="80" w:type="dxa"/>
-              <w:bottom w:w="80" w:type="dxa"/>
-              <w:left w:w="100" w:type="dxa"/>
-              <w:right w:w="100" w:type="dxa"/>
-            </w:tcMar>
-          </w:tcPr>
-          <w:p>
-            <w:r>
-              <w:rPr>
-                <w:color w:val="1E293B"/>
-                <w:sz w:val="18"/>
-              </w:rPr>
-              <w:t>POST /api/auth/login</w:t>
-            </w:r>
-          </w:p>
-        </w:tc>
-        <w:tc>
-          <w:tcPr>
-            <w:tcW w:type="dxa" w:w="3106"/>
-            <w:shd w:val="clear" w:color="auto" w:fill="F8FAFC"/>
-            <w:tcMar>
-              <w:top w:w="80" w:type="dxa"/>
-              <w:bottom w:w="80" w:type="dxa"/>
-              <w:left w:w="100" w:type="dxa"/>
-              <w:right w:w="100" w:type="dxa"/>
-            </w:tcMar>
-          </w:tcPr>
-          <w:p>
-            <w:r>
-              <w:rPr>
-                <w:color w:val="1E293B"/>
-                <w:sz w:val="18"/>
-              </w:rPr>
-              <w:t>Tous</w:t>
-            </w:r>
-          </w:p>
-        </w:tc>
-        <w:tc>
-          <w:tcPr>
-            <w:tcW w:type="dxa" w:w="3106"/>
-            <w:shd w:val="clear" w:color="auto" w:fill="F8FAFC"/>
-            <w:tcMar>
-              <w:top w:w="80" w:type="dxa"/>
-              <w:bottom w:w="80" w:type="dxa"/>
-              <w:left w:w="100" w:type="dxa"/>
-              <w:right w:w="100" w:type="dxa"/>
-            </w:tcMar>
-          </w:tcPr>
-          <w:p>
-            <w:r>
-              <w:rPr>
-                <w:color w:val="1E293B"/>
-                <w:sz w:val="18"/>
-              </w:rPr>
-              <w:t>Authentification par pseudo/email et mot de passe. Renvoie le token Bearer.</w:t>
-            </w:r>
-          </w:p>
-        </w:tc>
-      </w:tr>
-      <w:tr>
-        <w:tc>
-          <w:tcPr>
-            <w:tcW w:type="dxa" w:w="3106"/>
-            <w:shd w:val="clear" w:color="auto" w:fill="FFFFFF"/>
-            <w:tcMar>
-              <w:top w:w="80" w:type="dxa"/>
-              <w:bottom w:w="80" w:type="dxa"/>
-              <w:left w:w="100" w:type="dxa"/>
-              <w:right w:w="100" w:type="dxa"/>
-            </w:tcMar>
-          </w:tcPr>
-          <w:p>
-            <w:r>
-              <w:rPr>
-                <w:color w:val="1E293B"/>
-                <w:sz w:val="18"/>
-              </w:rPr>
-              <w:t>GET /api/auth/me</w:t>
-            </w:r>
-          </w:p>
-        </w:tc>
-        <w:tc>
-          <w:tcPr>
-            <w:tcW w:type="dxa" w:w="3106"/>
-            <w:shd w:val="clear" w:color="auto" w:fill="FFFFFF"/>
-            <w:tcMar>
-              <w:top w:w="80" w:type="dxa"/>
-              <w:bottom w:w="80" w:type="dxa"/>
-              <w:left w:w="100" w:type="dxa"/>
-              <w:right w:w="100" w:type="dxa"/>
-            </w:tcMar>
-          </w:tcPr>
-          <w:p>
-            <w:r>
-              <w:rPr>
-                <w:color w:val="1E293B"/>
-                <w:sz w:val="18"/>
-              </w:rPr>
-              <w:t>Connecté</w:t>
-            </w:r>
-          </w:p>
-        </w:tc>
-        <w:tc>
-          <w:tcPr>
-            <w:tcW w:type="dxa" w:w="3106"/>
-            <w:shd w:val="clear" w:color="auto" w:fill="FFFFFF"/>
-            <w:tcMar>
-              <w:top w:w="80" w:type="dxa"/>
-              <w:bottom w:w="80" w:type="dxa"/>
-              <w:left w:w="100" w:type="dxa"/>
-              <w:right w:w="100" w:type="dxa"/>
-            </w:tcMar>
-          </w:tcPr>
-          <w:p>
-            <w:r>
-              <w:rPr>
-                <w:color w:val="1E293B"/>
-                <w:sz w:val="18"/>
-              </w:rPr>
-              <w:t>Récupère les informations complètes de session du profil actif.</w:t>
-            </w:r>
-          </w:p>
-        </w:tc>
-      </w:tr>
-      <w:tr>
-        <w:tc>
-          <w:tcPr>
-            <w:tcW w:type="dxa" w:w="3106"/>
-            <w:shd w:val="clear" w:color="auto" w:fill="F8FAFC"/>
-            <w:tcMar>
-              <w:top w:w="80" w:type="dxa"/>
-              <w:bottom w:w="80" w:type="dxa"/>
-              <w:left w:w="100" w:type="dxa"/>
-              <w:right w:w="100" w:type="dxa"/>
-            </w:tcMar>
-          </w:tcPr>
-          <w:p>
-            <w:r>
-              <w:rPr>
-                <w:color w:val="1E293B"/>
-                <w:sz w:val="18"/>
-              </w:rPr>
-              <w:t>GET /api/profiles</w:t>
-            </w:r>
-          </w:p>
-        </w:tc>
-        <w:tc>
-          <w:tcPr>
-            <w:tcW w:type="dxa" w:w="3106"/>
-            <w:shd w:val="clear" w:color="auto" w:fill="F8FAFC"/>
-            <w:tcMar>
-              <w:top w:w="80" w:type="dxa"/>
-              <w:bottom w:w="80" w:type="dxa"/>
-              <w:left w:w="100" w:type="dxa"/>
-              <w:right w:w="100" w:type="dxa"/>
-            </w:tcMar>
-          </w:tcPr>
-          <w:p>
-            <w:r>
-              <w:rPr>
-                <w:color w:val="1E293B"/>
-                <w:sz w:val="18"/>
-              </w:rPr>
-              <w:t>Tous (filtré)</w:t>
-            </w:r>
-          </w:p>
-        </w:tc>
-        <w:tc>
-          <w:tcPr>
-            <w:tcW w:type="dxa" w:w="3106"/>
-            <w:shd w:val="clear" w:color="auto" w:fill="F8FAFC"/>
-            <w:tcMar>
-              <w:top w:w="80" w:type="dxa"/>
-              <w:bottom w:w="80" w:type="dxa"/>
-              <w:left w:w="100" w:type="dxa"/>
-              <w:right w:w="100" w:type="dxa"/>
-            </w:tcMar>
-          </w:tcPr>
-          <w:p>
-            <w:r>
-              <w:rPr>
-                <w:color w:val="1E293B"/>
-                <w:sz w:val="18"/>
-              </w:rPr>
-              <w:t>Liste des profils (vision complète pour admin, profils publics pour autres).</w:t>
-            </w:r>
-          </w:p>
-        </w:tc>
-      </w:tr>
-      <w:tr>
-        <w:tc>
-          <w:tcPr>
-            <w:tcW w:type="dxa" w:w="3106"/>
-            <w:shd w:val="clear" w:color="auto" w:fill="FFFFFF"/>
-            <w:tcMar>
-              <w:top w:w="80" w:type="dxa"/>
-              <w:bottom w:w="80" w:type="dxa"/>
-              <w:left w:w="100" w:type="dxa"/>
-              <w:right w:w="100" w:type="dxa"/>
-            </w:tcMar>
-          </w:tcPr>
-          <w:p>
-            <w:r>
-              <w:rPr>
-                <w:color w:val="1E293B"/>
-                <w:sz w:val="18"/>
-              </w:rPr>
-              <w:t>GET /api/profiles/:id/identity-answers</w:t>
-            </w:r>
-          </w:p>
-        </w:tc>
-        <w:tc>
-          <w:tcPr>
-            <w:tcW w:type="dxa" w:w="3106"/>
-            <w:shd w:val="clear" w:color="auto" w:fill="FFFFFF"/>
-            <w:tcMar>
-              <w:top w:w="80" w:type="dxa"/>
-              <w:bottom w:w="80" w:type="dxa"/>
-              <w:left w:w="100" w:type="dxa"/>
-              <w:right w:w="100" w:type="dxa"/>
-            </w:tcMar>
-          </w:tcPr>
-          <w:p>
-            <w:r>
-              <w:rPr>
-                <w:color w:val="1E293B"/>
-                <w:sz w:val="18"/>
-              </w:rPr>
-              <w:t>Connecté</w:t>
-            </w:r>
-          </w:p>
-        </w:tc>
-        <w:tc>
-          <w:tcPr>
-            <w:tcW w:type="dxa" w:w="3106"/>
-            <w:shd w:val="clear" w:color="auto" w:fill="FFFFFF"/>
-            <w:tcMar>
-              <w:top w:w="80" w:type="dxa"/>
-              <w:bottom w:w="80" w:type="dxa"/>
-              <w:left w:w="100" w:type="dxa"/>
-              <w:right w:w="100" w:type="dxa"/>
-            </w:tcMar>
-          </w:tcPr>
-          <w:p>
-            <w:r>
-              <w:rPr>
-                <w:color w:val="1E293B"/>
-                <w:sz w:val="18"/>
-              </w:rPr>
-              <w:t>Récupère les questions et réponses d'identité (+ sur moi et + sur l'autre).</w:t>
-            </w:r>
-          </w:p>
-        </w:tc>
-      </w:tr>
-      <w:tr>
-        <w:tc>
-          <w:tcPr>
-            <w:tcW w:type="dxa" w:w="3106"/>
-            <w:shd w:val="clear" w:color="auto" w:fill="F8FAFC"/>
-            <w:tcMar>
-              <w:top w:w="80" w:type="dxa"/>
-              <w:bottom w:w="80" w:type="dxa"/>
-              <w:left w:w="100" w:type="dxa"/>
-              <w:right w:w="100" w:type="dxa"/>
-            </w:tcMar>
-          </w:tcPr>
-          <w:p>
-            <w:r>
-              <w:rPr>
-                <w:color w:val="1E293B"/>
-                <w:sz w:val="18"/>
-              </w:rPr>
-              <w:t>POST /api/profiles/:id/identity-answers/self</w:t>
-            </w:r>
-          </w:p>
-        </w:tc>
-        <w:tc>
-          <w:tcPr>
-            <w:tcW w:type="dxa" w:w="3106"/>
-            <w:shd w:val="clear" w:color="auto" w:fill="F8FAFC"/>
-            <w:tcMar>
-              <w:top w:w="80" w:type="dxa"/>
-              <w:bottom w:w="80" w:type="dxa"/>
-              <w:left w:w="100" w:type="dxa"/>
-              <w:right w:w="100" w:type="dxa"/>
-            </w:tcMar>
-          </w:tcPr>
-          <w:p>
-            <w:r>
-              <w:rPr>
-                <w:color w:val="1E293B"/>
-                <w:sz w:val="18"/>
-              </w:rPr>
-              <w:t>Propriétaire/Admin</w:t>
-            </w:r>
-          </w:p>
-        </w:tc>
-        <w:tc>
-          <w:tcPr>
-            <w:tcW w:type="dxa" w:w="3106"/>
-            <w:shd w:val="clear" w:color="auto" w:fill="F8FAFC"/>
-            <w:tcMar>
-              <w:top w:w="80" w:type="dxa"/>
-              <w:bottom w:w="80" w:type="dxa"/>
-              <w:left w:w="100" w:type="dxa"/>
-              <w:right w:w="100" w:type="dxa"/>
-            </w:tcMar>
-          </w:tcPr>
-          <w:p>
-            <w:r>
-              <w:rPr>
-                <w:color w:val="1E293B"/>
-                <w:sz w:val="18"/>
-              </w:rPr>
-              <w:t>Enregistre une caractéristique personnelle (+ sur moi) : { question_id, valeur_num, valeur_text }.</w:t>
-            </w:r>
-          </w:p>
-        </w:tc>
-      </w:tr>
-      <w:tr>
-        <w:tc>
-          <w:tcPr>
-            <w:tcW w:type="dxa" w:w="3106"/>
-            <w:shd w:val="clear" w:color="auto" w:fill="FFFFFF"/>
-            <w:tcMar>
-              <w:top w:w="80" w:type="dxa"/>
-              <w:bottom w:w="80" w:type="dxa"/>
-              <w:left w:w="100" w:type="dxa"/>
-              <w:right w:w="100" w:type="dxa"/>
-            </w:tcMar>
-          </w:tcPr>
-          <w:p>
-            <w:r>
-              <w:rPr>
-                <w:color w:val="1E293B"/>
-                <w:sz w:val="18"/>
-              </w:rPr>
-              <w:t>POST /api/profiles/:id/identity-answers/partner</w:t>
-            </w:r>
-          </w:p>
-        </w:tc>
-        <w:tc>
-          <w:tcPr>
-            <w:tcW w:type="dxa" w:w="3106"/>
-            <w:shd w:val="clear" w:color="auto" w:fill="FFFFFF"/>
-            <w:tcMar>
-              <w:top w:w="80" w:type="dxa"/>
-              <w:bottom w:w="80" w:type="dxa"/>
-              <w:left w:w="100" w:type="dxa"/>
-              <w:right w:w="100" w:type="dxa"/>
-            </w:tcMar>
-          </w:tcPr>
-          <w:p>
-            <w:r>
-              <w:rPr>
-                <w:color w:val="1E293B"/>
-                <w:sz w:val="18"/>
-              </w:rPr>
-              <w:t>Propriétaire/Admin</w:t>
-            </w:r>
-          </w:p>
-        </w:tc>
-        <w:tc>
-          <w:tcPr>
-            <w:tcW w:type="dxa" w:w="3106"/>
-            <w:shd w:val="clear" w:color="auto" w:fill="FFFFFF"/>
-            <w:tcMar>
-              <w:top w:w="80" w:type="dxa"/>
-              <w:bottom w:w="80" w:type="dxa"/>
-              <w:left w:w="100" w:type="dxa"/>
-              <w:right w:w="100" w:type="dxa"/>
-            </w:tcMar>
-          </w:tcPr>
-          <w:p>
-            <w:r>
-              <w:rPr>
-                <w:color w:val="1E293B"/>
-                <w:sz w:val="18"/>
-              </w:rPr>
-              <w:t>Enregistre une tolérance partenaire (+ sur l'autre) : { question_id, min_val, max_val, options, indifferent }.</w:t>
-            </w:r>
-          </w:p>
-        </w:tc>
-      </w:tr>
-      <w:tr>
-        <w:tc>
-          <w:tcPr>
-            <w:tcW w:type="dxa" w:w="3106"/>
-            <w:shd w:val="clear" w:color="auto" w:fill="F8FAFC"/>
-            <w:tcMar>
-              <w:top w:w="80" w:type="dxa"/>
-              <w:bottom w:w="80" w:type="dxa"/>
-              <w:left w:w="100" w:type="dxa"/>
-              <w:right w:w="100" w:type="dxa"/>
-            </w:tcMar>
-          </w:tcPr>
-          <w:p>
-            <w:r>
-              <w:rPr>
-                <w:color w:val="1E293B"/>
-                <w:sz w:val="18"/>
-              </w:rPr>
-              <w:t>GET /api/affinity/identity-compatibility</w:t>
-            </w:r>
-          </w:p>
-        </w:tc>
-        <w:tc>
-          <w:tcPr>
-            <w:tcW w:type="dxa" w:w="3106"/>
-            <w:shd w:val="clear" w:color="auto" w:fill="F8FAFC"/>
-            <w:tcMar>
-              <w:top w:w="80" w:type="dxa"/>
-              <w:bottom w:w="80" w:type="dxa"/>
-              <w:left w:w="100" w:type="dxa"/>
-              <w:right w:w="100" w:type="dxa"/>
-            </w:tcMar>
-          </w:tcPr>
-          <w:p>
-            <w:r>
-              <w:rPr>
-                <w:color w:val="1E293B"/>
-                <w:sz w:val="18"/>
-              </w:rPr>
-              <w:t>Connecté</w:t>
-            </w:r>
-          </w:p>
-        </w:tc>
-        <w:tc>
-          <w:tcPr>
-            <w:tcW w:type="dxa" w:w="3106"/>
-            <w:shd w:val="clear" w:color="auto" w:fill="F8FAFC"/>
-            <w:tcMar>
-              <w:top w:w="80" w:type="dxa"/>
-              <w:bottom w:w="80" w:type="dxa"/>
-              <w:left w:w="100" w:type="dxa"/>
-              <w:right w:w="100" w:type="dxa"/>
-            </w:tcMar>
-          </w:tcPr>
-          <w:p>
-            <w:r>
-              <w:rPr>
-                <w:color w:val="1E293B"/>
-                <w:sz w:val="18"/>
-              </w:rPr>
-              <w:t>Diagnostic préalable de compatibilité identité : ?p1=X&amp;p2=Y. Renvoie le verdict, scores et détail croisé.</w:t>
-            </w:r>
-          </w:p>
-        </w:tc>
-      </w:tr>
-      <w:tr>
-        <w:tc>
-          <w:tcPr>
-            <w:tcW w:type="dxa" w:w="3106"/>
-            <w:shd w:val="clear" w:color="auto" w:fill="FFFFFF"/>
-            <w:tcMar>
-              <w:top w:w="80" w:type="dxa"/>
-              <w:bottom w:w="80" w:type="dxa"/>
-              <w:left w:w="100" w:type="dxa"/>
-              <w:right w:w="100" w:type="dxa"/>
-            </w:tcMar>
-          </w:tcPr>
-          <w:p>
-            <w:r>
-              <w:rPr>
-                <w:color w:val="1E293B"/>
-                <w:sz w:val="18"/>
-              </w:rPr>
-              <w:t>POST /api/affinity/calculate</w:t>
-            </w:r>
-          </w:p>
-        </w:tc>
-        <w:tc>
-          <w:tcPr>
-            <w:tcW w:type="dxa" w:w="3106"/>
-            <w:shd w:val="clear" w:color="auto" w:fill="FFFFFF"/>
-            <w:tcMar>
-              <w:top w:w="80" w:type="dxa"/>
-              <w:bottom w:w="80" w:type="dxa"/>
-              <w:left w:w="100" w:type="dxa"/>
-              <w:right w:w="100" w:type="dxa"/>
-            </w:tcMar>
-          </w:tcPr>
-          <w:p>
-            <w:r>
-              <w:rPr>
-                <w:color w:val="1E293B"/>
-                <w:sz w:val="18"/>
-              </w:rPr>
-              <w:t>Abonné / Admin</w:t>
-            </w:r>
-          </w:p>
-        </w:tc>
-        <w:tc>
-          <w:tcPr>
-            <w:tcW w:type="dxa" w:w="3106"/>
-            <w:shd w:val="clear" w:color="auto" w:fill="FFFFFF"/>
-            <w:tcMar>
-              <w:top w:w="80" w:type="dxa"/>
-              <w:bottom w:w="80" w:type="dxa"/>
-              <w:left w:w="100" w:type="dxa"/>
-              <w:right w:w="100" w:type="dxa"/>
-            </w:tcMar>
-          </w:tcPr>
-          <w:p>
-            <w:r>
-              <w:rPr>
-                <w:color w:val="1E293B"/>
-                <w:sz w:val="18"/>
-              </w:rPr>
-              <w:t>Calcul complet d'affinité V-A-D-P, radar et diagnostic identité : { profile1_id, profile2_id }.</w:t>
-            </w:r>
-          </w:p>
-        </w:tc>
-      </w:tr>
-      <w:tr>
-        <w:tc>
-          <w:tcPr>
-            <w:tcW w:type="dxa" w:w="3106"/>
-            <w:shd w:val="clear" w:color="auto" w:fill="F8FAFC"/>
-            <w:tcMar>
-              <w:top w:w="80" w:type="dxa"/>
-              <w:bottom w:w="80" w:type="dxa"/>
-              <w:left w:w="100" w:type="dxa"/>
-              <w:right w:w="100" w:type="dxa"/>
-            </w:tcMar>
-          </w:tcPr>
-          <w:p>
-            <w:r>
-              <w:rPr>
-                <w:color w:val="1E293B"/>
-                <w:sz w:val="18"/>
-              </w:rPr>
-              <w:t>GET /api/distance</w:t>
-            </w:r>
-          </w:p>
-        </w:tc>
-        <w:tc>
-          <w:tcPr>
-            <w:tcW w:type="dxa" w:w="3106"/>
-            <w:shd w:val="clear" w:color="auto" w:fill="F8FAFC"/>
-            <w:tcMar>
-              <w:top w:w="80" w:type="dxa"/>
-              <w:bottom w:w="80" w:type="dxa"/>
-              <w:left w:w="100" w:type="dxa"/>
-              <w:right w:w="100" w:type="dxa"/>
-            </w:tcMar>
-          </w:tcPr>
-          <w:p>
-            <w:r>
-              <w:rPr>
-                <w:color w:val="1E293B"/>
-                <w:sz w:val="18"/>
-              </w:rPr>
-              <w:t>Connecté</w:t>
-            </w:r>
-          </w:p>
-        </w:tc>
-        <w:tc>
-          <w:tcPr>
-            <w:tcW w:type="dxa" w:w="3106"/>
-            <w:shd w:val="clear" w:color="auto" w:fill="F8FAFC"/>
-            <w:tcMar>
-              <w:top w:w="80" w:type="dxa"/>
-              <w:bottom w:w="80" w:type="dxa"/>
-              <w:left w:w="100" w:type="dxa"/>
-              <w:right w:w="100" w:type="dxa"/>
-            </w:tcMar>
-          </w:tcPr>
-          <w:p>
-            <w:r>
-              <w:rPr>
-                <w:color w:val="1E293B"/>
-                <w:sz w:val="18"/>
-              </w:rPr>
-              <w:t>Calcul de distance kilométrique entre deux communes : ?ville1=Paris&amp;ville2=Lyon.</w:t>
-            </w:r>
-          </w:p>
-        </w:tc>
-      </w:tr>
-      <w:tr>
-        <w:tc>
-          <w:tcPr>
-            <w:tcW w:type="dxa" w:w="3106"/>
-            <w:shd w:val="clear" w:color="auto" w:fill="FFFFFF"/>
-            <w:tcMar>
-              <w:top w:w="80" w:type="dxa"/>
-              <w:bottom w:w="80" w:type="dxa"/>
-              <w:left w:w="100" w:type="dxa"/>
-              <w:right w:w="100" w:type="dxa"/>
-            </w:tcMar>
-          </w:tcPr>
-          <w:p>
-            <w:r>
-              <w:rPr>
-                <w:color w:val="1E293B"/>
-                <w:sz w:val="18"/>
-              </w:rPr>
-              <w:t>GET /api/admin/backups</w:t>
-            </w:r>
-          </w:p>
-        </w:tc>
-        <w:tc>
-          <w:tcPr>
-            <w:tcW w:type="dxa" w:w="3106"/>
-            <w:shd w:val="clear" w:color="auto" w:fill="FFFFFF"/>
-            <w:tcMar>
-              <w:top w:w="80" w:type="dxa"/>
-              <w:bottom w:w="80" w:type="dxa"/>
-              <w:left w:w="100" w:type="dxa"/>
-              <w:right w:w="100" w:type="dxa"/>
-            </w:tcMar>
-          </w:tcPr>
-          <w:p>
-            <w:r>
-              <w:rPr>
-                <w:color w:val="1E293B"/>
-                <w:sz w:val="18"/>
-              </w:rPr>
-              <w:t>Admin</w:t>
-            </w:r>
-          </w:p>
-        </w:tc>
-        <w:tc>
-          <w:tcPr>
-            <w:tcW w:type="dxa" w:w="3106"/>
-            <w:shd w:val="clear" w:color="auto" w:fill="FFFFFF"/>
-            <w:tcMar>
-              <w:top w:w="80" w:type="dxa"/>
-              <w:bottom w:w="80" w:type="dxa"/>
-              <w:left w:w="100" w:type="dxa"/>
-              <w:right w:w="100" w:type="dxa"/>
-            </w:tcMar>
-          </w:tcPr>
-          <w:p>
-            <w:r>
-              <w:rPr>
-                <w:color w:val="1E293B"/>
-                <w:sz w:val="18"/>
-              </w:rPr>
-              <w:t>Liste les sauvegardes locales horodatées existantes dans backups/.</w:t>
-            </w:r>
-          </w:p>
-        </w:tc>
-      </w:tr>
-      <w:tr>
-        <w:tc>
-          <w:tcPr>
-            <w:tcW w:type="dxa" w:w="3106"/>
-            <w:shd w:val="clear" w:color="auto" w:fill="F8FAFC"/>
-            <w:tcMar>
-              <w:top w:w="80" w:type="dxa"/>
-              <w:bottom w:w="80" w:type="dxa"/>
-              <w:left w:w="100" w:type="dxa"/>
-              <w:right w:w="100" w:type="dxa"/>
-            </w:tcMar>
-          </w:tcPr>
-          <w:p>
-            <w:r>
-              <w:rPr>
-                <w:color w:val="1E293B"/>
-                <w:sz w:val="18"/>
-              </w:rPr>
-              <w:t>POST /api/admin/backup</w:t>
-            </w:r>
-          </w:p>
-        </w:tc>
-        <w:tc>
-          <w:tcPr>
-            <w:tcW w:type="dxa" w:w="3106"/>
-            <w:shd w:val="clear" w:color="auto" w:fill="F8FAFC"/>
-            <w:tcMar>
-              <w:top w:w="80" w:type="dxa"/>
-              <w:bottom w:w="80" w:type="dxa"/>
-              <w:left w:w="100" w:type="dxa"/>
-              <w:right w:w="100" w:type="dxa"/>
-            </w:tcMar>
-          </w:tcPr>
-          <w:p>
-            <w:r>
-              <w:rPr>
-                <w:color w:val="1E293B"/>
-                <w:sz w:val="18"/>
-              </w:rPr>
-              <w:t>Admin</w:t>
-            </w:r>
-          </w:p>
-        </w:tc>
-        <w:tc>
-          <w:tcPr>
-            <w:tcW w:type="dxa" w:w="3106"/>
-            <w:shd w:val="clear" w:color="auto" w:fill="F8FAFC"/>
-            <w:tcMar>
-              <w:top w:w="80" w:type="dxa"/>
-              <w:bottom w:w="80" w:type="dxa"/>
-              <w:left w:w="100" w:type="dxa"/>
-              <w:right w:w="100" w:type="dxa"/>
-            </w:tcMar>
-          </w:tcPr>
-          <w:p>
-            <w:r>
-              <w:rPr>
-                <w:color w:val="1E293B"/>
-                <w:sz w:val="18"/>
-              </w:rPr>
-              <w:t>Déclenche la création immédiate d'une copie de sécurité de affinity.db.</w:t>
-            </w:r>
-          </w:p>
-        </w:tc>
-      </w:tr>
-    </w:tbl>
-    <w:p>
-      <w:r>
-        <w:rPr>
-          <w:lang w:val="fr-FR"/>
-        </w:rPr>
-        <w:br w:type="page"/>
-      </w:r>
-    </w:p>
-    <w:p>
-      <w:pPr>
-        <w:spacing w:before="240" w:after="120"/>
-      </w:pPr>
-      <w:r>
-        <w:rPr>
-          <w:b/>
-          <w:color w:val="0E7490"/>
-          <w:sz w:val="28"/>
-          <w:lang w:val="fr-FR"/>
-        </w:rPr>
-        <w:t>8. SAUVEGARDE LOCALE &amp; PÉRENNITÉ DES DONNÉES</w:t>
-      </w:r>
-    </w:p>
-    <w:p>
-      <w:r>
-        <w:rPr>
-          <w:lang w:val="fr-FR"/>
-        </w:rPr>
-        <w:t>Afin de garantir que les profils créés, les modifications de la banque de questions et les réponses saisies en local ne soient JAMAIS écrasées ni perdues, un triple dispositif de sauvegarde a été instauré :</w:t>
-      </w:r>
-    </w:p>
-    <w:p>
-      <w:pPr>
-        <w:pStyle w:val="ListBullet"/>
-      </w:pPr>
-      <w:r>
-        <w:rPr>
-          <w:b/>
-          <w:lang w:val="fr-FR"/>
-        </w:rPr>
-        <w:t xml:space="preserve">1. Sauvegarde Automatique Horodatée au Démarrage : </w:t>
-      </w:r>
-      <w:r>
-        <w:rPr>
-          <w:lang w:val="fr-FR"/>
-        </w:rPr>
-        <w:t>La fonction 'backup_local_db()' intégrée à server.py s'exécute automatiquement dès le lancement. Elle crée une copie 'backups/affinity_backup_YYYYMMDD_HHMMSS.db' et applique une rotation glissante préservant les 15 copies les plus récentes.</w:t>
-      </w:r>
-    </w:p>
-    <w:p>
-      <w:pPr>
-        <w:pStyle w:val="ListBullet"/>
-      </w:pPr>
-      <w:r>
-        <w:rPr>
-          <w:b/>
-          <w:lang w:val="fr-FR"/>
-        </w:rPr>
-        <w:t xml:space="preserve">2. Script Windows Dédié : </w:t>
-      </w:r>
-      <w:r>
-        <w:rPr>
-          <w:lang w:val="fr-FR"/>
-        </w:rPr>
-        <w:t>Le script 'Sauvegarder_Base_Locale.bat' permet en un double-clic de figer une copie instantanée de sécurité sans aucune manipulation technique.</w:t>
-      </w:r>
-    </w:p>
-    <w:p>
-      <w:pPr>
-        <w:pStyle w:val="ListBullet"/>
-      </w:pPr>
-      <w:r>
-        <w:rPr>
-          <w:b/>
-          <w:lang w:val="fr-FR"/>
-        </w:rPr>
-        <w:t xml:space="preserve">3. Bouton Cockpit Administrateur : </w:t>
-      </w:r>
-      <w:r>
-        <w:rPr>
-          <w:lang w:val="fr-FR"/>
-        </w:rPr>
-        <w:t>L'interface d'administration intègre un encart de sauvegarde en temps réel affichant la date et taille de la dernière copie avec un bouton 'Créer une sauvegarde maintenant' appelant l'API backend.</w:t>
-      </w:r>
-    </w:p>
-    <w:p>
-      <w:pPr>
-        <w:pStyle w:val="ListBullet"/>
-      </w:pPr>
-      <w:r>
-        <w:rPr>
-          <w:b/>
-          <w:lang w:val="fr-FR"/>
-        </w:rPr>
-        <w:t xml:space="preserve">4. Protection Git : </w:t>
-      </w:r>
-      <w:r>
-        <w:rPr>
-          <w:lang w:val="fr-FR"/>
-        </w:rPr>
-        <w:t>Le fichier .gitignore exclut 'backups/*.db' pour ne pas encombrer le dépôt distant, tout en maintenant 'affinity.db' suivie dans l'arbre Git pour assurer sa persistance.</w:t>
-      </w:r>
-    </w:p>
-    <w:p>
-      <w:pPr>
-        <w:spacing w:before="280" w:after="120"/>
-      </w:pPr>
-      <w:r>
-        <w:rPr>
-          <w:b/>
-          <w:color w:val="0E7490"/>
-          <w:sz w:val="28"/>
-          <w:lang w:val="fr-FR"/>
-        </w:rPr>
-        <w:t>9. DÉPLOIEMENT CLOUD (RENDER) &amp; RÉSILIENCE</w:t>
-      </w:r>
-    </w:p>
-    <w:p>
-      <w:r>
-        <w:rPr>
-          <w:lang w:val="fr-FR"/>
-        </w:rPr>
-        <w:t>La plateforme est déployée en production sur Render à l'adresse officielle : https://affinity-3l9i.onrender.com</w:t>
-      </w:r>
-    </w:p>
-    <w:p>
-      <w:pPr>
-        <w:pStyle w:val="ListBullet"/>
-      </w:pPr>
-      <w:r>
-        <w:rPr>
-          <w:b/>
-          <w:lang w:val="fr-FR"/>
-        </w:rPr>
-        <w:t xml:space="preserve">Déploiement Continu Automatisé : </w:t>
-      </w:r>
-      <w:r>
-        <w:rPr>
-          <w:lang w:val="fr-FR"/>
-        </w:rPr>
-        <w:t>Tout commit poussé sur la branche 'main' de GitHub déclenche instantanément la recompilation du conteneur Docker et sa mise en ligne.</w:t>
-      </w:r>
-    </w:p>
-    <w:p>
-      <w:pPr>
-        <w:pStyle w:val="ListBullet"/>
-      </w:pPr>
-      <w:r>
-        <w:rPr>
-          <w:b/>
-          <w:lang w:val="fr-FR"/>
-        </w:rPr>
-        <w:t xml:space="preserve">Comportement 502 Bad Gateway temporaire : </w:t>
-      </w:r>
-      <w:r>
-        <w:rPr>
-          <w:lang w:val="fr-FR"/>
-        </w:rPr>
-        <w:t>Pendant les 60 à 90 secondes nécessaires à l'extinction de l'ancienne version et à la montée en charge du nouveau conteneur, le proxy Render renvoie un statut transitoire 502. Dès l'écoute effective du port, le service redevient actif (200 OK) sans intervention.</w:t>
-      </w:r>
-    </w:p>
-    <w:p>
-      <w:pPr>
-        <w:pStyle w:val="ListBullet"/>
-      </w:pPr>
-      <w:r>
-        <w:rPr>
-          <w:b/>
-          <w:lang w:val="fr-FR"/>
-        </w:rPr>
-        <w:t xml:space="preserve">Support de Disque Persistant : </w:t>
-      </w:r>
-      <w:r>
-        <w:rPr>
-          <w:lang w:val="fr-FR"/>
-        </w:rPr>
-        <w:t>Le serveur détecte automatiquement les volumes persistants Render (/var/data ou /data). En l'absence de volume monté, il utilise la base initialisée 'affinity.db' issue du dépôt.</w:t>
-      </w:r>
-    </w:p>
-    <w:p>
-      <w:pPr>
-        <w:spacing w:before="280" w:after="120"/>
-      </w:pPr>
-      <w:r>
-        <w:rPr>
-          <w:b/>
-          <w:color w:val="0E7490"/>
-          <w:sz w:val="28"/>
-          <w:lang w:val="fr-FR"/>
-        </w:rPr>
-        <w:t>10. PROCÉDURE D'EXPLOITATION &amp; DÉMARRAGE MULTI-POSTES</w:t>
-      </w:r>
-    </w:p>
-    <w:p>
-      <w:r>
-        <w:rPr>
-          <w:lang w:val="fr-FR"/>
-        </w:rPr>
-        <w:t>L'application peut être exploitée sur n'importe quel ordinateur sous Windows 10 ou Windows 11 en suivant ces étapes simples :</w:t>
-      </w:r>
-    </w:p>
-    <w:p>
-      <w:pPr>
-        <w:spacing w:after="80"/>
-      </w:pPr>
-      <w:r>
-        <w:rPr>
-          <w:b/>
-          <w:color w:val="0E7490"/>
-          <w:lang w:val="fr-FR"/>
-        </w:rPr>
-        <w:t xml:space="preserve">Étape 1 — Démarrage Standard : </w:t>
-      </w:r>
-      <w:r>
-        <w:rPr>
-          <w:lang w:val="fr-FR"/>
-        </w:rPr>
-        <w:t>Double-cliquer sur 'Affinity.bat'. Le script démarre automatiquement le serveur en arrière-plan et ouvre la fenêtre applicative Edge en mode application bureau.</w:t>
-      </w:r>
-    </w:p>
-    <w:p>
-      <w:pPr>
-        <w:spacing w:after="80"/>
-      </w:pPr>
-      <w:r>
-        <w:rPr>
-          <w:b/>
-          <w:color w:val="0E7490"/>
-          <w:lang w:val="fr-FR"/>
-        </w:rPr>
-        <w:t xml:space="preserve">Étape 2 — Redémarrage du Serveur : </w:t>
-      </w:r>
-      <w:r>
-        <w:rPr>
-          <w:lang w:val="fr-FR"/>
-        </w:rPr>
-        <w:t>En cas de modification de code backend ou de mise à jour, double-cliquer sur 'Redemarrer_Affinity.bat'. Il tue le processus actif sur le port 8765 et relance le serveur.</w:t>
-      </w:r>
-    </w:p>
-    <w:p>
-      <w:pPr>
-        <w:spacing w:after="80"/>
-      </w:pPr>
-      <w:r>
-        <w:rPr>
-          <w:b/>
-          <w:color w:val="0E7490"/>
-          <w:lang w:val="fr-FR"/>
-        </w:rPr>
-        <w:t xml:space="preserve">Étape 3 — Sauvegarde Manuelle : </w:t>
-      </w:r>
-      <w:r>
-        <w:rPr>
-          <w:lang w:val="fr-FR"/>
-        </w:rPr>
-        <w:t>Double-cliquer sur 'Sauvegarder_Base_Locale.bat' pour créer une archive horodatée dans le dossier backups/.</w:t>
-      </w:r>
-    </w:p>
-    <w:p>
-      <w:pPr>
-        <w:spacing w:after="80"/>
-      </w:pPr>
-      <w:r>
-        <w:rPr>
-          <w:b/>
-          <w:color w:val="0E7490"/>
-          <w:lang w:val="fr-FR"/>
-        </w:rPr>
-        <w:t xml:space="preserve">Étape 4 — Installation sur un Nouveau PC : </w:t>
-      </w:r>
-      <w:r>
-        <w:rPr>
-          <w:lang w:val="fr-FR"/>
-        </w:rPr>
-        <w:t>Installer Python 3.10+ (en cochant 'Add Python to PATH') et Git. Cloner le dépôt : 'git clone https://github.com/AR30960/affinity.git', puis lancer 'Affinity.bat'.</w:t>
-      </w:r>
-    </w:p>
-    <w:p>
-      <w:pPr>
-        <w:spacing w:after="80"/>
-      </w:pPr>
-      <w:r>
-        <w:rPr>
-          <w:b/>
-          <w:color w:val="0E7490"/>
-          <w:lang w:val="fr-FR"/>
-        </w:rPr>
-        <w:t xml:space="preserve">Étape 5 — Synchronisation Multi-Postes : </w:t>
-      </w:r>
-      <w:r>
-        <w:rPr>
-          <w:lang w:val="fr-FR"/>
-        </w:rPr>
-        <w:t>Sur le poste de travail : 'git add .', 'git commit -m "..."', 'git push'. Sur le portable : 'git pull' pour récupérer instantanément tout le travail à jour.</w:t>
+        <w:t>Compatible déploiement conteneurisé Docker et PaaS Cloud (Render) avec détection automatique des disques persistants montés.</w:t>
       </w:r>
     </w:p>
     <w:sectPr>
-      <w:pgSz w:w="11909" w:h="16834"/>
-      <w:pgMar w:top="1296" w:right="1296" w:bottom="1296" w:left="1296" w:header="720" w:footer="720" w:gutter="0"/>
+      <w:pgSz w:w="12240" w:h="15840"/>
+      <w:pgMar w:top="1440" w:right="1440" w:bottom="1440" w:left="1440" w:header="720" w:footer="720" w:gutter="0"/>
       <w:cols w:space="720"/>
       <w:docGrid w:linePitch="360"/>
     </w:sectPr>

</xml_diff>